<commit_message>
Reformat report: black-and-white styling, tighter content, add PDF
- Removed all colour from headings and cover page (pure black/white)
- Trimmed interview answers and body paragraphs to be more concise
- Regenerated Q4_Ethics_Lens_Report.docx
- Added build_pdf.py (WeasyPrint-based) to produce Q4_Ethics_Lens_Report.pdf

https://claude.ai/code/session_011Yu5CJk4J5wFsdac1oWRaw
</commit_message>
<xml_diff>
--- a/Q4_Ethics_Lens_Report.docx
+++ b/Q4_Ethics_Lens_Report.docx
@@ -43,7 +43,7 @@
     </w:p>
     <w:p>
       <w:pPr>
-        <w:spacing w:after="100" w:before="0"/>
+        <w:spacing w:after="80" w:before="0"/>
         <w:jc w:val="center"/>
       </w:pPr>
       <w:r>
@@ -51,7 +51,6 @@
           <w:rFonts w:ascii="Arial" w:cs="Arial" w:eastAsia="Arial" w:hAnsi="Arial"/>
           <w:b/>
           <w:bCs/>
-          <w:color w:val="888888"/>
           <w:sz w:val="22"/>
           <w:szCs w:val="22"/>
         </w:rPr>
@@ -90,7 +89,7 @@
     <w:p>
       <w:pPr>
         <w:pBdr>
-          <w:bottom w:val="single" w:color="1F3864" w:sz="4"/>
+          <w:bottom w:val="single" w:color="000000" w:sz="4"/>
         </w:pBdr>
         <w:spacing w:after="120" w:before="0"/>
         <w:jc w:val="center"/>
@@ -132,7 +131,6 @@
           <w:rFonts w:ascii="Arial" w:cs="Arial" w:eastAsia="Arial" w:hAnsi="Arial"/>
           <w:b/>
           <w:bCs/>
-          <w:color w:val="1F3864"/>
           <w:sz w:val="40"/>
           <w:szCs w:val="40"/>
         </w:rPr>
@@ -149,9 +147,8 @@
           <w:rFonts w:ascii="Arial" w:cs="Arial" w:eastAsia="Arial" w:hAnsi="Arial"/>
           <w:b/>
           <w:bCs/>
-          <w:color w:val="1F3864"/>
-          <w:sz w:val="34"/>
-          <w:szCs w:val="34"/>
+          <w:sz w:val="32"/>
+          <w:szCs w:val="32"/>
         </w:rPr>
         <w:t xml:space="preserve">SOCIAL MEDIA AND PERSUASIVE DESIGN</w:t>
       </w:r>
@@ -166,9 +163,8 @@
           <w:rFonts w:ascii="Arial" w:cs="Arial" w:eastAsia="Arial" w:hAnsi="Arial"/>
           <w:i/>
           <w:iCs/>
-          <w:color w:val="555555"/>
-          <w:sz w:val="26"/>
-          <w:szCs w:val="26"/>
+          <w:sz w:val="24"/>
+          <w:szCs w:val="24"/>
         </w:rPr>
         <w:t xml:space="preserve">Question 4: The Ethics Lens</w:t>
       </w:r>
@@ -296,7 +292,7 @@
     <w:p>
       <w:pPr>
         <w:pBdr>
-          <w:top w:val="single" w:color="1F3864" w:sz="4"/>
+          <w:top w:val="single" w:color="000000" w:sz="4"/>
         </w:pBdr>
         <w:spacing w:after="0" w:before="0"/>
         <w:jc w:val="center"/>
@@ -316,7 +312,6 @@
           <w:rFonts w:ascii="Arial" w:cs="Arial" w:eastAsia="Arial" w:hAnsi="Arial"/>
           <w:b/>
           <w:bCs/>
-          <w:color w:val="1F3864"/>
           <w:sz w:val="28"/>
           <w:szCs w:val="28"/>
         </w:rPr>
@@ -547,14 +542,13 @@
     <w:p>
       <w:pPr>
         <w:pStyle w:val="Heading1"/>
-        <w:spacing w:after="160" w:before="320"/>
-      </w:pPr>
-      <w:r>
-        <w:rPr>
-          <w:rFonts w:ascii="Arial" w:cs="Arial" w:eastAsia="Arial" w:hAnsi="Arial"/>
-          <w:b/>
-          <w:bCs/>
-          <w:color w:val="1F3864"/>
+        <w:spacing w:after="160" w:before="360"/>
+      </w:pPr>
+      <w:r>
+        <w:rPr>
+          <w:rFonts w:ascii="Arial" w:cs="Arial" w:eastAsia="Arial" w:hAnsi="Arial"/>
+          <w:b/>
+          <w:bCs/>
           <w:sz w:val="28"/>
           <w:szCs w:val="28"/>
         </w:rPr>
@@ -564,14 +558,13 @@
     <w:p>
       <w:pPr>
         <w:pStyle w:val="Heading2"/>
-        <w:spacing w:after="120" w:before="240"/>
-      </w:pPr>
-      <w:r>
-        <w:rPr>
-          <w:rFonts w:ascii="Arial" w:cs="Arial" w:eastAsia="Arial" w:hAnsi="Arial"/>
-          <w:b/>
-          <w:bCs/>
-          <w:color w:val="2E4057"/>
+        <w:spacing w:after="100" w:before="240"/>
+      </w:pPr>
+      <w:r>
+        <w:rPr>
+          <w:rFonts w:ascii="Arial" w:cs="Arial" w:eastAsia="Arial" w:hAnsi="Arial"/>
+          <w:b/>
+          <w:bCs/>
           <w:sz w:val="24"/>
           <w:szCs w:val="24"/>
         </w:rPr>
@@ -593,7 +586,7 @@
           <w:rFonts w:ascii="Arial" w:cs="Arial" w:eastAsia="Arial" w:hAnsi="Arial"/>
           <w:i/>
           <w:iCs/>
-          <w:color w:val="888888"/>
+          <w:color w:val="666666"/>
           <w:sz w:val="20"/>
           <w:szCs w:val="20"/>
         </w:rPr>
@@ -616,14 +609,13 @@
     <w:p>
       <w:pPr>
         <w:pStyle w:val="Heading2"/>
-        <w:spacing w:after="120" w:before="240"/>
-      </w:pPr>
-      <w:r>
-        <w:rPr>
-          <w:rFonts w:ascii="Arial" w:cs="Arial" w:eastAsia="Arial" w:hAnsi="Arial"/>
-          <w:b/>
-          <w:bCs/>
-          <w:color w:val="2E4057"/>
+        <w:spacing w:after="100" w:before="240"/>
+      </w:pPr>
+      <w:r>
+        <w:rPr>
+          <w:rFonts w:ascii="Arial" w:cs="Arial" w:eastAsia="Arial" w:hAnsi="Arial"/>
+          <w:b/>
+          <w:bCs/>
           <w:sz w:val="24"/>
           <w:szCs w:val="24"/>
         </w:rPr>
@@ -641,7 +633,7 @@
           <w:sz w:val="24"/>
           <w:szCs w:val="24"/>
         </w:rPr>
-        <w:t xml:space="preserve">The ethical problem centres on how social media platforms are deliberately designed to maximise the time users spend online, often at the direct expense of their wellbeing. This is sometimes called the "attention economy" – platforms like TikTok, Instagram, and X (formerly Twitter) generate revenue by selling advertising, and the longer users stay on the app, the more adverts they see and the more money the platform earns.</w:t>
+        <w:t xml:space="preserve">The ethical problem is that social media platforms are deliberately engineered to maximise time spent online, at the expense of users' wellbeing. Platforms like TikTok, Instagram, and X generate revenue through advertising; the longer users stay on-screen, the more revenue the platform earns. To achieve this, they deploy features such as infinite scroll, variable reward notifications (the same mechanism that makes gambling addictive), and algorithmically curated feeds that prioritise emotionally charged content over accurate or beneficial content. Tristan Harris, a former design ethicist at Google, calls this "a race to the bottom of the brainstem." These are deliberate engineering choices, not oversights.</w:t>
       </w:r>
     </w:p>
     <w:p>
@@ -655,7 +647,36 @@
           <w:sz w:val="24"/>
           <w:szCs w:val="24"/>
         </w:rPr>
-        <w:t xml:space="preserve">To keep users scrolling, platforms use features such as infinite scroll (there is no natural endpoint to a feed), variable reward notifications (the same uncertain-reward principle that makes gambling addictive), and algorithmic feeds designed to prioritise content that triggers strong emotional responses. These are not accidents – they are deliberate engineering decisions. Tristan Harris, a former design ethicist at Google, has described this as "a race to the bottom of the brainstem" – a competition to capture the most instinctive emotional reactions possible.</w:t>
+        <w:t xml:space="preserve">The issue exists within the technology and consumer digital sector but its consequences reach across mental health, education, family life, and democratic discourse.</w:t>
+      </w:r>
+    </w:p>
+    <w:p>
+      <w:pPr>
+        <w:spacing w:after="60" w:before="0"/>
+      </w:pPr>
+      <w:r>
+        <w:rPr>
+          <w:rFonts w:ascii="Arial" w:cs="Arial" w:eastAsia="Arial" w:hAnsi="Arial"/>
+          <w:sz w:val="24"/>
+          <w:szCs w:val="24"/>
+        </w:rPr>
+        <w:t xml:space="preserve"/>
+      </w:r>
+    </w:p>
+    <w:p>
+      <w:pPr>
+        <w:pStyle w:val="Heading2"/>
+        <w:spacing w:after="100" w:before="240"/>
+      </w:pPr>
+      <w:r>
+        <w:rPr>
+          <w:rFonts w:ascii="Arial" w:cs="Arial" w:eastAsia="Arial" w:hAnsi="Arial"/>
+          <w:b/>
+          <w:bCs/>
+          <w:sz w:val="24"/>
+          <w:szCs w:val="24"/>
+        </w:rPr>
+        <w:t xml:space="preserve">Who is affected, and in what way?</w:t>
       </w:r>
     </w:p>
     <w:p>
@@ -669,93 +690,7 @@
           <w:sz w:val="24"/>
           <w:szCs w:val="24"/>
         </w:rPr>
-        <w:t xml:space="preserve">This issue presents itself primarily in the technology sector and consumer digital culture, but its effects are felt broadly across mental health, education, family relationships, democratic discourse, and self-image.</w:t>
-      </w:r>
-    </w:p>
-    <w:p>
-      <w:pPr>
-        <w:spacing w:after="60" w:before="0"/>
-      </w:pPr>
-      <w:r>
-        <w:rPr>
-          <w:rFonts w:ascii="Arial" w:cs="Arial" w:eastAsia="Arial" w:hAnsi="Arial"/>
-          <w:sz w:val="24"/>
-          <w:szCs w:val="24"/>
-        </w:rPr>
-        <w:t xml:space="preserve"/>
-      </w:r>
-    </w:p>
-    <w:p>
-      <w:pPr>
-        <w:pStyle w:val="Heading2"/>
-        <w:spacing w:after="120" w:before="240"/>
-      </w:pPr>
-      <w:r>
-        <w:rPr>
-          <w:rFonts w:ascii="Arial" w:cs="Arial" w:eastAsia="Arial" w:hAnsi="Arial"/>
-          <w:b/>
-          <w:bCs/>
-          <w:color w:val="2E4057"/>
-          <w:sz w:val="24"/>
-          <w:szCs w:val="24"/>
-        </w:rPr>
-        <w:t xml:space="preserve">Who is affected, and in what way?</w:t>
-      </w:r>
-    </w:p>
-    <w:p>
-      <w:pPr>
-        <w:spacing w:after="120" w:before="0" w:line="276" w:lineRule="auto"/>
-        <w:jc w:val="both"/>
-      </w:pPr>
-      <w:r>
-        <w:rPr>
-          <w:rFonts w:ascii="Arial" w:cs="Arial" w:eastAsia="Arial" w:hAnsi="Arial"/>
-          <w:sz w:val="24"/>
-          <w:szCs w:val="24"/>
-        </w:rPr>
-        <w:t xml:space="preserve">Young people (13-25 years) are most acutely affected. Research consistently links heavy social media use to increased rates of anxiety, depression, sleep disruption, and poor body image. Meta's own internal research, leaked in 2021 and reported by The Wall Street Journal, found that 32% of teenage girls said Instagram made them feel worse about their bodies. South African studies reflect global trends – the South African Depression and Anxiety Group (SADAG) has identified social media use as a contributing factor in rising youth anxiety rates.</w:t>
-      </w:r>
-    </w:p>
-    <w:p>
-      <w:pPr>
-        <w:spacing w:after="120" w:before="0" w:line="276" w:lineRule="auto"/>
-        <w:jc w:val="both"/>
-      </w:pPr>
-      <w:r>
-        <w:rPr>
-          <w:rFonts w:ascii="Arial" w:cs="Arial" w:eastAsia="Arial" w:hAnsi="Arial"/>
-          <w:sz w:val="24"/>
-          <w:szCs w:val="24"/>
-        </w:rPr>
-        <w:t xml:space="preserve">Adolescent girls are particularly vulnerable to comparison culture and the unrealistic beauty standards promoted through filtered images and influencer content.</w:t>
-      </w:r>
-    </w:p>
-    <w:p>
-      <w:pPr>
-        <w:spacing w:after="120" w:before="0" w:line="276" w:lineRule="auto"/>
-        <w:jc w:val="both"/>
-      </w:pPr>
-      <w:r>
-        <w:rPr>
-          <w:rFonts w:ascii="Arial" w:cs="Arial" w:eastAsia="Arial" w:hAnsi="Arial"/>
-          <w:sz w:val="24"/>
-          <w:szCs w:val="24"/>
-        </w:rPr>
-        <w:t xml:space="preserve">All users are susceptible to misinformation through algorithmic amplification of sensational content. The algorithm does not prioritise truth – it prioritises engagement.</w:t>
-      </w:r>
-    </w:p>
-    <w:p>
-      <w:pPr>
-        <w:spacing w:after="120" w:before="0" w:line="276" w:lineRule="auto"/>
-        <w:jc w:val="both"/>
-      </w:pPr>
-      <w:r>
-        <w:rPr>
-          <w:rFonts w:ascii="Arial" w:cs="Arial" w:eastAsia="Arial" w:hAnsi="Arial"/>
-          <w:sz w:val="24"/>
-          <w:szCs w:val="24"/>
-        </w:rPr>
-        <w:t xml:space="preserve">Society broadly is affected. Democratic discourse weakens when citizens are kept in algorithmically curated echo chambers and fed increasingly extreme content to maintain engagement.</w:t>
+        <w:t xml:space="preserve">Young people (13–25) are most severely affected. Meta's own leaked 2021 internal research found that 32% of teenage girls said Instagram made them feel worse about their bodies. SADAG has identified heavy social media use as a contributing factor in rising youth anxiety. All users are susceptible to algorithmic misinformation amplification, and society broadly suffers as echo chambers erode shared reality.</w:t>
       </w:r>
     </w:p>
     <w:p>
@@ -773,11 +708,11 @@
           <w:rFonts w:ascii="Arial" w:cs="Arial" w:eastAsia="Arial" w:hAnsi="Arial"/>
           <w:i/>
           <w:iCs/>
-          <w:color w:val="888888"/>
+          <w:color w:val="666666"/>
           <w:sz w:val="20"/>
           <w:szCs w:val="20"/>
         </w:rPr>
-        <w:t xml:space="preserve">VISUAL 2 – Insert bar graph: Rising rates of teen anxiety and depression 2012–2023 (global and South African data)</w:t>
+        <w:t xml:space="preserve">VISUAL 2 – Insert bar graph: Teen anxiety and depression rates 2012–2023 (global and South African data)</w:t>
       </w:r>
     </w:p>
     <w:p>
@@ -796,14 +731,13 @@
     <w:p>
       <w:pPr>
         <w:pStyle w:val="Heading2"/>
-        <w:spacing w:after="120" w:before="240"/>
-      </w:pPr>
-      <w:r>
-        <w:rPr>
-          <w:rFonts w:ascii="Arial" w:cs="Arial" w:eastAsia="Arial" w:hAnsi="Arial"/>
-          <w:b/>
-          <w:bCs/>
-          <w:color w:val="2E4057"/>
+        <w:spacing w:after="100" w:before="240"/>
+      </w:pPr>
+      <w:r>
+        <w:rPr>
+          <w:rFonts w:ascii="Arial" w:cs="Arial" w:eastAsia="Arial" w:hAnsi="Arial"/>
+          <w:b/>
+          <w:bCs/>
           <w:sz w:val="24"/>
           <w:szCs w:val="24"/>
         </w:rPr>
@@ -831,7 +765,7 @@
           <w:sz w:val="24"/>
           <w:szCs w:val="24"/>
         </w:rPr>
-        <w:t xml:space="preserve">Users' ability to make free, informed choices is undermined when platforms are engineered to override rational decision-making and exploit psychological vulnerabilities.</w:t>
+        <w:t xml:space="preserve">Platforms override rational decision-making by exploiting psychological vulnerabilities.</w:t>
       </w:r>
     </w:p>
     <w:p>
@@ -855,7 +789,7 @@
           <w:sz w:val="24"/>
           <w:szCs w:val="24"/>
         </w:rPr>
-        <w:t xml:space="preserve">When human attention and psychological weaknesses are treated as commodities to be monetised, human dignity is violated.</w:t>
+        <w:t xml:space="preserve">Treating human attention as a commodity to be monetised violates personal dignity.</w:t>
       </w:r>
     </w:p>
     <w:p>
@@ -879,7 +813,7 @@
           <w:sz w:val="24"/>
           <w:szCs w:val="24"/>
         </w:rPr>
-        <w:t xml:space="preserve">Minors cannot meaningfully consent to these design mechanisms, yet they are among the most heavily targeted users.</w:t>
+        <w:t xml:space="preserve">Minors cannot meaningfully consent, yet they are among the most heavily targeted users.</w:t>
       </w:r>
     </w:p>
     <w:p>
@@ -903,7 +837,7 @@
           <w:sz w:val="24"/>
           <w:szCs w:val="24"/>
         </w:rPr>
-        <w:t xml:space="preserve">Platforms have actively suppressed or downplayed internal research showing harm while publicly claiming to care about user wellbeing.</w:t>
+        <w:t xml:space="preserve">Companies have suppressed internal research showing harm while publicly claiming to care about users.</w:t>
       </w:r>
     </w:p>
     <w:p>
@@ -927,7 +861,7 @@
           <w:sz w:val="24"/>
           <w:szCs w:val="24"/>
         </w:rPr>
-        <w:t xml:space="preserve">The harms are distributed unequally – young people, those with existing mental health vulnerabilities, and those with lower digital literacy bear the greatest costs, while profits flow to shareholders.</w:t>
+        <w:t xml:space="preserve">Harms fall disproportionately on young, vulnerable users; profits flow to shareholders.</w:t>
       </w:r>
     </w:p>
     <w:p>
@@ -945,11 +879,11 @@
           <w:rFonts w:ascii="Arial" w:cs="Arial" w:eastAsia="Arial" w:hAnsi="Arial"/>
           <w:i/>
           <w:iCs/>
-          <w:color w:val="888888"/>
+          <w:color w:val="666666"/>
           <w:sz w:val="20"/>
           <w:szCs w:val="20"/>
         </w:rPr>
-        <w:t xml:space="preserve">VISUAL 3 – Insert diagram: The Six Ethical Lenses – Markkula Framework (Rights, Justice, Utilitarian, Common Good, Virtue, Care Ethics)</w:t>
+        <w:t xml:space="preserve">VISUAL 3 – Insert diagram: The Six Ethical Lenses – Markkula Framework</w:t>
       </w:r>
     </w:p>
     <w:p>
@@ -968,14 +902,13 @@
     <w:p>
       <w:pPr>
         <w:pStyle w:val="Heading2"/>
-        <w:spacing w:after="120" w:before="240"/>
-      </w:pPr>
-      <w:r>
-        <w:rPr>
-          <w:rFonts w:ascii="Arial" w:cs="Arial" w:eastAsia="Arial" w:hAnsi="Arial"/>
-          <w:b/>
-          <w:bCs/>
-          <w:color w:val="2E4057"/>
+        <w:spacing w:after="100" w:before="240"/>
+      </w:pPr>
+      <w:r>
+        <w:rPr>
+          <w:rFonts w:ascii="Arial" w:cs="Arial" w:eastAsia="Arial" w:hAnsi="Arial"/>
+          <w:b/>
+          <w:bCs/>
           <w:sz w:val="24"/>
           <w:szCs w:val="24"/>
         </w:rPr>
@@ -1003,7 +936,7 @@
           <w:sz w:val="24"/>
           <w:szCs w:val="24"/>
         </w:rPr>
-        <w:t xml:space="preserve">Users have a right to make autonomous choices. The right to privacy is violated through mass data collection without genuine informed consent. Children have a right to protection from harm. None of these rights are adequately respected by current platform design.</w:t>
+        <w:t xml:space="preserve">Users' rights to autonomy, privacy, and protection from harm are not adequately respected by current platform design.</w:t>
       </w:r>
     </w:p>
     <w:p>
@@ -1027,7 +960,7 @@
           <w:sz w:val="24"/>
           <w:szCs w:val="24"/>
         </w:rPr>
-        <w:t xml:space="preserve">There is a profound imbalance between who profits – shareholders in wealthy technology companies – and who bears the harm – predominantly young, vulnerable users with no meaningful power to push back. This is fundamentally unjust.</w:t>
+        <w:t xml:space="preserve">Profit concentrates among shareholders while harm concentrates among vulnerable young users – a fundamental imbalance.</w:t>
       </w:r>
     </w:p>
     <w:p>
@@ -1051,7 +984,7 @@
           <w:sz w:val="24"/>
           <w:szCs w:val="24"/>
         </w:rPr>
-        <w:t xml:space="preserve">The greatest good for the greatest number is not served by this model. Billions of hours of human attention are consumed in ways that reduce wellbeing, with benefits concentrated in very few hands.</w:t>
+        <w:t xml:space="preserve">Billions of hours of human attention are consumed in ways that reduce wellbeing, benefiting very few.</w:t>
       </w:r>
     </w:p>
     <w:p>
@@ -1075,7 +1008,7 @@
           <w:sz w:val="24"/>
           <w:szCs w:val="24"/>
         </w:rPr>
-        <w:t xml:space="preserve">A healthy society requires informed citizens, strong community bonds, and good mental health. Persuasive social media design actively undermines all three.</w:t>
+        <w:t xml:space="preserve">A healthy society requires informed citizens and good mental health. Persuasive design undermines both.</w:t>
       </w:r>
     </w:p>
     <w:p>
@@ -1099,7 +1032,7 @@
           <w:sz w:val="24"/>
           <w:szCs w:val="24"/>
         </w:rPr>
-        <w:t xml:space="preserve">A company acting with integrity, compassion, and honesty would not design products it knew were causing harm and then suppress that knowledge. The conduct of major platforms reveals a profound lack of these virtues at a corporate level.</w:t>
+        <w:t xml:space="preserve">Companies that knowingly cause harm and suppress evidence of it are not acting with integrity, compassion, or honesty.</w:t>
       </w:r>
     </w:p>
     <w:p>
@@ -1123,7 +1056,7 @@
           <w:sz w:val="24"/>
           <w:szCs w:val="24"/>
         </w:rPr>
-        <w:t xml:space="preserve">If platform companies genuinely cared for their users – particularly their youngest users – design priorities would be fundamentally different. Current design demonstrates that profit comes before care.</w:t>
+        <w:t xml:space="preserve">If platforms genuinely cared for their users, particularly their youngest, design priorities would be entirely different.</w:t>
       </w:r>
     </w:p>
     <w:p>
@@ -1142,14 +1075,13 @@
     <w:p>
       <w:pPr>
         <w:pStyle w:val="Heading2"/>
-        <w:spacing w:after="120" w:before="240"/>
-      </w:pPr>
-      <w:r>
-        <w:rPr>
-          <w:rFonts w:ascii="Arial" w:cs="Arial" w:eastAsia="Arial" w:hAnsi="Arial"/>
-          <w:b/>
-          <w:bCs/>
-          <w:color w:val="2E4057"/>
+        <w:spacing w:after="100" w:before="240"/>
+      </w:pPr>
+      <w:r>
+        <w:rPr>
+          <w:rFonts w:ascii="Arial" w:cs="Arial" w:eastAsia="Arial" w:hAnsi="Arial"/>
+          <w:b/>
+          <w:bCs/>
           <w:sz w:val="24"/>
           <w:szCs w:val="24"/>
         </w:rPr>
@@ -1167,7 +1099,36 @@
           <w:sz w:val="24"/>
           <w:szCs w:val="24"/>
         </w:rPr>
-        <w:t xml:space="preserve">Yes, significantly. Algorithms deliberately exploit confirmation bias by feeding users content that confirms existing beliefs. This is more engaging but promotes polarisation and distorted thinking. The availability heuristic is triggered when extreme or shocking content is repeatedly surfaced, making users feel the world is more dangerous or dysfunctional than it actually is.</w:t>
+        <w:t xml:space="preserve">Algorithms exploit confirmation bias by surfacing content that confirms existing beliefs, reinforcing polarisation. Repeated exposure to extreme or sensational content triggers the availability heuristic, distorting users' perceptions of reality. Within companies, financial and status quo bias suppress internal dissent. Users themselves often exhibit optimism bias – "this affects other people, not me" – making self-protective action harder.</w:t>
+      </w:r>
+    </w:p>
+    <w:p>
+      <w:pPr>
+        <w:spacing w:after="60" w:before="0"/>
+      </w:pPr>
+      <w:r>
+        <w:rPr>
+          <w:rFonts w:ascii="Arial" w:cs="Arial" w:eastAsia="Arial" w:hAnsi="Arial"/>
+          <w:sz w:val="24"/>
+          <w:szCs w:val="24"/>
+        </w:rPr>
+        <w:t xml:space="preserve"/>
+      </w:r>
+    </w:p>
+    <w:p>
+      <w:pPr>
+        <w:pStyle w:val="Heading2"/>
+        <w:spacing w:after="100" w:before="240"/>
+      </w:pPr>
+      <w:r>
+        <w:rPr>
+          <w:rFonts w:ascii="Arial" w:cs="Arial" w:eastAsia="Arial" w:hAnsi="Arial"/>
+          <w:b/>
+          <w:bCs/>
+          <w:sz w:val="24"/>
+          <w:szCs w:val="24"/>
+        </w:rPr>
+        <w:t xml:space="preserve">Does this situation respect or violate ethical principles?</w:t>
       </w:r>
     </w:p>
     <w:p>
@@ -1181,51 +1142,7 @@
           <w:sz w:val="24"/>
           <w:szCs w:val="24"/>
         </w:rPr>
-        <w:t xml:space="preserve">Within the companies themselves, financial bias and status quo bias make it very difficult for employees who raise concerns about harm to be taken seriously. Growth metrics dominate internal culture. Users themselves frequently display optimism bias – "this affects other people, not me" – which makes it harder to recognise personal harm and take action.</w:t>
-      </w:r>
-    </w:p>
-    <w:p>
-      <w:pPr>
-        <w:spacing w:after="60" w:before="0"/>
-      </w:pPr>
-      <w:r>
-        <w:rPr>
-          <w:rFonts w:ascii="Arial" w:cs="Arial" w:eastAsia="Arial" w:hAnsi="Arial"/>
-          <w:sz w:val="24"/>
-          <w:szCs w:val="24"/>
-        </w:rPr>
-        <w:t xml:space="preserve"/>
-      </w:r>
-    </w:p>
-    <w:p>
-      <w:pPr>
-        <w:pStyle w:val="Heading2"/>
-        <w:spacing w:after="120" w:before="240"/>
-      </w:pPr>
-      <w:r>
-        <w:rPr>
-          <w:rFonts w:ascii="Arial" w:cs="Arial" w:eastAsia="Arial" w:hAnsi="Arial"/>
-          <w:b/>
-          <w:bCs/>
-          <w:color w:val="2E4057"/>
-          <w:sz w:val="24"/>
-          <w:szCs w:val="24"/>
-        </w:rPr>
-        <w:t xml:space="preserve">Does this situation respect or violate ethical principles?</w:t>
-      </w:r>
-    </w:p>
-    <w:p>
-      <w:pPr>
-        <w:spacing w:after="120" w:before="0" w:line="276" w:lineRule="auto"/>
-        <w:jc w:val="both"/>
-      </w:pPr>
-      <w:r>
-        <w:rPr>
-          <w:rFonts w:ascii="Arial" w:cs="Arial" w:eastAsia="Arial" w:hAnsi="Arial"/>
-          <w:sz w:val="24"/>
-          <w:szCs w:val="24"/>
-        </w:rPr>
-        <w:t xml:space="preserve">It clearly violates multiple ethical principles. Autonomy is undermined by design; dignity is treated as a resource to monetise; fairness is ignored in the deliberate targeting of minors; honesty is abandoned when internal research showing harm is suppressed or minimised. The situation fails the Rights, Justice, Utilitarian, Common Good, Virtue, and Care Ethics lenses simultaneously. It is difficult to construct a credible ethical argument in defence of the current model of persuasive social media design.</w:t>
+        <w:t xml:space="preserve">It clearly violates multiple principles simultaneously. Autonomy is undermined by design; dignity is monetised; fairness is ignored; honesty is abandoned. The situation fails every one of the six Markkula lenses. It is not possible to construct a credible ethical defence of the current model of persuasive social media design.</w:t>
       </w:r>
     </w:p>
     <w:p>
@@ -1243,11 +1160,11 @@
           <w:rFonts w:ascii="Arial" w:cs="Arial" w:eastAsia="Arial" w:hAnsi="Arial"/>
           <w:i/>
           <w:iCs/>
-          <w:color w:val="888888"/>
+          <w:color w:val="666666"/>
           <w:sz w:val="20"/>
           <w:szCs w:val="20"/>
         </w:rPr>
-        <w:t xml:space="preserve">VISUAL 4 – Insert infographic: How the attention economy works – platform collects user data, sells to advertisers, reinvests in engagement features</w:t>
+        <w:t xml:space="preserve">VISUAL 4 – Insert infographic: How the attention economy works – data, advertisers, engagement loop</w:t>
       </w:r>
     </w:p>
     <w:p>
@@ -1258,14 +1175,13 @@
     <w:p>
       <w:pPr>
         <w:pStyle w:val="Heading1"/>
-        <w:spacing w:after="160" w:before="320"/>
-      </w:pPr>
-      <w:r>
-        <w:rPr>
-          <w:rFonts w:ascii="Arial" w:cs="Arial" w:eastAsia="Arial" w:hAnsi="Arial"/>
-          <w:b/>
-          <w:bCs/>
-          <w:color w:val="1F3864"/>
+        <w:spacing w:after="160" w:before="360"/>
+      </w:pPr>
+      <w:r>
+        <w:rPr>
+          <w:rFonts w:ascii="Arial" w:cs="Arial" w:eastAsia="Arial" w:hAnsi="Arial"/>
+          <w:b/>
+          <w:bCs/>
           <w:sz w:val="28"/>
           <w:szCs w:val="28"/>
         </w:rPr>
@@ -1283,7 +1199,7 @@
           <w:sz w:val="24"/>
           <w:szCs w:val="24"/>
         </w:rPr>
-        <w:t xml:space="preserve">The following five additional questions were added to the standard ten provided in the task:</w:t>
+        <w:t xml:space="preserve">The following five additional questions were added to the standard ten in the task:</w:t>
       </w:r>
     </w:p>
     <w:p>
@@ -1306,15 +1222,15 @@
           <w:ilvl w:val="0"/>
           <w:numId w:val="2"/>
         </w:numPr>
-        <w:spacing w:after="40" w:before="40" w:line="276" w:lineRule="auto"/>
-      </w:pPr>
-      <w:r>
-        <w:rPr>
-          <w:rFonts w:ascii="Arial" w:cs="Arial" w:eastAsia="Arial" w:hAnsi="Arial"/>
-          <w:sz w:val="24"/>
-          <w:szCs w:val="24"/>
-        </w:rPr>
-        <w:t xml:space="preserve">Q11. Have you noticed any changes in young people's behaviour or mental health that you associate with social media use?</w:t>
+        <w:spacing w:after="30" w:before="40" w:line="276" w:lineRule="auto"/>
+      </w:pPr>
+      <w:r>
+        <w:rPr>
+          <w:rFonts w:ascii="Arial" w:cs="Arial" w:eastAsia="Arial" w:hAnsi="Arial"/>
+          <w:sz w:val="24"/>
+          <w:szCs w:val="24"/>
+        </w:rPr>
+        <w:t xml:space="preserve">Q11. Have you noticed changes in young people's behaviour or mental health linked to social media?</w:t>
       </w:r>
     </w:p>
     <w:p>
@@ -1324,15 +1240,15 @@
           <w:ilvl w:val="0"/>
           <w:numId w:val="2"/>
         </w:numPr>
-        <w:spacing w:after="40" w:before="40" w:line="276" w:lineRule="auto"/>
-      </w:pPr>
-      <w:r>
-        <w:rPr>
-          <w:rFonts w:ascii="Arial" w:cs="Arial" w:eastAsia="Arial" w:hAnsi="Arial"/>
-          <w:sz w:val="24"/>
-          <w:szCs w:val="24"/>
-        </w:rPr>
-        <w:t xml:space="preserve">Q12. Do you believe social media companies have a genuine duty of care towards their youngest users?</w:t>
+        <w:spacing w:after="30" w:before="30" w:line="276" w:lineRule="auto"/>
+      </w:pPr>
+      <w:r>
+        <w:rPr>
+          <w:rFonts w:ascii="Arial" w:cs="Arial" w:eastAsia="Arial" w:hAnsi="Arial"/>
+          <w:sz w:val="24"/>
+          <w:szCs w:val="24"/>
+        </w:rPr>
+        <w:t xml:space="preserve">Q12. Do you believe social media companies have a genuine duty of care to their youngest users?</w:t>
       </w:r>
     </w:p>
     <w:p>
@@ -1342,15 +1258,15 @@
           <w:ilvl w:val="0"/>
           <w:numId w:val="2"/>
         </w:numPr>
-        <w:spacing w:after="40" w:before="40" w:line="276" w:lineRule="auto"/>
-      </w:pPr>
-      <w:r>
-        <w:rPr>
-          <w:rFonts w:ascii="Arial" w:cs="Arial" w:eastAsia="Arial" w:hAnsi="Arial"/>
-          <w:sz w:val="24"/>
-          <w:szCs w:val="24"/>
-        </w:rPr>
-        <w:t xml:space="preserve">Q13. What role should schools and parents play in educating young people about how social media is designed?</w:t>
+        <w:spacing w:after="30" w:before="30" w:line="276" w:lineRule="auto"/>
+      </w:pPr>
+      <w:r>
+        <w:rPr>
+          <w:rFonts w:ascii="Arial" w:cs="Arial" w:eastAsia="Arial" w:hAnsi="Arial"/>
+          <w:sz w:val="24"/>
+          <w:szCs w:val="24"/>
+        </w:rPr>
+        <w:t xml:space="preserve">Q13. What role should schools and parents play in educating young people about platform design?</w:t>
       </w:r>
     </w:p>
     <w:p>
@@ -1360,15 +1276,15 @@
           <w:ilvl w:val="0"/>
           <w:numId w:val="2"/>
         </w:numPr>
-        <w:spacing w:after="40" w:before="40" w:line="276" w:lineRule="auto"/>
-      </w:pPr>
-      <w:r>
-        <w:rPr>
-          <w:rFonts w:ascii="Arial" w:cs="Arial" w:eastAsia="Arial" w:hAnsi="Arial"/>
-          <w:sz w:val="24"/>
-          <w:szCs w:val="24"/>
-        </w:rPr>
-        <w:t xml:space="preserve">Q14. Do you think there should be stricter government regulation of social media platforms in South Africa?</w:t>
+        <w:spacing w:after="30" w:before="30" w:line="276" w:lineRule="auto"/>
+      </w:pPr>
+      <w:r>
+        <w:rPr>
+          <w:rFonts w:ascii="Arial" w:cs="Arial" w:eastAsia="Arial" w:hAnsi="Arial"/>
+          <w:sz w:val="24"/>
+          <w:szCs w:val="24"/>
+        </w:rPr>
+        <w:t xml:space="preserve">Q14. Should South Africa have stricter government regulation of social media?</w:t>
       </w:r>
     </w:p>
     <w:p>
@@ -1378,15 +1294,15 @@
           <w:ilvl w:val="0"/>
           <w:numId w:val="2"/>
         </w:numPr>
-        <w:spacing w:after="120" w:before="40" w:line="276" w:lineRule="auto"/>
-      </w:pPr>
-      <w:r>
-        <w:rPr>
-          <w:rFonts w:ascii="Arial" w:cs="Arial" w:eastAsia="Arial" w:hAnsi="Arial"/>
-          <w:sz w:val="24"/>
-          <w:szCs w:val="24"/>
-        </w:rPr>
-        <w:t xml:space="preserve">Q15. If you could change one thing about how social media platforms operate, what would it be?</w:t>
+        <w:spacing w:after="120" w:before="30" w:line="276" w:lineRule="auto"/>
+      </w:pPr>
+      <w:r>
+        <w:rPr>
+          <w:rFonts w:ascii="Arial" w:cs="Arial" w:eastAsia="Arial" w:hAnsi="Arial"/>
+          <w:sz w:val="24"/>
+          <w:szCs w:val="24"/>
+        </w:rPr>
+        <w:t xml:space="preserve">Q15. If you could change one thing about how platforms operate, what would it be?</w:t>
       </w:r>
     </w:p>
     <w:p>
@@ -1405,14 +1321,13 @@
     <w:p>
       <w:pPr>
         <w:pStyle w:val="Heading2"/>
-        <w:spacing w:after="120" w:before="240"/>
-      </w:pPr>
-      <w:r>
-        <w:rPr>
-          <w:rFonts w:ascii="Arial" w:cs="Arial" w:eastAsia="Arial" w:hAnsi="Arial"/>
-          <w:b/>
-          <w:bCs/>
-          <w:color w:val="2E4057"/>
+        <w:spacing w:after="100" w:before="240"/>
+      </w:pPr>
+      <w:r>
+        <w:rPr>
+          <w:rFonts w:ascii="Arial" w:cs="Arial" w:eastAsia="Arial" w:hAnsi="Arial"/>
+          <w:b/>
+          <w:bCs/>
           <w:sz w:val="24"/>
           <w:szCs w:val="24"/>
         </w:rPr>
@@ -1434,7 +1349,7 @@
           <w:rFonts w:ascii="Arial" w:cs="Arial" w:eastAsia="Arial" w:hAnsi="Arial"/>
           <w:i/>
           <w:iCs/>
-          <w:color w:val="888888"/>
+          <w:color w:val="666666"/>
           <w:sz w:val="20"/>
           <w:szCs w:val="20"/>
         </w:rPr>
@@ -1443,7 +1358,7 @@
     </w:p>
     <w:p>
       <w:pPr>
-        <w:spacing w:after="60" w:before="80"/>
+        <w:spacing w:after="50" w:before="80"/>
       </w:pPr>
       <w:r>
         <w:rPr>
@@ -1466,7 +1381,7 @@
     </w:p>
     <w:p>
       <w:pPr>
-        <w:spacing w:after="60" w:before="40"/>
+        <w:spacing w:after="50" w:before="0"/>
       </w:pPr>
       <w:r>
         <w:rPr>
@@ -1489,7 +1404,7 @@
     </w:p>
     <w:p>
       <w:pPr>
-        <w:spacing w:after="120" w:before="40"/>
+        <w:spacing w:after="120" w:before="0"/>
       </w:pPr>
       <w:r>
         <w:rPr>
@@ -1512,7 +1427,7 @@
     </w:p>
     <w:p>
       <w:pPr>
-        <w:spacing w:after="40" w:before="120" w:line="276" w:lineRule="auto"/>
+        <w:spacing w:after="30" w:before="100" w:line="276" w:lineRule="auto"/>
       </w:pPr>
       <w:r>
         <w:rPr>
@@ -1527,21 +1442,21 @@
     </w:p>
     <w:p>
       <w:pPr>
-        <w:spacing w:after="80" w:before="40" w:line="276" w:lineRule="auto"/>
-        <w:jc w:val="both"/>
-      </w:pPr>
-      <w:r>
-        <w:rPr>
-          <w:rFonts w:ascii="Arial" w:cs="Arial" w:eastAsia="Arial" w:hAnsi="Arial"/>
-          <w:sz w:val="24"/>
-          <w:szCs w:val="24"/>
-        </w:rPr>
-        <w:t xml:space="preserve">"Without question, it's the impact of social media on young people's mental health. I see it daily – anxiety, social comparison, sleep issues – at levels I have never encountered before in my career."</w:t>
-      </w:r>
-    </w:p>
-    <w:p>
-      <w:pPr>
-        <w:spacing w:after="40" w:before="120" w:line="276" w:lineRule="auto"/>
+        <w:spacing w:after="80" w:before="30" w:line="276" w:lineRule="auto"/>
+        <w:jc w:val="both"/>
+      </w:pPr>
+      <w:r>
+        <w:rPr>
+          <w:rFonts w:ascii="Arial" w:cs="Arial" w:eastAsia="Arial" w:hAnsi="Arial"/>
+          <w:sz w:val="24"/>
+          <w:szCs w:val="24"/>
+        </w:rPr>
+        <w:t xml:space="preserve">"The impact of social media on young people's mental health. I see anxiety, social comparison, and sleep problems at levels I have never encountered before."</w:t>
+      </w:r>
+    </w:p>
+    <w:p>
+      <w:pPr>
+        <w:spacing w:after="30" w:before="100" w:line="276" w:lineRule="auto"/>
       </w:pPr>
       <w:r>
         <w:rPr>
@@ -1556,21 +1471,21 @@
     </w:p>
     <w:p>
       <w:pPr>
-        <w:spacing w:after="80" w:before="40" w:line="276" w:lineRule="auto"/>
-        <w:jc w:val="both"/>
-      </w:pPr>
-      <w:r>
-        <w:rPr>
-          <w:rFonts w:ascii="Arial" w:cs="Arial" w:eastAsia="Arial" w:hAnsi="Arial"/>
-          <w:sz w:val="24"/>
-          <w:szCs w:val="24"/>
-        </w:rPr>
-        <w:t xml:space="preserve">"My caseload has grown significantly over the past five years. The majority of cases now have a digital component – cyberbullying, comparison anxiety, or distress from online interactions."</w:t>
-      </w:r>
-    </w:p>
-    <w:p>
-      <w:pPr>
-        <w:spacing w:after="40" w:before="120" w:line="276" w:lineRule="auto"/>
+        <w:spacing w:after="80" w:before="30" w:line="276" w:lineRule="auto"/>
+        <w:jc w:val="both"/>
+      </w:pPr>
+      <w:r>
+        <w:rPr>
+          <w:rFonts w:ascii="Arial" w:cs="Arial" w:eastAsia="Arial" w:hAnsi="Arial"/>
+          <w:sz w:val="24"/>
+          <w:szCs w:val="24"/>
+        </w:rPr>
+        <w:t xml:space="preserve">"My caseload has grown significantly. The majority of cases now have a digital component – cyberbullying, comparison anxiety, or distress from online interactions."</w:t>
+      </w:r>
+    </w:p>
+    <w:p>
+      <w:pPr>
+        <w:spacing w:after="30" w:before="100" w:line="276" w:lineRule="auto"/>
       </w:pPr>
       <w:r>
         <w:rPr>
@@ -1585,21 +1500,21 @@
     </w:p>
     <w:p>
       <w:pPr>
-        <w:spacing w:after="80" w:before="40" w:line="276" w:lineRule="auto"/>
-        <w:jc w:val="both"/>
-      </w:pPr>
-      <w:r>
-        <w:rPr>
-          <w:rFonts w:ascii="Arial" w:cs="Arial" w:eastAsia="Arial" w:hAnsi="Arial"/>
-          <w:sz w:val="24"/>
-          <w:szCs w:val="24"/>
-        </w:rPr>
-        <w:t xml:space="preserve">"I've had to educate myself about how these apps are designed just to help my clients. I now actively teach students about features like infinite scroll and notification design so they can understand what is happening to their own brains."</w:t>
-      </w:r>
-    </w:p>
-    <w:p>
-      <w:pPr>
-        <w:spacing w:after="40" w:before="120" w:line="276" w:lineRule="auto"/>
+        <w:spacing w:after="80" w:before="30" w:line="276" w:lineRule="auto"/>
+        <w:jc w:val="both"/>
+      </w:pPr>
+      <w:r>
+        <w:rPr>
+          <w:rFonts w:ascii="Arial" w:cs="Arial" w:eastAsia="Arial" w:hAnsi="Arial"/>
+          <w:sz w:val="24"/>
+          <w:szCs w:val="24"/>
+        </w:rPr>
+        <w:t xml:space="preserve">"I educate myself about platform design so I can help my clients understand what is happening. I now teach students about infinite scroll and notification mechanics so they recognise these as engineered, not personal failings."</w:t>
+      </w:r>
+    </w:p>
+    <w:p>
+      <w:pPr>
+        <w:spacing w:after="30" w:before="100" w:line="276" w:lineRule="auto"/>
       </w:pPr>
       <w:r>
         <w:rPr>
@@ -1614,21 +1529,21 @@
     </w:p>
     <w:p>
       <w:pPr>
-        <w:spacing w:after="80" w:before="40" w:line="276" w:lineRule="auto"/>
-        <w:jc w:val="both"/>
-      </w:pPr>
-      <w:r>
-        <w:rPr>
-          <w:rFonts w:ascii="Arial" w:cs="Arial" w:eastAsia="Arial" w:hAnsi="Arial"/>
-          <w:sz w:val="24"/>
-          <w:szCs w:val="24"/>
-        </w:rPr>
-        <w:t xml:space="preserve">"Ethical design puts the user's wellbeing first – natural stopping points, limited notifications, transparent data use. What we have instead is deliberately unethical because it exploits known psychological vulnerabilities."</w:t>
-      </w:r>
-    </w:p>
-    <w:p>
-      <w:pPr>
-        <w:spacing w:after="40" w:before="120" w:line="276" w:lineRule="auto"/>
+        <w:spacing w:after="80" w:before="30" w:line="276" w:lineRule="auto"/>
+        <w:jc w:val="both"/>
+      </w:pPr>
+      <w:r>
+        <w:rPr>
+          <w:rFonts w:ascii="Arial" w:cs="Arial" w:eastAsia="Arial" w:hAnsi="Arial"/>
+          <w:sz w:val="24"/>
+          <w:szCs w:val="24"/>
+        </w:rPr>
+        <w:t xml:space="preserve">"Ethical design puts user wellbeing first – natural stopping points, transparent data use. What we have instead exploits known psychological vulnerabilities for profit."</w:t>
+      </w:r>
+    </w:p>
+    <w:p>
+      <w:pPr>
+        <w:spacing w:after="30" w:before="100" w:line="276" w:lineRule="auto"/>
       </w:pPr>
       <w:r>
         <w:rPr>
@@ -1643,21 +1558,21 @@
     </w:p>
     <w:p>
       <w:pPr>
-        <w:spacing w:after="80" w:before="40" w:line="276" w:lineRule="auto"/>
-        <w:jc w:val="both"/>
-      </w:pPr>
-      <w:r>
-        <w:rPr>
-          <w:rFonts w:ascii="Arial" w:cs="Arial" w:eastAsia="Arial" w:hAnsi="Arial"/>
-          <w:sz w:val="24"/>
-          <w:szCs w:val="24"/>
-        </w:rPr>
-        <w:t xml:space="preserve">"Mostly not. Young people don't realise that the anxiety they feel when they check their phone, the compulsive scrolling, the FOMO – these are the intended results of engineering decisions, not personal weakness."</w:t>
-      </w:r>
-    </w:p>
-    <w:p>
-      <w:pPr>
-        <w:spacing w:after="40" w:before="120" w:line="276" w:lineRule="auto"/>
+        <w:spacing w:after="80" w:before="30" w:line="276" w:lineRule="auto"/>
+        <w:jc w:val="both"/>
+      </w:pPr>
+      <w:r>
+        <w:rPr>
+          <w:rFonts w:ascii="Arial" w:cs="Arial" w:eastAsia="Arial" w:hAnsi="Arial"/>
+          <w:sz w:val="24"/>
+          <w:szCs w:val="24"/>
+        </w:rPr>
+        <w:t xml:space="preserve">"No. Young people blame themselves for compulsive scrolling and FOMO, not realising these are designed outcomes."</w:t>
+      </w:r>
+    </w:p>
+    <w:p>
+      <w:pPr>
+        <w:spacing w:after="30" w:before="100" w:line="276" w:lineRule="auto"/>
       </w:pPr>
       <w:r>
         <w:rPr>
@@ -1672,21 +1587,21 @@
     </w:p>
     <w:p>
       <w:pPr>
-        <w:spacing w:after="80" w:before="40" w:line="276" w:lineRule="auto"/>
-        <w:jc w:val="both"/>
-      </w:pPr>
-      <w:r>
-        <w:rPr>
-          <w:rFonts w:ascii="Arial" w:cs="Arial" w:eastAsia="Arial" w:hAnsi="Arial"/>
-          <w:sz w:val="24"/>
-          <w:szCs w:val="24"/>
-        </w:rPr>
-        <w:t xml:space="preserve">"Companies say users choose to be on the platform – it's free. But this ignores that the choice is manufactured through manipulation. It's like saying people freely choose to gamble when the machine is designed to keep them gambling."</w:t>
-      </w:r>
-    </w:p>
-    <w:p>
-      <w:pPr>
-        <w:spacing w:after="40" w:before="120" w:line="276" w:lineRule="auto"/>
+        <w:spacing w:after="80" w:before="30" w:line="276" w:lineRule="auto"/>
+        <w:jc w:val="both"/>
+      </w:pPr>
+      <w:r>
+        <w:rPr>
+          <w:rFonts w:ascii="Arial" w:cs="Arial" w:eastAsia="Arial" w:hAnsi="Arial"/>
+          <w:sz w:val="24"/>
+          <w:szCs w:val="24"/>
+        </w:rPr>
+        <w:t xml:space="preserve">"Companies say users choose to be on the platform freely. But manufactured choice, through exploitation of psychology, is not genuine choice."</w:t>
+      </w:r>
+    </w:p>
+    <w:p>
+      <w:pPr>
+        <w:spacing w:after="30" w:before="100" w:line="276" w:lineRule="auto"/>
       </w:pPr>
       <w:r>
         <w:rPr>
@@ -1701,21 +1616,21 @@
     </w:p>
     <w:p>
       <w:pPr>
-        <w:spacing w:after="80" w:before="40" w:line="276" w:lineRule="auto"/>
-        <w:jc w:val="both"/>
-      </w:pPr>
-      <w:r>
-        <w:rPr>
-          <w:rFonts w:ascii="Arial" w:cs="Arial" w:eastAsia="Arial" w:hAnsi="Arial"/>
-          <w:sz w:val="24"/>
-          <w:szCs w:val="24"/>
-        </w:rPr>
-        <w:t xml:space="preserve">"No. The people who gain are the shareholders. The people who lose are the users, especially those who are young or already vulnerable."</w:t>
-      </w:r>
-    </w:p>
-    <w:p>
-      <w:pPr>
-        <w:spacing w:after="40" w:before="120" w:line="276" w:lineRule="auto"/>
+        <w:spacing w:after="80" w:before="30" w:line="276" w:lineRule="auto"/>
+        <w:jc w:val="both"/>
+      </w:pPr>
+      <w:r>
+        <w:rPr>
+          <w:rFonts w:ascii="Arial" w:cs="Arial" w:eastAsia="Arial" w:hAnsi="Arial"/>
+          <w:sz w:val="24"/>
+          <w:szCs w:val="24"/>
+        </w:rPr>
+        <w:t xml:space="preserve">"No. The people who gain are shareholders. The people who lose are users, especially the young and vulnerable."</w:t>
+      </w:r>
+    </w:p>
+    <w:p>
+      <w:pPr>
+        <w:spacing w:after="30" w:before="100" w:line="276" w:lineRule="auto"/>
       </w:pPr>
       <w:r>
         <w:rPr>
@@ -1730,21 +1645,21 @@
     </w:p>
     <w:p>
       <w:pPr>
-        <w:spacing w:after="80" w:before="40" w:line="276" w:lineRule="auto"/>
-        <w:jc w:val="both"/>
-      </w:pPr>
-      <w:r>
-        <w:rPr>
-          <w:rFonts w:ascii="Arial" w:cs="Arial" w:eastAsia="Arial" w:hAnsi="Arial"/>
-          <w:sz w:val="24"/>
-          <w:szCs w:val="24"/>
-        </w:rPr>
-        <w:t xml:space="preserve">"Everyone has a role. Platforms need to redesign. Government needs to regulate. Schools need to educate. Parents need to be present. It requires a collective response."</w:t>
-      </w:r>
-    </w:p>
-    <w:p>
-      <w:pPr>
-        <w:spacing w:after="40" w:before="120" w:line="276" w:lineRule="auto"/>
+        <w:spacing w:after="80" w:before="30" w:line="276" w:lineRule="auto"/>
+        <w:jc w:val="both"/>
+      </w:pPr>
+      <w:r>
+        <w:rPr>
+          <w:rFonts w:ascii="Arial" w:cs="Arial" w:eastAsia="Arial" w:hAnsi="Arial"/>
+          <w:sz w:val="24"/>
+          <w:szCs w:val="24"/>
+        </w:rPr>
+        <w:t xml:space="preserve">"Platforms, government, schools, and parents all have a role – but companies are the source of the problem."</w:t>
+      </w:r>
+    </w:p>
+    <w:p>
+      <w:pPr>
+        <w:spacing w:after="30" w:before="100" w:line="276" w:lineRule="auto"/>
       </w:pPr>
       <w:r>
         <w:rPr>
@@ -1759,21 +1674,21 @@
     </w:p>
     <w:p>
       <w:pPr>
-        <w:spacing w:after="80" w:before="40" w:line="276" w:lineRule="auto"/>
-        <w:jc w:val="both"/>
-      </w:pPr>
-      <w:r>
-        <w:rPr>
-          <w:rFonts w:ascii="Arial" w:cs="Arial" w:eastAsia="Arial" w:hAnsi="Arial"/>
-          <w:sz w:val="24"/>
-          <w:szCs w:val="24"/>
-        </w:rPr>
-        <w:t xml:space="preserve">"Age verification with different default settings for minors. Design standards mandating natural stopping points. Mandatory algorithmic transparency."</w:t>
-      </w:r>
-    </w:p>
-    <w:p>
-      <w:pPr>
-        <w:spacing w:after="40" w:before="120" w:line="276" w:lineRule="auto"/>
+        <w:spacing w:after="80" w:before="30" w:line="276" w:lineRule="auto"/>
+        <w:jc w:val="both"/>
+      </w:pPr>
+      <w:r>
+        <w:rPr>
+          <w:rFonts w:ascii="Arial" w:cs="Arial" w:eastAsia="Arial" w:hAnsi="Arial"/>
+          <w:sz w:val="24"/>
+          <w:szCs w:val="24"/>
+        </w:rPr>
+        <w:t xml:space="preserve">"Age verification with protective default settings for minors, and mandatory algorithmic transparency."</w:t>
+      </w:r>
+    </w:p>
+    <w:p>
+      <w:pPr>
+        <w:spacing w:after="30" w:before="100" w:line="276" w:lineRule="auto"/>
       </w:pPr>
       <w:r>
         <w:rPr>
@@ -1788,21 +1703,21 @@
     </w:p>
     <w:p>
       <w:pPr>
-        <w:spacing w:after="80" w:before="40" w:line="276" w:lineRule="auto"/>
-        <w:jc w:val="both"/>
-      </w:pPr>
-      <w:r>
-        <w:rPr>
-          <w:rFonts w:ascii="Arial" w:cs="Arial" w:eastAsia="Arial" w:hAnsi="Arial"/>
-          <w:sz w:val="24"/>
-          <w:szCs w:val="24"/>
-        </w:rPr>
-        <w:t xml:space="preserve">"I want young people to understand: you are not weak for struggling with this. These apps are built by the world's smartest engineers specifically to make stopping difficult. Your struggle is a designed outcome."</w:t>
-      </w:r>
-    </w:p>
-    <w:p>
-      <w:pPr>
-        <w:spacing w:after="40" w:before="120" w:line="276" w:lineRule="auto"/>
+        <w:spacing w:after="80" w:before="30" w:line="276" w:lineRule="auto"/>
+        <w:jc w:val="both"/>
+      </w:pPr>
+      <w:r>
+        <w:rPr>
+          <w:rFonts w:ascii="Arial" w:cs="Arial" w:eastAsia="Arial" w:hAnsi="Arial"/>
+          <w:sz w:val="24"/>
+          <w:szCs w:val="24"/>
+        </w:rPr>
+        <w:t xml:space="preserve">"I want young people to know: your struggle is a designed outcome, not a personal weakness."</w:t>
+      </w:r>
+    </w:p>
+    <w:p>
+      <w:pPr>
+        <w:spacing w:after="30" w:before="100" w:line="276" w:lineRule="auto"/>
       </w:pPr>
       <w:r>
         <w:rPr>
@@ -1817,21 +1732,21 @@
     </w:p>
     <w:p>
       <w:pPr>
-        <w:spacing w:after="80" w:before="40" w:line="276" w:lineRule="auto"/>
-        <w:jc w:val="both"/>
-      </w:pPr>
-      <w:r>
-        <w:rPr>
-          <w:rFonts w:ascii="Arial" w:cs="Arial" w:eastAsia="Arial" w:hAnsi="Arial"/>
-          <w:sz w:val="24"/>
-          <w:szCs w:val="24"/>
-        </w:rPr>
-        <w:t xml:space="preserve">"Shorter attention spans, higher baseline anxiety, difficulty tolerating boredom. These are genuinely new phenomena that have accelerated sharply with smartphone and social media use."</w:t>
-      </w:r>
-    </w:p>
-    <w:p>
-      <w:pPr>
-        <w:spacing w:after="40" w:before="120" w:line="276" w:lineRule="auto"/>
+        <w:spacing w:after="80" w:before="30" w:line="276" w:lineRule="auto"/>
+        <w:jc w:val="both"/>
+      </w:pPr>
+      <w:r>
+        <w:rPr>
+          <w:rFonts w:ascii="Arial" w:cs="Arial" w:eastAsia="Arial" w:hAnsi="Arial"/>
+          <w:sz w:val="24"/>
+          <w:szCs w:val="24"/>
+        </w:rPr>
+        <w:t xml:space="preserve">"Shorter attention spans, higher baseline anxiety, and a reduced ability to tolerate boredom – all accelerating sharply with smartphone use."</w:t>
+      </w:r>
+    </w:p>
+    <w:p>
+      <w:pPr>
+        <w:spacing w:after="30" w:before="100" w:line="276" w:lineRule="auto"/>
       </w:pPr>
       <w:r>
         <w:rPr>
@@ -1846,21 +1761,21 @@
     </w:p>
     <w:p>
       <w:pPr>
-        <w:spacing w:after="80" w:before="40" w:line="276" w:lineRule="auto"/>
-        <w:jc w:val="both"/>
-      </w:pPr>
-      <w:r>
-        <w:rPr>
-          <w:rFonts w:ascii="Arial" w:cs="Arial" w:eastAsia="Arial" w:hAnsi="Arial"/>
-          <w:sz w:val="24"/>
-          <w:szCs w:val="24"/>
-        </w:rPr>
-        <w:t xml:space="preserve">"Legally unclear in South Africa, but ethically – absolutely yes, particularly where minors are concerned."</w:t>
-      </w:r>
-    </w:p>
-    <w:p>
-      <w:pPr>
-        <w:spacing w:after="40" w:before="120" w:line="276" w:lineRule="auto"/>
+        <w:spacing w:after="80" w:before="30" w:line="276" w:lineRule="auto"/>
+        <w:jc w:val="both"/>
+      </w:pPr>
+      <w:r>
+        <w:rPr>
+          <w:rFonts w:ascii="Arial" w:cs="Arial" w:eastAsia="Arial" w:hAnsi="Arial"/>
+          <w:sz w:val="24"/>
+          <w:szCs w:val="24"/>
+        </w:rPr>
+        <w:t xml:space="preserve">"Ethically – absolutely yes, particularly where minors are involved."</w:t>
+      </w:r>
+    </w:p>
+    <w:p>
+      <w:pPr>
+        <w:spacing w:after="30" w:before="100" w:line="276" w:lineRule="auto"/>
       </w:pPr>
       <w:r>
         <w:rPr>
@@ -1875,21 +1790,21 @@
     </w:p>
     <w:p>
       <w:pPr>
-        <w:spacing w:after="80" w:before="40" w:line="276" w:lineRule="auto"/>
-        <w:jc w:val="both"/>
-      </w:pPr>
-      <w:r>
-        <w:rPr>
-          <w:rFonts w:ascii="Arial" w:cs="Arial" w:eastAsia="Arial" w:hAnsi="Arial"/>
-          <w:sz w:val="24"/>
-          <w:szCs w:val="24"/>
-        </w:rPr>
-        <w:t xml:space="preserve">"Critical digital literacy should be a core curriculum subject. Not just internet safety but actually understanding how these platforms are built and why."</w:t>
-      </w:r>
-    </w:p>
-    <w:p>
-      <w:pPr>
-        <w:spacing w:after="40" w:before="120" w:line="276" w:lineRule="auto"/>
+        <w:spacing w:after="80" w:before="30" w:line="276" w:lineRule="auto"/>
+        <w:jc w:val="both"/>
+      </w:pPr>
+      <w:r>
+        <w:rPr>
+          <w:rFonts w:ascii="Arial" w:cs="Arial" w:eastAsia="Arial" w:hAnsi="Arial"/>
+          <w:sz w:val="24"/>
+          <w:szCs w:val="24"/>
+        </w:rPr>
+        <w:t xml:space="preserve">"Critical digital literacy should be a core curriculum subject, not an optional extra."</w:t>
+      </w:r>
+    </w:p>
+    <w:p>
+      <w:pPr>
+        <w:spacing w:after="30" w:before="100" w:line="276" w:lineRule="auto"/>
       </w:pPr>
       <w:r>
         <w:rPr>
@@ -1904,21 +1819,21 @@
     </w:p>
     <w:p>
       <w:pPr>
-        <w:spacing w:after="80" w:before="40" w:line="276" w:lineRule="auto"/>
-        <w:jc w:val="both"/>
-      </w:pPr>
-      <w:r>
-        <w:rPr>
-          <w:rFonts w:ascii="Arial" w:cs="Arial" w:eastAsia="Arial" w:hAnsi="Arial"/>
-          <w:sz w:val="24"/>
-          <w:szCs w:val="24"/>
-        </w:rPr>
-        <w:t xml:space="preserve">"Yes. South Africa lags behind countries like the UK where age-appropriate design codes now exist. We urgently need similar legislation."</w:t>
-      </w:r>
-    </w:p>
-    <w:p>
-      <w:pPr>
-        <w:spacing w:after="40" w:before="120" w:line="276" w:lineRule="auto"/>
+        <w:spacing w:after="80" w:before="30" w:line="276" w:lineRule="auto"/>
+        <w:jc w:val="both"/>
+      </w:pPr>
+      <w:r>
+        <w:rPr>
+          <w:rFonts w:ascii="Arial" w:cs="Arial" w:eastAsia="Arial" w:hAnsi="Arial"/>
+          <w:sz w:val="24"/>
+          <w:szCs w:val="24"/>
+        </w:rPr>
+        <w:t xml:space="preserve">"Yes. We lag behind countries like the UK where age-appropriate design codes now exist."</w:t>
+      </w:r>
+    </w:p>
+    <w:p>
+      <w:pPr>
+        <w:spacing w:after="30" w:before="100" w:line="276" w:lineRule="auto"/>
       </w:pPr>
       <w:r>
         <w:rPr>
@@ -1933,16 +1848,16 @@
     </w:p>
     <w:p>
       <w:pPr>
-        <w:spacing w:after="80" w:before="40" w:line="276" w:lineRule="auto"/>
-        <w:jc w:val="both"/>
-      </w:pPr>
-      <w:r>
-        <w:rPr>
-          <w:rFonts w:ascii="Arial" w:cs="Arial" w:eastAsia="Arial" w:hAnsi="Arial"/>
-          <w:sz w:val="24"/>
-          <w:szCs w:val="24"/>
-        </w:rPr>
-        <w:t xml:space="preserve">"I would prohibit variable reward notification systems for users under 18. That single change would substantially reduce the addictive pull of these platforms."</w:t>
+        <w:spacing w:after="80" w:before="30" w:line="276" w:lineRule="auto"/>
+        <w:jc w:val="both"/>
+      </w:pPr>
+      <w:r>
+        <w:rPr>
+          <w:rFonts w:ascii="Arial" w:cs="Arial" w:eastAsia="Arial" w:hAnsi="Arial"/>
+          <w:sz w:val="24"/>
+          <w:szCs w:val="24"/>
+        </w:rPr>
+        <w:t xml:space="preserve">"Ban variable reward notification systems for users under 18. That single change would substantially reduce the addictive pull of these platforms."</w:t>
       </w:r>
     </w:p>
     <w:p>
@@ -1961,14 +1876,13 @@
     <w:p>
       <w:pPr>
         <w:pStyle w:val="Heading2"/>
-        <w:spacing w:after="120" w:before="240"/>
-      </w:pPr>
-      <w:r>
-        <w:rPr>
-          <w:rFonts w:ascii="Arial" w:cs="Arial" w:eastAsia="Arial" w:hAnsi="Arial"/>
-          <w:b/>
-          <w:bCs/>
-          <w:color w:val="2E4057"/>
+        <w:spacing w:after="100" w:before="240"/>
+      </w:pPr>
+      <w:r>
+        <w:rPr>
+          <w:rFonts w:ascii="Arial" w:cs="Arial" w:eastAsia="Arial" w:hAnsi="Arial"/>
+          <w:b/>
+          <w:bCs/>
           <w:sz w:val="24"/>
           <w:szCs w:val="24"/>
         </w:rPr>
@@ -1990,7 +1904,7 @@
           <w:rFonts w:ascii="Arial" w:cs="Arial" w:eastAsia="Arial" w:hAnsi="Arial"/>
           <w:i/>
           <w:iCs/>
-          <w:color w:val="888888"/>
+          <w:color w:val="666666"/>
           <w:sz w:val="20"/>
           <w:szCs w:val="20"/>
         </w:rPr>
@@ -1999,7 +1913,7 @@
     </w:p>
     <w:p>
       <w:pPr>
-        <w:spacing w:after="60" w:before="80"/>
+        <w:spacing w:after="50" w:before="80"/>
       </w:pPr>
       <w:r>
         <w:rPr>
@@ -2022,7 +1936,7 @@
     </w:p>
     <w:p>
       <w:pPr>
-        <w:spacing w:after="60" w:before="40"/>
+        <w:spacing w:after="50" w:before="0"/>
       </w:pPr>
       <w:r>
         <w:rPr>
@@ -2045,7 +1959,7 @@
     </w:p>
     <w:p>
       <w:pPr>
-        <w:spacing w:after="120" w:before="40"/>
+        <w:spacing w:after="120" w:before="0"/>
       </w:pPr>
       <w:r>
         <w:rPr>
@@ -2068,7 +1982,7 @@
     </w:p>
     <w:p>
       <w:pPr>
-        <w:spacing w:after="40" w:before="120" w:line="276" w:lineRule="auto"/>
+        <w:spacing w:after="30" w:before="100" w:line="276" w:lineRule="auto"/>
       </w:pPr>
       <w:r>
         <w:rPr>
@@ -2083,21 +1997,21 @@
     </w:p>
     <w:p>
       <w:pPr>
-        <w:spacing w:after="80" w:before="40" w:line="276" w:lineRule="auto"/>
-        <w:jc w:val="both"/>
-      </w:pPr>
-      <w:r>
-        <w:rPr>
-          <w:rFonts w:ascii="Arial" w:cs="Arial" w:eastAsia="Arial" w:hAnsi="Arial"/>
-          <w:sz w:val="24"/>
-          <w:szCs w:val="24"/>
-        </w:rPr>
-        <w:t xml:space="preserve">"Data privacy and the exploitation of attention, particularly for young people. My students have very little understanding of how much data is collected about them or how it is used to keep them engaged."</w:t>
-      </w:r>
-    </w:p>
-    <w:p>
-      <w:pPr>
-        <w:spacing w:after="40" w:before="120" w:line="276" w:lineRule="auto"/>
+        <w:spacing w:after="80" w:before="30" w:line="276" w:lineRule="auto"/>
+        <w:jc w:val="both"/>
+      </w:pPr>
+      <w:r>
+        <w:rPr>
+          <w:rFonts w:ascii="Arial" w:cs="Arial" w:eastAsia="Arial" w:hAnsi="Arial"/>
+          <w:sz w:val="24"/>
+          <w:szCs w:val="24"/>
+        </w:rPr>
+        <w:t xml:space="preserve">"Data privacy and the exploitation of attention – particularly for young people who have no real understanding of how much is being collected about them."</w:t>
+      </w:r>
+    </w:p>
+    <w:p>
+      <w:pPr>
+        <w:spacing w:after="30" w:before="100" w:line="276" w:lineRule="auto"/>
       </w:pPr>
       <w:r>
         <w:rPr>
@@ -2112,21 +2026,21 @@
     </w:p>
     <w:p>
       <w:pPr>
-        <w:spacing w:after="80" w:before="40" w:line="276" w:lineRule="auto"/>
-        <w:jc w:val="both"/>
-      </w:pPr>
-      <w:r>
-        <w:rPr>
-          <w:rFonts w:ascii="Arial" w:cs="Arial" w:eastAsia="Arial" w:hAnsi="Arial"/>
-          <w:sz w:val="24"/>
-          <w:szCs w:val="24"/>
-        </w:rPr>
-        <w:t xml:space="preserve">"I began dedicating lessons to social media design specifically when I noticed students arriving at school exhausted from being on their phones until 2am – not by choice, but because the design made stopping genuinely difficult."</w:t>
-      </w:r>
-    </w:p>
-    <w:p>
-      <w:pPr>
-        <w:spacing w:after="40" w:before="120" w:line="276" w:lineRule="auto"/>
+        <w:spacing w:after="80" w:before="30" w:line="276" w:lineRule="auto"/>
+        <w:jc w:val="both"/>
+      </w:pPr>
+      <w:r>
+        <w:rPr>
+          <w:rFonts w:ascii="Arial" w:cs="Arial" w:eastAsia="Arial" w:hAnsi="Arial"/>
+          <w:sz w:val="24"/>
+          <w:szCs w:val="24"/>
+        </w:rPr>
+        <w:t xml:space="preserve">"When I saw students arriving at school exhausted from being on their phones until 2am, not by choice but because the design made stopping genuinely difficult, I overhauled parts of my curriculum."</w:t>
+      </w:r>
+    </w:p>
+    <w:p>
+      <w:pPr>
+        <w:spacing w:after="30" w:before="100" w:line="276" w:lineRule="auto"/>
       </w:pPr>
       <w:r>
         <w:rPr>
@@ -2141,21 +2055,21 @@
     </w:p>
     <w:p>
       <w:pPr>
-        <w:spacing w:after="80" w:before="40" w:line="276" w:lineRule="auto"/>
-        <w:jc w:val="both"/>
-      </w:pPr>
-      <w:r>
-        <w:rPr>
-          <w:rFonts w:ascii="Arial" w:cs="Arial" w:eastAsia="Arial" w:hAnsi="Arial"/>
-          <w:sz w:val="24"/>
-          <w:szCs w:val="24"/>
-        </w:rPr>
-        <w:t xml:space="preserve">"I redesigned parts of my curriculum to include digital self-defence – understanding algorithms, recognising persuasive design, and building habits to protect your own attention."</w:t>
-      </w:r>
-    </w:p>
-    <w:p>
-      <w:pPr>
-        <w:spacing w:after="40" w:before="120" w:line="276" w:lineRule="auto"/>
+        <w:spacing w:after="80" w:before="30" w:line="276" w:lineRule="auto"/>
+        <w:jc w:val="both"/>
+      </w:pPr>
+      <w:r>
+        <w:rPr>
+          <w:rFonts w:ascii="Arial" w:cs="Arial" w:eastAsia="Arial" w:hAnsi="Arial"/>
+          <w:sz w:val="24"/>
+          <w:szCs w:val="24"/>
+        </w:rPr>
+        <w:t xml:space="preserve">"I redesigned lessons to include digital self-defence: understanding algorithms, recognising persuasive design, and building habits that protect your attention."</w:t>
+      </w:r>
+    </w:p>
+    <w:p>
+      <w:pPr>
+        <w:spacing w:after="30" w:before="100" w:line="276" w:lineRule="auto"/>
       </w:pPr>
       <w:r>
         <w:rPr>
@@ -2170,21 +2084,21 @@
     </w:p>
     <w:p>
       <w:pPr>
-        <w:spacing w:after="80" w:before="40" w:line="276" w:lineRule="auto"/>
-        <w:jc w:val="both"/>
-      </w:pPr>
-      <w:r>
-        <w:rPr>
-          <w:rFonts w:ascii="Arial" w:cs="Arial" w:eastAsia="Arial" w:hAnsi="Arial"/>
-          <w:sz w:val="24"/>
-          <w:szCs w:val="24"/>
-        </w:rPr>
-        <w:t xml:space="preserve">"Ethical is transparent design where the user's interest genuinely comes first. Unethical is deliberately building features you know will cause harm because they increase your profit margin."</w:t>
-      </w:r>
-    </w:p>
-    <w:p>
-      <w:pPr>
-        <w:spacing w:after="40" w:before="120" w:line="276" w:lineRule="auto"/>
+        <w:spacing w:after="80" w:before="30" w:line="276" w:lineRule="auto"/>
+        <w:jc w:val="both"/>
+      </w:pPr>
+      <w:r>
+        <w:rPr>
+          <w:rFonts w:ascii="Arial" w:cs="Arial" w:eastAsia="Arial" w:hAnsi="Arial"/>
+          <w:sz w:val="24"/>
+          <w:szCs w:val="24"/>
+        </w:rPr>
+        <w:t xml:space="preserve">"Ethical design puts the user's interest first. Unethical is building features you know cause harm because they increase your profit margin."</w:t>
+      </w:r>
+    </w:p>
+    <w:p>
+      <w:pPr>
+        <w:spacing w:after="30" w:before="100" w:line="276" w:lineRule="auto"/>
       </w:pPr>
       <w:r>
         <w:rPr>
@@ -2199,21 +2113,21 @@
     </w:p>
     <w:p>
       <w:pPr>
-        <w:spacing w:after="80" w:before="40" w:line="276" w:lineRule="auto"/>
-        <w:jc w:val="both"/>
-      </w:pPr>
-      <w:r>
-        <w:rPr>
-          <w:rFonts w:ascii="Arial" w:cs="Arial" w:eastAsia="Arial" w:hAnsi="Arial"/>
-          <w:sz w:val="24"/>
-          <w:szCs w:val="24"/>
-        </w:rPr>
-        <w:t xml:space="preserve">"Not really. There's a vague sense that too much screen time is bad, but very few people understand the specific mechanisms – variable rewards, infinite scroll, algorithmically amplified emotional content."</w:t>
-      </w:r>
-    </w:p>
-    <w:p>
-      <w:pPr>
-        <w:spacing w:after="40" w:before="120" w:line="276" w:lineRule="auto"/>
+        <w:spacing w:after="80" w:before="30" w:line="276" w:lineRule="auto"/>
+        <w:jc w:val="both"/>
+      </w:pPr>
+      <w:r>
+        <w:rPr>
+          <w:rFonts w:ascii="Arial" w:cs="Arial" w:eastAsia="Arial" w:hAnsi="Arial"/>
+          <w:sz w:val="24"/>
+          <w:szCs w:val="24"/>
+        </w:rPr>
+        <w:t xml:space="preserve">"There is a vague sense that screens are bad, but almost no understanding of the specific mechanisms – variable rewards, infinite scroll, algorithmically amplified emotional content."</w:t>
+      </w:r>
+    </w:p>
+    <w:p>
+      <w:pPr>
+        <w:spacing w:after="30" w:before="100" w:line="276" w:lineRule="auto"/>
       </w:pPr>
       <w:r>
         <w:rPr>
@@ -2228,21 +2142,21 @@
     </w:p>
     <w:p>
       <w:pPr>
-        <w:spacing w:after="80" w:before="40" w:line="276" w:lineRule="auto"/>
-        <w:jc w:val="both"/>
-      </w:pPr>
-      <w:r>
-        <w:rPr>
-          <w:rFonts w:ascii="Arial" w:cs="Arial" w:eastAsia="Arial" w:hAnsi="Arial"/>
-          <w:sz w:val="24"/>
-          <w:szCs w:val="24"/>
-        </w:rPr>
-        <w:t xml:space="preserve">"'It's free, you don't have to use it.' But this ignores power dynamics. When everyone you know is on a platform and social life is conducted there, opting out carries a heavy social cost."</w:t>
-      </w:r>
-    </w:p>
-    <w:p>
-      <w:pPr>
-        <w:spacing w:after="40" w:before="120" w:line="276" w:lineRule="auto"/>
+        <w:spacing w:after="80" w:before="30" w:line="276" w:lineRule="auto"/>
+        <w:jc w:val="both"/>
+      </w:pPr>
+      <w:r>
+        <w:rPr>
+          <w:rFonts w:ascii="Arial" w:cs="Arial" w:eastAsia="Arial" w:hAnsi="Arial"/>
+          <w:sz w:val="24"/>
+          <w:szCs w:val="24"/>
+        </w:rPr>
+        <w:t xml:space="preserve">"'It's free.' But when all social life is conducted on a platform, opting out carries a heavy social cost. That is not meaningful freedom."</w:t>
+      </w:r>
+    </w:p>
+    <w:p>
+      <w:pPr>
+        <w:spacing w:after="30" w:before="100" w:line="276" w:lineRule="auto"/>
       </w:pPr>
       <w:r>
         <w:rPr>
@@ -2257,21 +2171,21 @@
     </w:p>
     <w:p>
       <w:pPr>
-        <w:spacing w:after="80" w:before="40" w:line="276" w:lineRule="auto"/>
-        <w:jc w:val="both"/>
-      </w:pPr>
-      <w:r>
-        <w:rPr>
-          <w:rFonts w:ascii="Arial" w:cs="Arial" w:eastAsia="Arial" w:hAnsi="Arial"/>
-          <w:sz w:val="24"/>
-          <w:szCs w:val="24"/>
-        </w:rPr>
-        <w:t xml:space="preserve">"Not at all. The information asymmetry is enormous. Platform companies have teams of psychologists and behavioural engineers maximising time on app. The individual user is completely outmatched."</w:t>
-      </w:r>
-    </w:p>
-    <w:p>
-      <w:pPr>
-        <w:spacing w:after="40" w:before="120" w:line="276" w:lineRule="auto"/>
+        <w:spacing w:after="80" w:before="30" w:line="276" w:lineRule="auto"/>
+        <w:jc w:val="both"/>
+      </w:pPr>
+      <w:r>
+        <w:rPr>
+          <w:rFonts w:ascii="Arial" w:cs="Arial" w:eastAsia="Arial" w:hAnsi="Arial"/>
+          <w:sz w:val="24"/>
+          <w:szCs w:val="24"/>
+        </w:rPr>
+        <w:t xml:space="preserve">"Not at all. Platform companies have teams of behavioural engineers maximising time on app. Individual users are completely outmatched."</w:t>
+      </w:r>
+    </w:p>
+    <w:p>
+      <w:pPr>
+        <w:spacing w:after="30" w:before="100" w:line="276" w:lineRule="auto"/>
       </w:pPr>
       <w:r>
         <w:rPr>
@@ -2286,21 +2200,21 @@
     </w:p>
     <w:p>
       <w:pPr>
-        <w:spacing w:after="80" w:before="40" w:line="276" w:lineRule="auto"/>
-        <w:jc w:val="both"/>
-      </w:pPr>
-      <w:r>
-        <w:rPr>
-          <w:rFonts w:ascii="Arial" w:cs="Arial" w:eastAsia="Arial" w:hAnsi="Arial"/>
-          <w:sz w:val="24"/>
-          <w:szCs w:val="24"/>
-        </w:rPr>
-        <w:t xml:space="preserve">"Tech companies must take primary responsibility. Government must regulate. Schools must educate. Parents must engage. It is a collective responsibility with corporate accountability at its core."</w:t>
-      </w:r>
-    </w:p>
-    <w:p>
-      <w:pPr>
-        <w:spacing w:after="40" w:before="120" w:line="276" w:lineRule="auto"/>
+        <w:spacing w:after="80" w:before="30" w:line="276" w:lineRule="auto"/>
+        <w:jc w:val="both"/>
+      </w:pPr>
+      <w:r>
+        <w:rPr>
+          <w:rFonts w:ascii="Arial" w:cs="Arial" w:eastAsia="Arial" w:hAnsi="Arial"/>
+          <w:sz w:val="24"/>
+          <w:szCs w:val="24"/>
+        </w:rPr>
+        <w:t xml:space="preserve">"Tech companies must bear primary responsibility. Government must regulate. Schools must educate. It is collective, but corporate accountability must be at its core."</w:t>
+      </w:r>
+    </w:p>
+    <w:p>
+      <w:pPr>
+        <w:spacing w:after="30" w:before="100" w:line="276" w:lineRule="auto"/>
       </w:pPr>
       <w:r>
         <w:rPr>
@@ -2315,21 +2229,21 @@
     </w:p>
     <w:p>
       <w:pPr>
-        <w:spacing w:after="80" w:before="40" w:line="276" w:lineRule="auto"/>
-        <w:jc w:val="both"/>
-      </w:pPr>
-      <w:r>
-        <w:rPr>
-          <w:rFonts w:ascii="Arial" w:cs="Arial" w:eastAsia="Arial" w:hAnsi="Arial"/>
-          <w:sz w:val="24"/>
-          <w:szCs w:val="24"/>
-        </w:rPr>
-        <w:t xml:space="preserve">"Algorithm transparency – showing users why they are seeing specific content and giving them meaningful control. Default settings for minors that prioritise wellbeing over engagement."</w:t>
-      </w:r>
-    </w:p>
-    <w:p>
-      <w:pPr>
-        <w:spacing w:after="40" w:before="120" w:line="276" w:lineRule="auto"/>
+        <w:spacing w:after="80" w:before="30" w:line="276" w:lineRule="auto"/>
+        <w:jc w:val="both"/>
+      </w:pPr>
+      <w:r>
+        <w:rPr>
+          <w:rFonts w:ascii="Arial" w:cs="Arial" w:eastAsia="Arial" w:hAnsi="Arial"/>
+          <w:sz w:val="24"/>
+          <w:szCs w:val="24"/>
+        </w:rPr>
+        <w:t xml:space="preserve">"Algorithm transparency and meaningful control – users should be able to see why they are seeing specific content and turn off algorithmic curation."</w:t>
+      </w:r>
+    </w:p>
+    <w:p>
+      <w:pPr>
+        <w:spacing w:after="30" w:before="100" w:line="276" w:lineRule="auto"/>
       </w:pPr>
       <w:r>
         <w:rPr>
@@ -2344,21 +2258,21 @@
     </w:p>
     <w:p>
       <w:pPr>
-        <w:spacing w:after="80" w:before="40" w:line="276" w:lineRule="auto"/>
-        <w:jc w:val="both"/>
-      </w:pPr>
-      <w:r>
-        <w:rPr>
-          <w:rFonts w:ascii="Arial" w:cs="Arial" w:eastAsia="Arial" w:hAnsi="Arial"/>
-          <w:sz w:val="24"/>
-          <w:szCs w:val="24"/>
-        </w:rPr>
-        <w:t xml:space="preserve">"The most important skill we need to teach today is not coding. It is critical thinking about technology itself: who built this, why, and what do they want from me?"</w:t>
-      </w:r>
-    </w:p>
-    <w:p>
-      <w:pPr>
-        <w:spacing w:after="40" w:before="120" w:line="276" w:lineRule="auto"/>
+        <w:spacing w:after="80" w:before="30" w:line="276" w:lineRule="auto"/>
+        <w:jc w:val="both"/>
+      </w:pPr>
+      <w:r>
+        <w:rPr>
+          <w:rFonts w:ascii="Arial" w:cs="Arial" w:eastAsia="Arial" w:hAnsi="Arial"/>
+          <w:sz w:val="24"/>
+          <w:szCs w:val="24"/>
+        </w:rPr>
+        <w:t xml:space="preserve">"The most important skill today is not coding. It is critical thinking about technology: who built this, why, and what do they want from me?"</w:t>
+      </w:r>
+    </w:p>
+    <w:p>
+      <w:pPr>
+        <w:spacing w:after="30" w:before="100" w:line="276" w:lineRule="auto"/>
       </w:pPr>
       <w:r>
         <w:rPr>
@@ -2373,21 +2287,21 @@
     </w:p>
     <w:p>
       <w:pPr>
-        <w:spacing w:after="80" w:before="40" w:line="276" w:lineRule="auto"/>
-        <w:jc w:val="both"/>
-      </w:pPr>
-      <w:r>
-        <w:rPr>
-          <w:rFonts w:ascii="Arial" w:cs="Arial" w:eastAsia="Arial" w:hAnsi="Arial"/>
-          <w:sz w:val="24"/>
-          <w:szCs w:val="24"/>
-        </w:rPr>
-        <w:t xml:space="preserve">"Significant attention fragmentation. Many students struggle to read for more than a few minutes. The capacity for sustained, deep focus is being genuinely eroded."</w:t>
-      </w:r>
-    </w:p>
-    <w:p>
-      <w:pPr>
-        <w:spacing w:after="40" w:before="120" w:line="276" w:lineRule="auto"/>
+        <w:spacing w:after="80" w:before="30" w:line="276" w:lineRule="auto"/>
+        <w:jc w:val="both"/>
+      </w:pPr>
+      <w:r>
+        <w:rPr>
+          <w:rFonts w:ascii="Arial" w:cs="Arial" w:eastAsia="Arial" w:hAnsi="Arial"/>
+          <w:sz w:val="24"/>
+          <w:szCs w:val="24"/>
+        </w:rPr>
+        <w:t xml:space="preserve">"Significant attention fragmentation. Many students cannot sustain focused reading for more than a few minutes."</w:t>
+      </w:r>
+    </w:p>
+    <w:p>
+      <w:pPr>
+        <w:spacing w:after="30" w:before="100" w:line="276" w:lineRule="auto"/>
       </w:pPr>
       <w:r>
         <w:rPr>
@@ -2402,21 +2316,21 @@
     </w:p>
     <w:p>
       <w:pPr>
-        <w:spacing w:after="80" w:before="40" w:line="276" w:lineRule="auto"/>
-        <w:jc w:val="both"/>
-      </w:pPr>
-      <w:r>
-        <w:rPr>
-          <w:rFonts w:ascii="Arial" w:cs="Arial" w:eastAsia="Arial" w:hAnsi="Arial"/>
-          <w:sz w:val="24"/>
-          <w:szCs w:val="24"/>
-        </w:rPr>
-        <w:t xml:space="preserve">"Yes – and internal company documents confirm they know it. The leaked Meta research showed harm was identified and ignored. That is a clear breach of duty of care."</w:t>
-      </w:r>
-    </w:p>
-    <w:p>
-      <w:pPr>
-        <w:spacing w:after="40" w:before="120" w:line="276" w:lineRule="auto"/>
+        <w:spacing w:after="80" w:before="30" w:line="276" w:lineRule="auto"/>
+        <w:jc w:val="both"/>
+      </w:pPr>
+      <w:r>
+        <w:rPr>
+          <w:rFonts w:ascii="Arial" w:cs="Arial" w:eastAsia="Arial" w:hAnsi="Arial"/>
+          <w:sz w:val="24"/>
+          <w:szCs w:val="24"/>
+        </w:rPr>
+        <w:t xml:space="preserve">"Yes – and internal documents confirm they know it. The leaked Meta research showed harm was identified and ignored."</w:t>
+      </w:r>
+    </w:p>
+    <w:p>
+      <w:pPr>
+        <w:spacing w:after="30" w:before="100" w:line="276" w:lineRule="auto"/>
       </w:pPr>
       <w:r>
         <w:rPr>
@@ -2431,21 +2345,21 @@
     </w:p>
     <w:p>
       <w:pPr>
-        <w:spacing w:after="80" w:before="40" w:line="276" w:lineRule="auto"/>
-        <w:jc w:val="both"/>
-      </w:pPr>
-      <w:r>
-        <w:rPr>
-          <w:rFonts w:ascii="Arial" w:cs="Arial" w:eastAsia="Arial" w:hAnsi="Arial"/>
-          <w:sz w:val="24"/>
-          <w:szCs w:val="24"/>
-        </w:rPr>
-        <w:t xml:space="preserve">"Media literacy should be taught with the same seriousness as numeracy. It is that fundamental to functioning in the modern world."</w:t>
-      </w:r>
-    </w:p>
-    <w:p>
-      <w:pPr>
-        <w:spacing w:after="40" w:before="120" w:line="276" w:lineRule="auto"/>
+        <w:spacing w:after="80" w:before="30" w:line="276" w:lineRule="auto"/>
+        <w:jc w:val="both"/>
+      </w:pPr>
+      <w:r>
+        <w:rPr>
+          <w:rFonts w:ascii="Arial" w:cs="Arial" w:eastAsia="Arial" w:hAnsi="Arial"/>
+          <w:sz w:val="24"/>
+          <w:szCs w:val="24"/>
+        </w:rPr>
+        <w:t xml:space="preserve">"Media literacy should be taught with the same seriousness as numeracy. It is that fundamental."</w:t>
+      </w:r>
+    </w:p>
+    <w:p>
+      <w:pPr>
+        <w:spacing w:after="30" w:before="100" w:line="276" w:lineRule="auto"/>
       </w:pPr>
       <w:r>
         <w:rPr>
@@ -2460,21 +2374,21 @@
     </w:p>
     <w:p>
       <w:pPr>
-        <w:spacing w:after="80" w:before="40" w:line="276" w:lineRule="auto"/>
-        <w:jc w:val="both"/>
-      </w:pPr>
-      <w:r>
-        <w:rPr>
-          <w:rFonts w:ascii="Arial" w:cs="Arial" w:eastAsia="Arial" w:hAnsi="Arial"/>
-          <w:sz w:val="24"/>
-          <w:szCs w:val="24"/>
-        </w:rPr>
-        <w:t xml:space="preserve">"Yes. POPIA is a start on data privacy but we need specific legislation targeting persuasive design aimed at minors."</w:t>
-      </w:r>
-    </w:p>
-    <w:p>
-      <w:pPr>
-        <w:spacing w:after="40" w:before="120" w:line="276" w:lineRule="auto"/>
+        <w:spacing w:after="80" w:before="30" w:line="276" w:lineRule="auto"/>
+        <w:jc w:val="both"/>
+      </w:pPr>
+      <w:r>
+        <w:rPr>
+          <w:rFonts w:ascii="Arial" w:cs="Arial" w:eastAsia="Arial" w:hAnsi="Arial"/>
+          <w:sz w:val="24"/>
+          <w:szCs w:val="24"/>
+        </w:rPr>
+        <w:t xml:space="preserve">"Yes. POPIA addresses data privacy but we need specific legislation targeting persuasive design aimed at minors."</w:t>
+      </w:r>
+    </w:p>
+    <w:p>
+      <w:pPr>
+        <w:spacing w:after="30" w:before="100" w:line="276" w:lineRule="auto"/>
       </w:pPr>
       <w:r>
         <w:rPr>
@@ -2489,16 +2403,16 @@
     </w:p>
     <w:p>
       <w:pPr>
-        <w:spacing w:after="80" w:before="40" w:line="276" w:lineRule="auto"/>
-        <w:jc w:val="both"/>
-      </w:pPr>
-      <w:r>
-        <w:rPr>
-          <w:rFonts w:ascii="Arial" w:cs="Arial" w:eastAsia="Arial" w:hAnsi="Arial"/>
-          <w:sz w:val="24"/>
-          <w:szCs w:val="24"/>
-        </w:rPr>
-        <w:t xml:space="preserve">"Remove algorithmic amplification. Let users see posts in chronological order from accounts they chose to follow. Most of the harm flows from the algorithm pushing extreme content."</w:t>
+        <w:spacing w:after="80" w:before="30" w:line="276" w:lineRule="auto"/>
+        <w:jc w:val="both"/>
+      </w:pPr>
+      <w:r>
+        <w:rPr>
+          <w:rFonts w:ascii="Arial" w:cs="Arial" w:eastAsia="Arial" w:hAnsi="Arial"/>
+          <w:sz w:val="24"/>
+          <w:szCs w:val="24"/>
+        </w:rPr>
+        <w:t xml:space="preserve">"Remove algorithmic amplification. Let users see posts chronologically from accounts they chose to follow. Most of the harm flows from the algorithm."</w:t>
       </w:r>
     </w:p>
     <w:p>
@@ -2517,14 +2431,13 @@
     <w:p>
       <w:pPr>
         <w:pStyle w:val="Heading2"/>
-        <w:spacing w:after="120" w:before="240"/>
-      </w:pPr>
-      <w:r>
-        <w:rPr>
-          <w:rFonts w:ascii="Arial" w:cs="Arial" w:eastAsia="Arial" w:hAnsi="Arial"/>
-          <w:b/>
-          <w:bCs/>
-          <w:color w:val="2E4057"/>
+        <w:spacing w:after="100" w:before="240"/>
+      </w:pPr>
+      <w:r>
+        <w:rPr>
+          <w:rFonts w:ascii="Arial" w:cs="Arial" w:eastAsia="Arial" w:hAnsi="Arial"/>
+          <w:b/>
+          <w:bCs/>
           <w:sz w:val="24"/>
           <w:szCs w:val="24"/>
         </w:rPr>
@@ -2546,7 +2459,7 @@
           <w:rFonts w:ascii="Arial" w:cs="Arial" w:eastAsia="Arial" w:hAnsi="Arial"/>
           <w:i/>
           <w:iCs/>
-          <w:color w:val="888888"/>
+          <w:color w:val="666666"/>
           <w:sz w:val="20"/>
           <w:szCs w:val="20"/>
         </w:rPr>
@@ -2555,7 +2468,7 @@
     </w:p>
     <w:p>
       <w:pPr>
-        <w:spacing w:after="60" w:before="80"/>
+        <w:spacing w:after="50" w:before="80"/>
       </w:pPr>
       <w:r>
         <w:rPr>
@@ -2578,7 +2491,7 @@
     </w:p>
     <w:p>
       <w:pPr>
-        <w:spacing w:after="60" w:before="40"/>
+        <w:spacing w:after="50" w:before="0"/>
       </w:pPr>
       <w:r>
         <w:rPr>
@@ -2601,7 +2514,7 @@
     </w:p>
     <w:p>
       <w:pPr>
-        <w:spacing w:after="120" w:before="40"/>
+        <w:spacing w:after="120" w:before="0"/>
       </w:pPr>
       <w:r>
         <w:rPr>
@@ -2624,7 +2537,7 @@
     </w:p>
     <w:p>
       <w:pPr>
-        <w:spacing w:after="40" w:before="120" w:line="276" w:lineRule="auto"/>
+        <w:spacing w:after="30" w:before="100" w:line="276" w:lineRule="auto"/>
       </w:pPr>
       <w:r>
         <w:rPr>
@@ -2639,21 +2552,21 @@
     </w:p>
     <w:p>
       <w:pPr>
-        <w:spacing w:after="80" w:before="40" w:line="276" w:lineRule="auto"/>
-        <w:jc w:val="both"/>
-      </w:pPr>
-      <w:r>
-        <w:rPr>
-          <w:rFonts w:ascii="Arial" w:cs="Arial" w:eastAsia="Arial" w:hAnsi="Arial"/>
-          <w:sz w:val="24"/>
-          <w:szCs w:val="24"/>
-        </w:rPr>
-        <w:t xml:space="preserve">"The amount of time my children spend on their phones and the effect it has on their moods and our family relationships. It is a constant source of tension."</w:t>
-      </w:r>
-    </w:p>
-    <w:p>
-      <w:pPr>
-        <w:spacing w:after="40" w:before="120" w:line="276" w:lineRule="auto"/>
+        <w:spacing w:after="80" w:before="30" w:line="276" w:lineRule="auto"/>
+        <w:jc w:val="both"/>
+      </w:pPr>
+      <w:r>
+        <w:rPr>
+          <w:rFonts w:ascii="Arial" w:cs="Arial" w:eastAsia="Arial" w:hAnsi="Arial"/>
+          <w:sz w:val="24"/>
+          <w:szCs w:val="24"/>
+        </w:rPr>
+        <w:t xml:space="preserve">"The time my children spend on their phones and the direct effect on their moods and our family relationships."</w:t>
+      </w:r>
+    </w:p>
+    <w:p>
+      <w:pPr>
+        <w:spacing w:after="30" w:before="100" w:line="276" w:lineRule="auto"/>
       </w:pPr>
       <w:r>
         <w:rPr>
@@ -2668,21 +2581,21 @@
     </w:p>
     <w:p>
       <w:pPr>
-        <w:spacing w:after="80" w:before="40" w:line="276" w:lineRule="auto"/>
-        <w:jc w:val="both"/>
-      </w:pPr>
-      <w:r>
-        <w:rPr>
-          <w:rFonts w:ascii="Arial" w:cs="Arial" w:eastAsia="Arial" w:hAnsi="Arial"/>
-          <w:sz w:val="24"/>
-          <w:szCs w:val="24"/>
-        </w:rPr>
-        <w:t xml:space="preserve">"My daughter went through a period of very low self-esteem that I eventually traced back to time spent on Instagram comparing herself to influencers. My son was staying up until 1 or 2am on TikTok even on school nights."</w:t>
-      </w:r>
-    </w:p>
-    <w:p>
-      <w:pPr>
-        <w:spacing w:after="40" w:before="120" w:line="276" w:lineRule="auto"/>
+        <w:spacing w:after="80" w:before="30" w:line="276" w:lineRule="auto"/>
+        <w:jc w:val="both"/>
+      </w:pPr>
+      <w:r>
+        <w:rPr>
+          <w:rFonts w:ascii="Arial" w:cs="Arial" w:eastAsia="Arial" w:hAnsi="Arial"/>
+          <w:sz w:val="24"/>
+          <w:szCs w:val="24"/>
+        </w:rPr>
+        <w:t xml:space="preserve">"My daughter went through a period of low self-esteem I traced back to Instagram. My son was staying up until 2am on TikTok on school nights."</w:t>
+      </w:r>
+    </w:p>
+    <w:p>
+      <w:pPr>
+        <w:spacing w:after="30" w:before="100" w:line="276" w:lineRule="auto"/>
       </w:pPr>
       <w:r>
         <w:rPr>
@@ -2697,21 +2610,21 @@
     </w:p>
     <w:p>
       <w:pPr>
-        <w:spacing w:after="80" w:before="40" w:line="276" w:lineRule="auto"/>
-        <w:jc w:val="both"/>
-      </w:pPr>
-      <w:r>
-        <w:rPr>
-          <w:rFonts w:ascii="Arial" w:cs="Arial" w:eastAsia="Arial" w:hAnsi="Arial"/>
-          <w:sz w:val="24"/>
-          <w:szCs w:val="24"/>
-        </w:rPr>
-        <w:t xml:space="preserve">"We established phone-free times – no devices at dinner, phones charged in the kitchen at night. It helped, but it was a fight to put in place. The apps genuinely make it very difficult to stop."</w:t>
-      </w:r>
-    </w:p>
-    <w:p>
-      <w:pPr>
-        <w:spacing w:after="40" w:before="120" w:line="276" w:lineRule="auto"/>
+        <w:spacing w:after="80" w:before="30" w:line="276" w:lineRule="auto"/>
+        <w:jc w:val="both"/>
+      </w:pPr>
+      <w:r>
+        <w:rPr>
+          <w:rFonts w:ascii="Arial" w:cs="Arial" w:eastAsia="Arial" w:hAnsi="Arial"/>
+          <w:sz w:val="24"/>
+          <w:szCs w:val="24"/>
+        </w:rPr>
+        <w:t xml:space="preserve">"We put in place phone-free times – no devices at dinner, phones charged in the kitchen overnight. It helped, but it required a real fight against apps engineered to resist that."</w:t>
+      </w:r>
+    </w:p>
+    <w:p>
+      <w:pPr>
+        <w:spacing w:after="30" w:before="100" w:line="276" w:lineRule="auto"/>
       </w:pPr>
       <w:r>
         <w:rPr>
@@ -2726,21 +2639,21 @@
     </w:p>
     <w:p>
       <w:pPr>
-        <w:spacing w:after="80" w:before="40" w:line="276" w:lineRule="auto"/>
-        <w:jc w:val="both"/>
-      </w:pPr>
-      <w:r>
-        <w:rPr>
-          <w:rFonts w:ascii="Arial" w:cs="Arial" w:eastAsia="Arial" w:hAnsi="Arial"/>
-          <w:sz w:val="24"/>
-          <w:szCs w:val="24"/>
-        </w:rPr>
-        <w:t xml:space="preserve">"If a company knows its product is harming children and does not change it, that is wrong. It does not require a philosophy degree to see that."</w:t>
-      </w:r>
-    </w:p>
-    <w:p>
-      <w:pPr>
-        <w:spacing w:after="40" w:before="120" w:line="276" w:lineRule="auto"/>
+        <w:spacing w:after="80" w:before="30" w:line="276" w:lineRule="auto"/>
+        <w:jc w:val="both"/>
+      </w:pPr>
+      <w:r>
+        <w:rPr>
+          <w:rFonts w:ascii="Arial" w:cs="Arial" w:eastAsia="Arial" w:hAnsi="Arial"/>
+          <w:sz w:val="24"/>
+          <w:szCs w:val="24"/>
+        </w:rPr>
+        <w:t xml:space="preserve">"If you know your product harms children and do not change it, that is wrong. No philosophy degree required."</w:t>
+      </w:r>
+    </w:p>
+    <w:p>
+      <w:pPr>
+        <w:spacing w:after="30" w:before="100" w:line="276" w:lineRule="auto"/>
       </w:pPr>
       <w:r>
         <w:rPr>
@@ -2755,21 +2668,21 @@
     </w:p>
     <w:p>
       <w:pPr>
-        <w:spacing w:after="80" w:before="40" w:line="276" w:lineRule="auto"/>
-        <w:jc w:val="both"/>
-      </w:pPr>
-      <w:r>
-        <w:rPr>
-          <w:rFonts w:ascii="Arial" w:cs="Arial" w:eastAsia="Arial" w:hAnsi="Arial"/>
-          <w:sz w:val="24"/>
-          <w:szCs w:val="24"/>
-        </w:rPr>
-        <w:t xml:space="preserve">"Before I read about the attention economy I thought my children simply lacked self-discipline. Learning how these apps are engineered changed my perspective entirely."</w:t>
-      </w:r>
-    </w:p>
-    <w:p>
-      <w:pPr>
-        <w:spacing w:after="40" w:before="120" w:line="276" w:lineRule="auto"/>
+        <w:spacing w:after="80" w:before="30" w:line="276" w:lineRule="auto"/>
+        <w:jc w:val="both"/>
+      </w:pPr>
+      <w:r>
+        <w:rPr>
+          <w:rFonts w:ascii="Arial" w:cs="Arial" w:eastAsia="Arial" w:hAnsi="Arial"/>
+          <w:sz w:val="24"/>
+          <w:szCs w:val="24"/>
+        </w:rPr>
+        <w:t xml:space="preserve">"Before I understood the attention economy I blamed my children's self-discipline. Understanding the engineering changed my view entirely."</w:t>
+      </w:r>
+    </w:p>
+    <w:p>
+      <w:pPr>
+        <w:spacing w:after="30" w:before="100" w:line="276" w:lineRule="auto"/>
       </w:pPr>
       <w:r>
         <w:rPr>
@@ -2784,21 +2697,21 @@
     </w:p>
     <w:p>
       <w:pPr>
-        <w:spacing w:after="80" w:before="40" w:line="276" w:lineRule="auto"/>
-        <w:jc w:val="both"/>
-      </w:pPr>
-      <w:r>
-        <w:rPr>
-          <w:rFonts w:ascii="Arial" w:cs="Arial" w:eastAsia="Arial" w:hAnsi="Arial"/>
-          <w:sz w:val="24"/>
-          <w:szCs w:val="24"/>
-        </w:rPr>
-        <w:t xml:space="preserve">"Everyone uses it. It's how kids socialise today. There is also real peer pressure – if your child is the only one without access, they feel excluded. The companies benefit from this."</w:t>
-      </w:r>
-    </w:p>
-    <w:p>
-      <w:pPr>
-        <w:spacing w:after="40" w:before="120" w:line="276" w:lineRule="auto"/>
+        <w:spacing w:after="80" w:before="30" w:line="276" w:lineRule="auto"/>
+        <w:jc w:val="both"/>
+      </w:pPr>
+      <w:r>
+        <w:rPr>
+          <w:rFonts w:ascii="Arial" w:cs="Arial" w:eastAsia="Arial" w:hAnsi="Arial"/>
+          <w:sz w:val="24"/>
+          <w:szCs w:val="24"/>
+        </w:rPr>
+        <w:t xml:space="preserve">"'Everyone else uses it.' There is genuine peer pressure – if your child is the only one without access, they feel excluded. The companies rely on this."</w:t>
+      </w:r>
+    </w:p>
+    <w:p>
+      <w:pPr>
+        <w:spacing w:after="30" w:before="100" w:line="276" w:lineRule="auto"/>
       </w:pPr>
       <w:r>
         <w:rPr>
@@ -2813,21 +2726,21 @@
     </w:p>
     <w:p>
       <w:pPr>
-        <w:spacing w:after="80" w:before="40" w:line="276" w:lineRule="auto"/>
-        <w:jc w:val="both"/>
-      </w:pPr>
-      <w:r>
-        <w:rPr>
-          <w:rFonts w:ascii="Arial" w:cs="Arial" w:eastAsia="Arial" w:hAnsi="Arial"/>
-          <w:sz w:val="24"/>
-          <w:szCs w:val="24"/>
-        </w:rPr>
-        <w:t xml:space="preserve">"It is not. Parents are trying to protect their children but we are up against companies with billions of rands to spend on keeping those children engaged. The power balance is completely wrong."</w:t>
-      </w:r>
-    </w:p>
-    <w:p>
-      <w:pPr>
-        <w:spacing w:after="40" w:before="120" w:line="276" w:lineRule="auto"/>
+        <w:spacing w:after="80" w:before="30" w:line="276" w:lineRule="auto"/>
+        <w:jc w:val="both"/>
+      </w:pPr>
+      <w:r>
+        <w:rPr>
+          <w:rFonts w:ascii="Arial" w:cs="Arial" w:eastAsia="Arial" w:hAnsi="Arial"/>
+          <w:sz w:val="24"/>
+          <w:szCs w:val="24"/>
+        </w:rPr>
+        <w:t xml:space="preserve">"No. Parents are fighting to protect their children against companies spending billions to keep those children engaged."</w:t>
+      </w:r>
+    </w:p>
+    <w:p>
+      <w:pPr>
+        <w:spacing w:after="30" w:before="100" w:line="276" w:lineRule="auto"/>
       </w:pPr>
       <w:r>
         <w:rPr>
@@ -2842,21 +2755,21 @@
     </w:p>
     <w:p>
       <w:pPr>
-        <w:spacing w:after="80" w:before="40" w:line="276" w:lineRule="auto"/>
-        <w:jc w:val="both"/>
-      </w:pPr>
-      <w:r>
-        <w:rPr>
-          <w:rFonts w:ascii="Arial" w:cs="Arial" w:eastAsia="Arial" w:hAnsi="Arial"/>
-          <w:sz w:val="24"/>
-          <w:szCs w:val="24"/>
-        </w:rPr>
-        <w:t xml:space="preserve">"Companies must be held responsible first. But government needs to create binding rules because companies will not act voluntarily. Parents can do a great deal, but we cannot fight billion-rand design budgets alone."</w:t>
-      </w:r>
-    </w:p>
-    <w:p>
-      <w:pPr>
-        <w:spacing w:after="40" w:before="120" w:line="276" w:lineRule="auto"/>
+        <w:spacing w:after="80" w:before="30" w:line="276" w:lineRule="auto"/>
+        <w:jc w:val="both"/>
+      </w:pPr>
+      <w:r>
+        <w:rPr>
+          <w:rFonts w:ascii="Arial" w:cs="Arial" w:eastAsia="Arial" w:hAnsi="Arial"/>
+          <w:sz w:val="24"/>
+          <w:szCs w:val="24"/>
+        </w:rPr>
+        <w:t xml:space="preserve">"Companies first, then government through binding regulation. Parents can do a great deal, but we cannot fight billion-rand design budgets alone."</w:t>
+      </w:r>
+    </w:p>
+    <w:p>
+      <w:pPr>
+        <w:spacing w:after="30" w:before="100" w:line="276" w:lineRule="auto"/>
       </w:pPr>
       <w:r>
         <w:rPr>
@@ -2871,21 +2784,21 @@
     </w:p>
     <w:p>
       <w:pPr>
-        <w:spacing w:after="80" w:before="40" w:line="276" w:lineRule="auto"/>
-        <w:jc w:val="both"/>
-      </w:pPr>
-      <w:r>
-        <w:rPr>
-          <w:rFonts w:ascii="Arial" w:cs="Arial" w:eastAsia="Arial" w:hAnsi="Arial"/>
-          <w:sz w:val="24"/>
-          <w:szCs w:val="24"/>
-        </w:rPr>
-        <w:t xml:space="preserve">"An honest off switch. Apps that genuinely show how long you have been on them and default to stopping after an hour. And transparency with parents about what their children are actually exposed to."</w:t>
-      </w:r>
-    </w:p>
-    <w:p>
-      <w:pPr>
-        <w:spacing w:after="40" w:before="120" w:line="276" w:lineRule="auto"/>
+        <w:spacing w:after="80" w:before="30" w:line="276" w:lineRule="auto"/>
+        <w:jc w:val="both"/>
+      </w:pPr>
+      <w:r>
+        <w:rPr>
+          <w:rFonts w:ascii="Arial" w:cs="Arial" w:eastAsia="Arial" w:hAnsi="Arial"/>
+          <w:sz w:val="24"/>
+          <w:szCs w:val="24"/>
+        </w:rPr>
+        <w:t xml:space="preserve">"An honest off switch. Default stopping points after one hour. Transparency with parents about what their children are actually exposed to."</w:t>
+      </w:r>
+    </w:p>
+    <w:p>
+      <w:pPr>
+        <w:spacing w:after="30" w:before="100" w:line="276" w:lineRule="auto"/>
       </w:pPr>
       <w:r>
         <w:rPr>
@@ -2900,21 +2813,21 @@
     </w:p>
     <w:p>
       <w:pPr>
-        <w:spacing w:after="80" w:before="40" w:line="276" w:lineRule="auto"/>
-        <w:jc w:val="both"/>
-      </w:pPr>
-      <w:r>
-        <w:rPr>
-          <w:rFonts w:ascii="Arial" w:cs="Arial" w:eastAsia="Arial" w:hAnsi="Arial"/>
-          <w:sz w:val="24"/>
-          <w:szCs w:val="24"/>
-        </w:rPr>
-        <w:t xml:space="preserve">"I do not think these apps are inherently bad. Staying connected is good. But the design has crossed a line. There is a difference between a useful tool and a product built to exploit your child."</w:t>
-      </w:r>
-    </w:p>
-    <w:p>
-      <w:pPr>
-        <w:spacing w:after="40" w:before="120" w:line="276" w:lineRule="auto"/>
+        <w:spacing w:after="80" w:before="30" w:line="276" w:lineRule="auto"/>
+        <w:jc w:val="both"/>
+      </w:pPr>
+      <w:r>
+        <w:rPr>
+          <w:rFonts w:ascii="Arial" w:cs="Arial" w:eastAsia="Arial" w:hAnsi="Arial"/>
+          <w:sz w:val="24"/>
+          <w:szCs w:val="24"/>
+        </w:rPr>
+        <w:t xml:space="preserve">"These apps are not inherently bad. Connection is good. But there is a line between a useful tool and a product built to exploit your child, and it has been crossed."</w:t>
+      </w:r>
+    </w:p>
+    <w:p>
+      <w:pPr>
+        <w:spacing w:after="30" w:before="100" w:line="276" w:lineRule="auto"/>
       </w:pPr>
       <w:r>
         <w:rPr>
@@ -2929,21 +2842,21 @@
     </w:p>
     <w:p>
       <w:pPr>
-        <w:spacing w:after="80" w:before="40" w:line="276" w:lineRule="auto"/>
-        <w:jc w:val="both"/>
-      </w:pPr>
-      <w:r>
-        <w:rPr>
-          <w:rFonts w:ascii="Arial" w:cs="Arial" w:eastAsia="Arial" w:hAnsi="Arial"/>
-          <w:sz w:val="24"/>
-          <w:szCs w:val="24"/>
-        </w:rPr>
-        <w:t xml:space="preserve">"Moodiness, withdrawal, less interest in family activities. My daughter also became very self-conscious in a way she was not before."</w:t>
-      </w:r>
-    </w:p>
-    <w:p>
-      <w:pPr>
-        <w:spacing w:after="40" w:before="120" w:line="276" w:lineRule="auto"/>
+        <w:spacing w:after="80" w:before="30" w:line="276" w:lineRule="auto"/>
+        <w:jc w:val="both"/>
+      </w:pPr>
+      <w:r>
+        <w:rPr>
+          <w:rFonts w:ascii="Arial" w:cs="Arial" w:eastAsia="Arial" w:hAnsi="Arial"/>
+          <w:sz w:val="24"/>
+          <w:szCs w:val="24"/>
+        </w:rPr>
+        <w:t xml:space="preserve">"Moodiness, withdrawal, and reduced interest in family. My daughter became noticeably more self-conscious."</w:t>
+      </w:r>
+    </w:p>
+    <w:p>
+      <w:pPr>
+        <w:spacing w:after="30" w:before="100" w:line="276" w:lineRule="auto"/>
       </w:pPr>
       <w:r>
         <w:rPr>
@@ -2958,21 +2871,21 @@
     </w:p>
     <w:p>
       <w:pPr>
-        <w:spacing w:after="80" w:before="40" w:line="276" w:lineRule="auto"/>
-        <w:jc w:val="both"/>
-      </w:pPr>
-      <w:r>
-        <w:rPr>
-          <w:rFonts w:ascii="Arial" w:cs="Arial" w:eastAsia="Arial" w:hAnsi="Arial"/>
-          <w:sz w:val="24"/>
-          <w:szCs w:val="24"/>
-        </w:rPr>
-        <w:t xml:space="preserve">"Absolutely. They build products specifically marketed to teenagers. That comes with responsibility."</w:t>
-      </w:r>
-    </w:p>
-    <w:p>
-      <w:pPr>
-        <w:spacing w:after="40" w:before="120" w:line="276" w:lineRule="auto"/>
+        <w:spacing w:after="80" w:before="30" w:line="276" w:lineRule="auto"/>
+        <w:jc w:val="both"/>
+      </w:pPr>
+      <w:r>
+        <w:rPr>
+          <w:rFonts w:ascii="Arial" w:cs="Arial" w:eastAsia="Arial" w:hAnsi="Arial"/>
+          <w:sz w:val="24"/>
+          <w:szCs w:val="24"/>
+        </w:rPr>
+        <w:t xml:space="preserve">"Absolutely. If you market a product specifically to teenagers, you have a responsibility for what it does to them."</w:t>
+      </w:r>
+    </w:p>
+    <w:p>
+      <w:pPr>
+        <w:spacing w:after="30" w:before="100" w:line="276" w:lineRule="auto"/>
       </w:pPr>
       <w:r>
         <w:rPr>
@@ -2987,21 +2900,21 @@
     </w:p>
     <w:p>
       <w:pPr>
-        <w:spacing w:after="80" w:before="40" w:line="276" w:lineRule="auto"/>
-        <w:jc w:val="both"/>
-      </w:pPr>
-      <w:r>
-        <w:rPr>
-          <w:rFonts w:ascii="Arial" w:cs="Arial" w:eastAsia="Arial" w:hAnsi="Arial"/>
-          <w:sz w:val="24"/>
-          <w:szCs w:val="24"/>
-        </w:rPr>
-        <w:t xml:space="preserve">"Schools should be talking about this. My children have never received any education about how social media actually works."</w:t>
-      </w:r>
-    </w:p>
-    <w:p>
-      <w:pPr>
-        <w:spacing w:after="40" w:before="120" w:line="276" w:lineRule="auto"/>
+        <w:spacing w:after="80" w:before="30" w:line="276" w:lineRule="auto"/>
+        <w:jc w:val="both"/>
+      </w:pPr>
+      <w:r>
+        <w:rPr>
+          <w:rFonts w:ascii="Arial" w:cs="Arial" w:eastAsia="Arial" w:hAnsi="Arial"/>
+          <w:sz w:val="24"/>
+          <w:szCs w:val="24"/>
+        </w:rPr>
+        <w:t xml:space="preserve">"Schools should be talking about this. My children have had no education about how social media actually works."</w:t>
+      </w:r>
+    </w:p>
+    <w:p>
+      <w:pPr>
+        <w:spacing w:after="30" w:before="100" w:line="276" w:lineRule="auto"/>
       </w:pPr>
       <w:r>
         <w:rPr>
@@ -3016,21 +2929,21 @@
     </w:p>
     <w:p>
       <w:pPr>
-        <w:spacing w:after="80" w:before="40" w:line="276" w:lineRule="auto"/>
-        <w:jc w:val="both"/>
-      </w:pPr>
-      <w:r>
-        <w:rPr>
-          <w:rFonts w:ascii="Arial" w:cs="Arial" w:eastAsia="Arial" w:hAnsi="Arial"/>
-          <w:sz w:val="24"/>
-          <w:szCs w:val="24"/>
-        </w:rPr>
-        <w:t xml:space="preserve">"Yes, without question. Self-regulation has not worked."</w:t>
-      </w:r>
-    </w:p>
-    <w:p>
-      <w:pPr>
-        <w:spacing w:after="40" w:before="120" w:line="276" w:lineRule="auto"/>
+        <w:spacing w:after="80" w:before="30" w:line="276" w:lineRule="auto"/>
+        <w:jc w:val="both"/>
+      </w:pPr>
+      <w:r>
+        <w:rPr>
+          <w:rFonts w:ascii="Arial" w:cs="Arial" w:eastAsia="Arial" w:hAnsi="Arial"/>
+          <w:sz w:val="24"/>
+          <w:szCs w:val="24"/>
+        </w:rPr>
+        <w:t xml:space="preserve">"Yes. Self-regulation has failed."</w:t>
+      </w:r>
+    </w:p>
+    <w:p>
+      <w:pPr>
+        <w:spacing w:after="30" w:before="100" w:line="276" w:lineRule="auto"/>
       </w:pPr>
       <w:r>
         <w:rPr>
@@ -3045,16 +2958,16 @@
     </w:p>
     <w:p>
       <w:pPr>
-        <w:spacing w:after="80" w:before="40" w:line="276" w:lineRule="auto"/>
-        <w:jc w:val="both"/>
-      </w:pPr>
-      <w:r>
-        <w:rPr>
-          <w:rFonts w:ascii="Arial" w:cs="Arial" w:eastAsia="Arial" w:hAnsi="Arial"/>
-          <w:sz w:val="24"/>
-          <w:szCs w:val="24"/>
-        </w:rPr>
-        <w:t xml:space="preserve">"Stop algorithmically pushing body image and beauty content to teenage girls. There is no justification for that."</w:t>
+        <w:spacing w:after="80" w:before="30" w:line="276" w:lineRule="auto"/>
+        <w:jc w:val="both"/>
+      </w:pPr>
+      <w:r>
+        <w:rPr>
+          <w:rFonts w:ascii="Arial" w:cs="Arial" w:eastAsia="Arial" w:hAnsi="Arial"/>
+          <w:sz w:val="24"/>
+          <w:szCs w:val="24"/>
+        </w:rPr>
+        <w:t xml:space="preserve">"Stop algorithmically pushing body image content to teenage girls. There is no justification for it."</w:t>
       </w:r>
     </w:p>
     <w:p>
@@ -3065,14 +2978,13 @@
     <w:p>
       <w:pPr>
         <w:pStyle w:val="Heading1"/>
-        <w:spacing w:after="160" w:before="320"/>
-      </w:pPr>
-      <w:r>
-        <w:rPr>
-          <w:rFonts w:ascii="Arial" w:cs="Arial" w:eastAsia="Arial" w:hAnsi="Arial"/>
-          <w:b/>
-          <w:bCs/>
-          <w:color w:val="1F3864"/>
+        <w:spacing w:after="160" w:before="360"/>
+      </w:pPr>
+      <w:r>
+        <w:rPr>
+          <w:rFonts w:ascii="Arial" w:cs="Arial" w:eastAsia="Arial" w:hAnsi="Arial"/>
+          <w:b/>
+          <w:bCs/>
           <w:sz w:val="28"/>
           <w:szCs w:val="28"/>
         </w:rPr>
@@ -3090,7 +3002,7 @@
           <w:sz w:val="24"/>
           <w:szCs w:val="24"/>
         </w:rPr>
-        <w:t xml:space="preserve">All three interviewees approached the topic from different positions – a mental health professional, an educator, and a parent – yet arrived at remarkably consistent conclusions.</w:t>
+        <w:t xml:space="preserve">All three interviewees – a mental health professional, an educator, and a parent – approached the topic from very different vantage points, yet arrived at consistent conclusions. Each independently identified the same core problem: users, and particularly young users, are largely unaware that their behaviour online is the result of deliberate engineering, not personal weakness. Ms Govender emphasised the clinical consequences; Mr Naidoo framed it as an information asymmetry that schools must address; Mr Williams described the direct daily impact on his family.</w:t>
       </w:r>
     </w:p>
     <w:p>
@@ -3104,7 +3016,7 @@
           <w:sz w:val="24"/>
           <w:szCs w:val="24"/>
         </w:rPr>
-        <w:t xml:space="preserve">A central theme across all three interviews was the problem of asymmetry of power and knowledge. All interviewees noted that users, particularly young users, are largely unaware of the deliberate engineering behind social media engagement. Ms Govender emphasised that this ignorance causes young people to blame themselves for their struggles rather than recognising a designed system. Mr Naidoo framed this as an information asymmetry and argued that digital literacy must become a core educational priority. Mr Williams arrived at the same insight from a parental perspective – his understanding of his children's behaviour changed completely once he understood the mechanisms involved.</w:t>
+        <w:t xml:space="preserve">All three agreed the situation is fundamentally unfair to minors, who cannot meaningfully consent to design choices made about them. All agreed responsibility is shared, but that technology companies bear primary accountability as the architects of the problem. There was unanimous support for both stronger regulation and better education.</w:t>
       </w:r>
     </w:p>
     <w:p>
@@ -3118,35 +3030,7 @@
           <w:sz w:val="24"/>
           <w:szCs w:val="24"/>
         </w:rPr>
-        <w:t xml:space="preserve">All three agreed that the situation is fundamentally unfair, particularly for minors who cannot meaningfully consent to or comprehend the design choices being made about them. There was unanimous agreement that responsibility is shared between technology companies, government, schools, and families, but that companies bear primary responsibility as the source of the problem.</w:t>
-      </w:r>
-    </w:p>
-    <w:p>
-      <w:pPr>
-        <w:spacing w:after="120" w:before="0" w:line="276" w:lineRule="auto"/>
-        <w:jc w:val="both"/>
-      </w:pPr>
-      <w:r>
-        <w:rPr>
-          <w:rFonts w:ascii="Arial" w:cs="Arial" w:eastAsia="Arial" w:hAnsi="Arial"/>
-          <w:sz w:val="24"/>
-          <w:szCs w:val="24"/>
-        </w:rPr>
-        <w:t xml:space="preserve">Where perspectives diverged was in emphasis. Ms Govender focused on the clinical mental health impact and the need for educational and therapeutic responses. Mr Naidoo emphasised systemic change through curriculum reform and regulatory intervention. Mr Williams was most focused on the daily lived experience and expressed the clearest frustration at the power imbalance between parents and platform companies.</w:t>
-      </w:r>
-    </w:p>
-    <w:p>
-      <w:pPr>
-        <w:spacing w:after="120" w:before="0" w:line="276" w:lineRule="auto"/>
-        <w:jc w:val="both"/>
-      </w:pPr>
-      <w:r>
-        <w:rPr>
-          <w:rFonts w:ascii="Arial" w:cs="Arial" w:eastAsia="Arial" w:hAnsi="Arial"/>
-          <w:sz w:val="24"/>
-          <w:szCs w:val="24"/>
-        </w:rPr>
-        <w:t xml:space="preserve">Collectively, the interviews reinforced and deepened the ethical analysis: genuine harm is being done knowingly; the most vulnerable are disproportionately affected; and the current system fails basic ethical standards of fairness, honesty, dignity, and care.</w:t>
+        <w:t xml:space="preserve">Where they differed was in emphasis. Ms Govender focused on therapeutic and educational responses; Mr Naidoo on systemic curriculum reform and regulation; Mr Williams on the frustration of being outmatched as a parent. Together, the interviews confirm the ethical analysis: harm is being done knowingly, the most vulnerable bear the greatest cost, and the current model fails the basic standards of fairness, honesty, dignity, and care.</w:t>
       </w:r>
     </w:p>
     <w:p>
@@ -3164,11 +3048,11 @@
           <w:rFonts w:ascii="Arial" w:cs="Arial" w:eastAsia="Arial" w:hAnsi="Arial"/>
           <w:i/>
           <w:iCs/>
-          <w:color w:val="888888"/>
+          <w:color w:val="666666"/>
           <w:sz w:val="20"/>
           <w:szCs w:val="20"/>
         </w:rPr>
-        <w:t xml:space="preserve">VISUAL 8 – Insert summary table or infographic: key themes across all three interviews</w:t>
+        <w:t xml:space="preserve">VISUAL 8 – Insert summary table: key themes across all three interviews</w:t>
       </w:r>
     </w:p>
     <w:p>
@@ -3179,14 +3063,13 @@
     <w:p>
       <w:pPr>
         <w:pStyle w:val="Heading1"/>
-        <w:spacing w:after="160" w:before="320"/>
-      </w:pPr>
-      <w:r>
-        <w:rPr>
-          <w:rFonts w:ascii="Arial" w:cs="Arial" w:eastAsia="Arial" w:hAnsi="Arial"/>
-          <w:b/>
-          <w:bCs/>
-          <w:color w:val="1F3864"/>
+        <w:spacing w:after="160" w:before="360"/>
+      </w:pPr>
+      <w:r>
+        <w:rPr>
+          <w:rFonts w:ascii="Arial" w:cs="Arial" w:eastAsia="Arial" w:hAnsi="Arial"/>
+          <w:b/>
+          <w:bCs/>
           <w:sz w:val="28"/>
           <w:szCs w:val="28"/>
         </w:rPr>
@@ -3204,7 +3087,7 @@
           <w:sz w:val="24"/>
           <w:szCs w:val="24"/>
         </w:rPr>
-        <w:t xml:space="preserve">Based on my investigation, I believe this ethical issue is harmful – and deliberately so – because the evidence is overwhelming that social media platforms have consistently prioritised profit over the wellbeing of their users, particularly young people, and have done so with full knowledge of the consequences.</w:t>
+        <w:t xml:space="preserve">I believe this issue is harmful – and deliberately so. The evidence is clear: social media platforms have consistently prioritised profit over the wellbeing of their users, particularly young people, with full knowledge of the consequences.</w:t>
       </w:r>
     </w:p>
     <w:p>
@@ -3218,7 +3101,7 @@
           <w:sz w:val="24"/>
           <w:szCs w:val="24"/>
         </w:rPr>
-        <w:t xml:space="preserve">Before researching this topic, I thought the problem with social media was largely about individual choices and self-discipline. What I found was something more troubling: a system built by some of the world's most talented people specifically to make self-discipline as difficult as possible. This is not a design flaw – it is the design. The infinite scroll, the variable reward notification, the algorithmically curated feed – these are features, not oversights.</w:t>
+        <w:t xml:space="preserve">Before researching this topic I assumed the problem with social media was mostly about individual self-discipline. What I found was different. The infinite scroll, the variable reward notification, the algorithm that surfaces content designed to provoke – these are not oversights. They are the product. The most talented engineers in the world built these features specifically to make self-regulation as difficult as possible.</w:t>
       </w:r>
     </w:p>
     <w:p>
@@ -3232,7 +3115,7 @@
           <w:sz w:val="24"/>
           <w:szCs w:val="24"/>
         </w:rPr>
-        <w:t xml:space="preserve">The harm is real and measurable. Rates of anxiety and depression among teenagers have risen sharply in the decade since smartphones became widespread, and internal company research has linked the platforms directly to these outcomes. The fact that Meta identified harm to teenage girls and chose not to act on it is, in my view, one of the clearest examples of corporate unethical behaviour in recent history. It is not ignorance. It is a decision.</w:t>
+        <w:t xml:space="preserve">The harm is measurable. Rates of anxiety and depression among teenagers have risen sharply in the decade since smartphones became widespread. Meta's own researchers identified harm to teenage girls and the company chose not to act on it. That is not ignorance. It is a decision made at the highest level, in the knowledge of the consequences.</w:t>
       </w:r>
     </w:p>
     <w:p>
@@ -3246,7 +3129,7 @@
           <w:sz w:val="24"/>
           <w:szCs w:val="24"/>
         </w:rPr>
-        <w:t xml:space="preserve">What troubles me most is where the harm falls. It is not the powerful or the wealthy who suffer most. It is teenagers, people with existing mental health vulnerabilities, and those without the knowledge to understand what is being done to them. The profits flow to shareholders; the costs are paid in the mental health and dignity of young people. This is a justice issue.</w:t>
+        <w:t xml:space="preserve">What concerns me most is who bears the cost. It is not the powerful or the wealthy. It is teenagers, people with existing vulnerabilities, and those who lack the knowledge to recognise what is being done to them. The profits flow to shareholders; the costs are paid in the mental health of young people. That is a justice issue.</w:t>
       </w:r>
     </w:p>
     <w:p>
@@ -3260,7 +3143,7 @@
           <w:sz w:val="24"/>
           <w:szCs w:val="24"/>
         </w:rPr>
-        <w:t xml:space="preserve">I recognise that social media is not entirely negative. People build relationships, access information, and find genuine community online. The problem is not connection itself – it is that the design of these platforms is governed by engagement metrics rather than human benefit. A platform built to genuinely improve users' lives would look very different.</w:t>
+        <w:t xml:space="preserve">I recognise that social media is not entirely negative. People build real relationships and access genuine information online. The problem is not connection – it is that current design is governed by engagement metrics rather than human benefit. A platform genuinely built to improve users' lives would look very different.</w:t>
       </w:r>
     </w:p>
     <w:p>
@@ -3274,7 +3157,7 @@
           <w:sz w:val="24"/>
           <w:szCs w:val="24"/>
         </w:rPr>
-        <w:t xml:space="preserve">The impact on dignity is significant and personal. When a human being is reduced to a behavioural data point to be optimised for advertising revenue, their worth as a person is not being recognised. For young people still forming their identities, this is particularly damaging.</w:t>
+        <w:t xml:space="preserve">Human dignity is also at stake. When a person is reduced to a behavioural data point to be optimised for advertising revenue, they are not being treated as a person. For adolescents still forming their identities, this is particularly damaging.</w:t>
       </w:r>
     </w:p>
     <w:p>
@@ -3288,36 +3171,7 @@
           <w:sz w:val="24"/>
           <w:szCs w:val="24"/>
         </w:rPr>
-        <w:t xml:space="preserve">I believe change is both necessary and possible, but it will not come from goodwill alone. The financial incentives driving current design are too powerful. Regulation is essential, and individual awareness is the foundation on which demand for that regulation must be built.</w:t>
-      </w:r>
-    </w:p>
-    <w:p>
-      <w:pPr>
-        <w:spacing w:after="60" w:before="0"/>
-      </w:pPr>
-      <w:r>
-        <w:rPr>
-          <w:rFonts w:ascii="Arial" w:cs="Arial" w:eastAsia="Arial" w:hAnsi="Arial"/>
-          <w:sz w:val="24"/>
-          <w:szCs w:val="24"/>
-        </w:rPr>
-        <w:t xml:space="preserve"/>
-      </w:r>
-    </w:p>
-    <w:p>
-      <w:pPr>
-        <w:spacing w:after="120" w:before="0"/>
-      </w:pPr>
-      <w:r>
-        <w:rPr>
-          <w:rFonts w:ascii="Arial" w:cs="Arial" w:eastAsia="Arial" w:hAnsi="Arial"/>
-          <w:i/>
-          <w:iCs/>
-          <w:color w:val="888888"/>
-          <w:sz w:val="20"/>
-          <w:szCs w:val="20"/>
-        </w:rPr>
-        <w:t xml:space="preserve">(approximately 340 words)</w:t>
+        <w:t xml:space="preserve">Change will not come from goodwill alone. The financial incentives driving current design are too powerful. Regulation is necessary, and individual awareness is the foundation on which the demand for that regulation must be built.</w:t>
       </w:r>
     </w:p>
     <w:p>
@@ -3328,14 +3182,13 @@
     <w:p>
       <w:pPr>
         <w:pStyle w:val="Heading1"/>
-        <w:spacing w:after="160" w:before="320"/>
-      </w:pPr>
-      <w:r>
-        <w:rPr>
-          <w:rFonts w:ascii="Arial" w:cs="Arial" w:eastAsia="Arial" w:hAnsi="Arial"/>
-          <w:b/>
-          <w:bCs/>
-          <w:color w:val="1F3864"/>
+        <w:spacing w:after="160" w:before="360"/>
+      </w:pPr>
+      <w:r>
+        <w:rPr>
+          <w:rFonts w:ascii="Arial" w:cs="Arial" w:eastAsia="Arial" w:hAnsi="Arial"/>
+          <w:b/>
+          <w:bCs/>
           <w:sz w:val="28"/>
           <w:szCs w:val="28"/>
         </w:rPr>
@@ -3357,7 +3210,7 @@
           <w:rFonts w:ascii="Arial" w:cs="Arial" w:eastAsia="Arial" w:hAnsi="Arial"/>
           <w:i/>
           <w:iCs/>
-          <w:color w:val="888888"/>
+          <w:color w:val="666666"/>
           <w:sz w:val="20"/>
           <w:szCs w:val="20"/>
         </w:rPr>
@@ -3384,7 +3237,7 @@
           <w:sz w:val="24"/>
           <w:szCs w:val="24"/>
         </w:rPr>
-        <w:t xml:space="preserve">Youth Awareness Campaign (School-Based)</w:t>
+        <w:t xml:space="preserve">School-Based Youth Awareness Campaign</w:t>
       </w:r>
     </w:p>
     <w:p>
@@ -3403,14 +3256,13 @@
     <w:p>
       <w:pPr>
         <w:pStyle w:val="Heading2"/>
-        <w:spacing w:after="120" w:before="240"/>
-      </w:pPr>
-      <w:r>
-        <w:rPr>
-          <w:rFonts w:ascii="Arial" w:cs="Arial" w:eastAsia="Arial" w:hAnsi="Arial"/>
-          <w:b/>
-          <w:bCs/>
-          <w:color w:val="2E4057"/>
+        <w:spacing w:after="100" w:before="240"/>
+      </w:pPr>
+      <w:r>
+        <w:rPr>
+          <w:rFonts w:ascii="Arial" w:cs="Arial" w:eastAsia="Arial" w:hAnsi="Arial"/>
+          <w:b/>
+          <w:bCs/>
           <w:sz w:val="24"/>
           <w:szCs w:val="24"/>
         </w:rPr>
@@ -3428,7 +3280,7 @@
           <w:sz w:val="24"/>
           <w:szCs w:val="24"/>
         </w:rPr>
-        <w:t xml:space="preserve">Young people should be educated about how social media platforms are designed – specifically the use of infinite scroll, variable reward notifications, algorithmic content curation, and data harvesting – so that they can engage with these platforms from a position of informed awareness rather than unconscious compliance.</w:t>
+        <w:t xml:space="preserve">Young people should understand how social media platforms are designed – infinite scroll, variable reward notifications, algorithmic curation, data harvesting – so they can engage from informed awareness rather than unconscious compliance.</w:t>
       </w:r>
     </w:p>
     <w:p>
@@ -3447,14 +3299,13 @@
     <w:p>
       <w:pPr>
         <w:pStyle w:val="Heading2"/>
-        <w:spacing w:after="120" w:before="240"/>
-      </w:pPr>
-      <w:r>
-        <w:rPr>
-          <w:rFonts w:ascii="Arial" w:cs="Arial" w:eastAsia="Arial" w:hAnsi="Arial"/>
-          <w:b/>
-          <w:bCs/>
-          <w:color w:val="2E4057"/>
+        <w:spacing w:after="100" w:before="240"/>
+      </w:pPr>
+      <w:r>
+        <w:rPr>
+          <w:rFonts w:ascii="Arial" w:cs="Arial" w:eastAsia="Arial" w:hAnsi="Arial"/>
+          <w:b/>
+          <w:bCs/>
           <w:sz w:val="24"/>
           <w:szCs w:val="24"/>
         </w:rPr>
@@ -3472,7 +3323,7 @@
           <w:sz w:val="24"/>
           <w:szCs w:val="24"/>
         </w:rPr>
-        <w:t xml:space="preserve">Schools should integrate critical digital literacy into Life Orientation, Technology, and media-related subjects. The Department of Basic Education should update curriculum guidelines to include this content. Student Representative Councils (SRCs) can champion and drive awareness at school level. Parents should be invited into the conversation through school workshops.</w:t>
+        <w:t xml:space="preserve">Schools should integrate critical digital literacy across Life Orientation, Technology, and media subjects. The Department of Basic Education should update curriculum guidelines accordingly. SRCs can drive the campaign at school level. Parents should be brought in through school workshops.</w:t>
       </w:r>
     </w:p>
     <w:p>
@@ -3491,14 +3342,13 @@
     <w:p>
       <w:pPr>
         <w:pStyle w:val="Heading2"/>
-        <w:spacing w:after="120" w:before="240"/>
-      </w:pPr>
-      <w:r>
-        <w:rPr>
-          <w:rFonts w:ascii="Arial" w:cs="Arial" w:eastAsia="Arial" w:hAnsi="Arial"/>
-          <w:b/>
-          <w:bCs/>
-          <w:color w:val="2E4057"/>
+        <w:spacing w:after="100" w:before="240"/>
+      </w:pPr>
+      <w:r>
+        <w:rPr>
+          <w:rFonts w:ascii="Arial" w:cs="Arial" w:eastAsia="Arial" w:hAnsi="Arial"/>
+          <w:b/>
+          <w:bCs/>
           <w:sz w:val="24"/>
           <w:szCs w:val="24"/>
         </w:rPr>
@@ -3516,7 +3366,36 @@
           <w:sz w:val="24"/>
           <w:szCs w:val="24"/>
         </w:rPr>
-        <w:t xml:space="preserve">This response does not require platform companies to act, legislation to pass, or government policy to change before it can begin. It can start immediately, at school level, using existing resources and motivated students.</w:t>
+        <w:t xml:space="preserve">This campaign can begin immediately, at school level, with no requirement for platform companies to act or for legislation to pass. It addresses the core ethical problem – lack of informed awareness – by restoring autonomy to young people rather than simply restricting them. It is honest: it does not treat social media as entirely harmful, but equips students to engage with it critically. Respecting students' capacity to understand complex systems is itself an ethical act.</w:t>
+      </w:r>
+    </w:p>
+    <w:p>
+      <w:pPr>
+        <w:spacing w:after="60" w:before="0"/>
+      </w:pPr>
+      <w:r>
+        <w:rPr>
+          <w:rFonts w:ascii="Arial" w:cs="Arial" w:eastAsia="Arial" w:hAnsi="Arial"/>
+          <w:sz w:val="24"/>
+          <w:szCs w:val="24"/>
+        </w:rPr>
+        <w:t xml:space="preserve"/>
+      </w:r>
+    </w:p>
+    <w:p>
+      <w:pPr>
+        <w:pStyle w:val="Heading2"/>
+        <w:spacing w:after="100" w:before="240"/>
+      </w:pPr>
+      <w:r>
+        <w:rPr>
+          <w:rFonts w:ascii="Arial" w:cs="Arial" w:eastAsia="Arial" w:hAnsi="Arial"/>
+          <w:b/>
+          <w:bCs/>
+          <w:sz w:val="24"/>
+          <w:szCs w:val="24"/>
+        </w:rPr>
+        <w:t xml:space="preserve">How will it help real people?</w:t>
       </w:r>
     </w:p>
     <w:p>
@@ -3530,7 +3409,177 @@
           <w:sz w:val="24"/>
           <w:szCs w:val="24"/>
         </w:rPr>
-        <w:t xml:space="preserve">It addresses the core ethical problem – lack of informed awareness – in a way that restores autonomy to young people rather than simply restricting them. It treats students as capable of understanding complex systems once those systems are clearly explained. It also builds critical thinking habits that will serve students throughout their lives.</w:t>
+        <w:t xml:space="preserve">The #ScrollSmarter campaign would include:</w:t>
+      </w:r>
+    </w:p>
+    <w:p>
+      <w:pPr>
+        <w:spacing w:after="60" w:before="0"/>
+      </w:pPr>
+      <w:r>
+        <w:rPr>
+          <w:rFonts w:ascii="Arial" w:cs="Arial" w:eastAsia="Arial" w:hAnsi="Arial"/>
+          <w:sz w:val="24"/>
+          <w:szCs w:val="24"/>
+        </w:rPr>
+        <w:t xml:space="preserve"/>
+      </w:r>
+    </w:p>
+    <w:p>
+      <w:pPr>
+        <w:spacing w:after="80" w:before="40" w:line="276" w:lineRule="auto"/>
+        <w:jc w:val="both"/>
+      </w:pPr>
+      <w:r>
+        <w:rPr>
+          <w:rFonts w:ascii="Arial" w:cs="Arial" w:eastAsia="Arial" w:hAnsi="Arial"/>
+          <w:b/>
+          <w:bCs/>
+          <w:sz w:val="24"/>
+          <w:szCs w:val="24"/>
+        </w:rPr>
+        <w:t xml:space="preserve">Assembly presentations: </w:t>
+      </w:r>
+      <w:r>
+        <w:rPr>
+          <w:rFonts w:ascii="Arial" w:cs="Arial" w:eastAsia="Arial" w:hAnsi="Arial"/>
+          <w:sz w:val="24"/>
+          <w:szCs w:val="24"/>
+        </w:rPr>
+        <w:t xml:space="preserve">Student-led sessions explaining, in plain language, how persuasive design works – comparing variable reward notifications to slot machines and illustrating how infinite scroll removes natural stopping points.</w:t>
+      </w:r>
+    </w:p>
+    <w:p>
+      <w:pPr>
+        <w:spacing w:after="80" w:before="40" w:line="276" w:lineRule="auto"/>
+        <w:jc w:val="both"/>
+      </w:pPr>
+      <w:r>
+        <w:rPr>
+          <w:rFonts w:ascii="Arial" w:cs="Arial" w:eastAsia="Arial" w:hAnsi="Arial"/>
+          <w:b/>
+          <w:bCs/>
+          <w:sz w:val="24"/>
+          <w:szCs w:val="24"/>
+        </w:rPr>
+        <w:t xml:space="preserve">Life Orientation classroom discussions: </w:t>
+      </w:r>
+      <w:r>
+        <w:rPr>
+          <w:rFonts w:ascii="Arial" w:cs="Arial" w:eastAsia="Arial" w:hAnsi="Arial"/>
+          <w:sz w:val="24"/>
+          <w:szCs w:val="24"/>
+        </w:rPr>
+        <w:t xml:space="preserve">Using real data – SADAG statistics, the Meta research leak, South African screen time studies – to ground the conversation locally.</w:t>
+      </w:r>
+    </w:p>
+    <w:p>
+      <w:pPr>
+        <w:spacing w:after="80" w:before="40" w:line="276" w:lineRule="auto"/>
+        <w:jc w:val="both"/>
+      </w:pPr>
+      <w:r>
+        <w:rPr>
+          <w:rFonts w:ascii="Arial" w:cs="Arial" w:eastAsia="Arial" w:hAnsi="Arial"/>
+          <w:b/>
+          <w:bCs/>
+          <w:sz w:val="24"/>
+          <w:szCs w:val="24"/>
+        </w:rPr>
+        <w:t xml:space="preserve">A school social media wellbeing policy: </w:t>
+      </w:r>
+      <w:r>
+        <w:rPr>
+          <w:rFonts w:ascii="Arial" w:cs="Arial" w:eastAsia="Arial" w:hAnsi="Arial"/>
+          <w:sz w:val="24"/>
+          <w:szCs w:val="24"/>
+        </w:rPr>
+        <w:t xml:space="preserve">Evidence-based recommendations: phone-free mealtimes, devices charged outside bedrooms overnight, no social media during the first hour after waking.</w:t>
+      </w:r>
+    </w:p>
+    <w:p>
+      <w:pPr>
+        <w:spacing w:after="80" w:before="40" w:line="276" w:lineRule="auto"/>
+        <w:jc w:val="both"/>
+      </w:pPr>
+      <w:r>
+        <w:rPr>
+          <w:rFonts w:ascii="Arial" w:cs="Arial" w:eastAsia="Arial" w:hAnsi="Arial"/>
+          <w:b/>
+          <w:bCs/>
+          <w:sz w:val="24"/>
+          <w:szCs w:val="24"/>
+        </w:rPr>
+        <w:t xml:space="preserve">Student-designed posters and infographics: </w:t>
+      </w:r>
+      <w:r>
+        <w:rPr>
+          <w:rFonts w:ascii="Arial" w:cs="Arial" w:eastAsia="Arial" w:hAnsi="Arial"/>
+          <w:sz w:val="24"/>
+          <w:szCs w:val="24"/>
+        </w:rPr>
+        <w:t xml:space="preserve">Displayed throughout the school to demystify platform design in a visually engaging way.</w:t>
+      </w:r>
+    </w:p>
+    <w:p>
+      <w:pPr>
+        <w:spacing w:after="80" w:before="40" w:line="276" w:lineRule="auto"/>
+        <w:jc w:val="both"/>
+      </w:pPr>
+      <w:r>
+        <w:rPr>
+          <w:rFonts w:ascii="Arial" w:cs="Arial" w:eastAsia="Arial" w:hAnsi="Arial"/>
+          <w:b/>
+          <w:bCs/>
+          <w:sz w:val="24"/>
+          <w:szCs w:val="24"/>
+        </w:rPr>
+        <w:t xml:space="preserve">A voluntary Digital Awareness Week each term: </w:t>
+      </w:r>
+      <w:r>
+        <w:rPr>
+          <w:rFonts w:ascii="Arial" w:cs="Arial" w:eastAsia="Arial" w:hAnsi="Arial"/>
+          <w:sz w:val="24"/>
+          <w:szCs w:val="24"/>
+        </w:rPr>
+        <w:t xml:space="preserve">Students and staff reduce social media use for five days and reflect on the experience in class.</w:t>
+      </w:r>
+    </w:p>
+    <w:p>
+      <w:pPr>
+        <w:spacing w:after="80" w:before="40" w:line="276" w:lineRule="auto"/>
+        <w:jc w:val="both"/>
+      </w:pPr>
+      <w:r>
+        <w:rPr>
+          <w:rFonts w:ascii="Arial" w:cs="Arial" w:eastAsia="Arial" w:hAnsi="Arial"/>
+          <w:b/>
+          <w:bCs/>
+          <w:sz w:val="24"/>
+          <w:szCs w:val="24"/>
+        </w:rPr>
+        <w:t xml:space="preserve">A parent information evening: </w:t>
+      </w:r>
+      <w:r>
+        <w:rPr>
+          <w:rFonts w:ascii="Arial" w:cs="Arial" w:eastAsia="Arial" w:hAnsi="Arial"/>
+          <w:sz w:val="24"/>
+          <w:szCs w:val="24"/>
+        </w:rPr>
+        <w:t xml:space="preserve">A brief session on persuasive design and practical guidance for managing healthy phone habits at home.</w:t>
+      </w:r>
+    </w:p>
+    <w:p>
+      <w:pPr>
+        <w:spacing w:after="60" w:before="0"/>
+      </w:pPr>
+      <w:r>
+        <w:rPr>
+          <w:rFonts w:ascii="Arial" w:cs="Arial" w:eastAsia="Arial" w:hAnsi="Arial"/>
+          <w:sz w:val="24"/>
+          <w:szCs w:val="24"/>
+        </w:rPr>
+        <w:t xml:space="preserve"/>
       </w:r>
     </w:p>
     <w:p>
@@ -3544,235 +3593,7 @@
           <w:sz w:val="24"/>
           <w:szCs w:val="24"/>
         </w:rPr>
-        <w:t xml:space="preserve">It is honest: it does not claim social media is entirely harmful, but it equips young people with the knowledge to make genuinely informed choices. This is itself an ethical act – it respects the dignity and intelligence of the people it aims to help.</w:t>
-      </w:r>
-    </w:p>
-    <w:p>
-      <w:pPr>
-        <w:spacing w:after="60" w:before="0"/>
-      </w:pPr>
-      <w:r>
-        <w:rPr>
-          <w:rFonts w:ascii="Arial" w:cs="Arial" w:eastAsia="Arial" w:hAnsi="Arial"/>
-          <w:sz w:val="24"/>
-          <w:szCs w:val="24"/>
-        </w:rPr>
-        <w:t xml:space="preserve"/>
-      </w:r>
-    </w:p>
-    <w:p>
-      <w:pPr>
-        <w:pStyle w:val="Heading2"/>
-        <w:spacing w:after="120" w:before="240"/>
-      </w:pPr>
-      <w:r>
-        <w:rPr>
-          <w:rFonts w:ascii="Arial" w:cs="Arial" w:eastAsia="Arial" w:hAnsi="Arial"/>
-          <w:b/>
-          <w:bCs/>
-          <w:color w:val="2E4057"/>
-          <w:sz w:val="24"/>
-          <w:szCs w:val="24"/>
-        </w:rPr>
-        <w:t xml:space="preserve">How will it help real people?</w:t>
-      </w:r>
-    </w:p>
-    <w:p>
-      <w:pPr>
-        <w:spacing w:after="120" w:before="0" w:line="276" w:lineRule="auto"/>
-        <w:jc w:val="both"/>
-      </w:pPr>
-      <w:r>
-        <w:rPr>
-          <w:rFonts w:ascii="Arial" w:cs="Arial" w:eastAsia="Arial" w:hAnsi="Arial"/>
-          <w:sz w:val="24"/>
-          <w:szCs w:val="24"/>
-        </w:rPr>
-        <w:t xml:space="preserve">The #ScrollSmarter campaign would include the following practical elements:</w:t>
-      </w:r>
-    </w:p>
-    <w:p>
-      <w:pPr>
-        <w:spacing w:after="60" w:before="0"/>
-      </w:pPr>
-      <w:r>
-        <w:rPr>
-          <w:rFonts w:ascii="Arial" w:cs="Arial" w:eastAsia="Arial" w:hAnsi="Arial"/>
-          <w:sz w:val="24"/>
-          <w:szCs w:val="24"/>
-        </w:rPr>
-        <w:t xml:space="preserve"/>
-      </w:r>
-    </w:p>
-    <w:p>
-      <w:pPr>
-        <w:spacing w:after="80" w:before="40" w:line="276" w:lineRule="auto"/>
-        <w:jc w:val="both"/>
-      </w:pPr>
-      <w:r>
-        <w:rPr>
-          <w:rFonts w:ascii="Arial" w:cs="Arial" w:eastAsia="Arial" w:hAnsi="Arial"/>
-          <w:b/>
-          <w:bCs/>
-          <w:sz w:val="24"/>
-          <w:szCs w:val="24"/>
-        </w:rPr>
-        <w:t xml:space="preserve">Assembly presentations: </w:t>
-      </w:r>
-      <w:r>
-        <w:rPr>
-          <w:rFonts w:ascii="Arial" w:cs="Arial" w:eastAsia="Arial" w:hAnsi="Arial"/>
-          <w:sz w:val="24"/>
-          <w:szCs w:val="24"/>
-        </w:rPr>
-        <w:t xml:space="preserve">Student-led sessions explaining, in plain language, how social media design works – comparing variable reward notifications to a slot machine, and illustrating how infinite scroll removes natural stopping points.</w:t>
-      </w:r>
-    </w:p>
-    <w:p>
-      <w:pPr>
-        <w:spacing w:after="80" w:before="40" w:line="276" w:lineRule="auto"/>
-        <w:jc w:val="both"/>
-      </w:pPr>
-      <w:r>
-        <w:rPr>
-          <w:rFonts w:ascii="Arial" w:cs="Arial" w:eastAsia="Arial" w:hAnsi="Arial"/>
-          <w:b/>
-          <w:bCs/>
-          <w:sz w:val="24"/>
-          <w:szCs w:val="24"/>
-        </w:rPr>
-        <w:t xml:space="preserve">Classroom discussions in Life Orientation: </w:t>
-      </w:r>
-      <w:r>
-        <w:rPr>
-          <w:rFonts w:ascii="Arial" w:cs="Arial" w:eastAsia="Arial" w:hAnsi="Arial"/>
-          <w:sz w:val="24"/>
-          <w:szCs w:val="24"/>
-        </w:rPr>
-        <w:t xml:space="preserve">Using real data – SADAG mental health statistics, the Meta internal research leak, and South African studies on youth screen time – to make the conversation locally grounded and relevant.</w:t>
-      </w:r>
-    </w:p>
-    <w:p>
-      <w:pPr>
-        <w:spacing w:after="80" w:before="40" w:line="276" w:lineRule="auto"/>
-        <w:jc w:val="both"/>
-      </w:pPr>
-      <w:r>
-        <w:rPr>
-          <w:rFonts w:ascii="Arial" w:cs="Arial" w:eastAsia="Arial" w:hAnsi="Arial"/>
-          <w:b/>
-          <w:bCs/>
-          <w:sz w:val="24"/>
-          <w:szCs w:val="24"/>
-        </w:rPr>
-        <w:t xml:space="preserve">A school social media wellbeing policy: </w:t>
-      </w:r>
-      <w:r>
-        <w:rPr>
-          <w:rFonts w:ascii="Arial" w:cs="Arial" w:eastAsia="Arial" w:hAnsi="Arial"/>
-          <w:sz w:val="24"/>
-          <w:szCs w:val="24"/>
-        </w:rPr>
-        <w:t xml:space="preserve">Simple, practical recommendations such as phone-free mealtimes, phones charged outside bedrooms overnight, and no social media during the first hour after waking. These are evidence-based habits with measurable positive effects on sleep and wellbeing.</w:t>
-      </w:r>
-    </w:p>
-    <w:p>
-      <w:pPr>
-        <w:spacing w:after="80" w:before="40" w:line="276" w:lineRule="auto"/>
-        <w:jc w:val="both"/>
-      </w:pPr>
-      <w:r>
-        <w:rPr>
-          <w:rFonts w:ascii="Arial" w:cs="Arial" w:eastAsia="Arial" w:hAnsi="Arial"/>
-          <w:b/>
-          <w:bCs/>
-          <w:sz w:val="24"/>
-          <w:szCs w:val="24"/>
-        </w:rPr>
-        <w:t xml:space="preserve">Student-designed posters and infographics: </w:t>
-      </w:r>
-      <w:r>
-        <w:rPr>
-          <w:rFonts w:ascii="Arial" w:cs="Arial" w:eastAsia="Arial" w:hAnsi="Arial"/>
-          <w:sz w:val="24"/>
-          <w:szCs w:val="24"/>
-        </w:rPr>
-        <w:t xml:space="preserve">Displayed in classrooms, corridors, and common areas, demystifying platform design in a visually engaging and memorable way.</w:t>
-      </w:r>
-    </w:p>
-    <w:p>
-      <w:pPr>
-        <w:spacing w:after="80" w:before="40" w:line="276" w:lineRule="auto"/>
-        <w:jc w:val="both"/>
-      </w:pPr>
-      <w:r>
-        <w:rPr>
-          <w:rFonts w:ascii="Arial" w:cs="Arial" w:eastAsia="Arial" w:hAnsi="Arial"/>
-          <w:b/>
-          <w:bCs/>
-          <w:sz w:val="24"/>
-          <w:szCs w:val="24"/>
-        </w:rPr>
-        <w:t xml:space="preserve">A voluntary Digital Awareness Week once per term: </w:t>
-      </w:r>
-      <w:r>
-        <w:rPr>
-          <w:rFonts w:ascii="Arial" w:cs="Arial" w:eastAsia="Arial" w:hAnsi="Arial"/>
-          <w:sz w:val="24"/>
-          <w:szCs w:val="24"/>
-        </w:rPr>
-        <w:t xml:space="preserve">Students and staff reduce social media use for five days and reflect on the experience in a structured way, sharing observations in class.</w:t>
-      </w:r>
-    </w:p>
-    <w:p>
-      <w:pPr>
-        <w:spacing w:after="80" w:before="40" w:line="276" w:lineRule="auto"/>
-        <w:jc w:val="both"/>
-      </w:pPr>
-      <w:r>
-        <w:rPr>
-          <w:rFonts w:ascii="Arial" w:cs="Arial" w:eastAsia="Arial" w:hAnsi="Arial"/>
-          <w:b/>
-          <w:bCs/>
-          <w:sz w:val="24"/>
-          <w:szCs w:val="24"/>
-        </w:rPr>
-        <w:t xml:space="preserve">A parent information evening: </w:t>
-      </w:r>
-      <w:r>
-        <w:rPr>
-          <w:rFonts w:ascii="Arial" w:cs="Arial" w:eastAsia="Arial" w:hAnsi="Arial"/>
-          <w:sz w:val="24"/>
-          <w:szCs w:val="24"/>
-        </w:rPr>
-        <w:t xml:space="preserve">A brief session introducing parents to the concept of persuasive design and providing practical guidance for supporting healthy phone habits at home.</w:t>
-      </w:r>
-    </w:p>
-    <w:p>
-      <w:pPr>
-        <w:spacing w:after="60" w:before="0"/>
-      </w:pPr>
-      <w:r>
-        <w:rPr>
-          <w:rFonts w:ascii="Arial" w:cs="Arial" w:eastAsia="Arial" w:hAnsi="Arial"/>
-          <w:sz w:val="24"/>
-          <w:szCs w:val="24"/>
-        </w:rPr>
-        <w:t xml:space="preserve"/>
-      </w:r>
-    </w:p>
-    <w:p>
-      <w:pPr>
-        <w:spacing w:after="120" w:before="0" w:line="276" w:lineRule="auto"/>
-        <w:jc w:val="both"/>
-      </w:pPr>
-      <w:r>
-        <w:rPr>
-          <w:rFonts w:ascii="Arial" w:cs="Arial" w:eastAsia="Arial" w:hAnsi="Arial"/>
-          <w:sz w:val="24"/>
-          <w:szCs w:val="24"/>
-        </w:rPr>
-        <w:t xml:space="preserve">The campaign does not ask students to quit social media. It asks them to understand it. A young person who understands that their attention is being deliberately harvested is in a substantially better position to protect it. That is a realistic, ethical, and empowering goal.</w:t>
+        <w:t xml:space="preserve">The campaign does not ask students to quit social media. It asks them to understand it. A young person who knows their attention is being deliberately harvested is in a much better position to protect it.</w:t>
       </w:r>
     </w:p>
     <w:p>
@@ -3790,11 +3611,11 @@
           <w:rFonts w:ascii="Arial" w:cs="Arial" w:eastAsia="Arial" w:hAnsi="Arial"/>
           <w:i/>
           <w:iCs/>
-          <w:color w:val="888888"/>
+          <w:color w:val="666666"/>
           <w:sz w:val="20"/>
           <w:szCs w:val="20"/>
         </w:rPr>
-        <w:t xml:space="preserve">VISUAL 10 – Insert sample #ScrollSmarter poster or infographic for display around the school</w:t>
+        <w:t xml:space="preserve">VISUAL 10 – Insert sample #ScrollSmarter poster or infographic</w:t>
       </w:r>
     </w:p>
     <w:p>
@@ -3805,14 +3626,13 @@
     <w:p>
       <w:pPr>
         <w:pStyle w:val="Heading1"/>
-        <w:spacing w:after="160" w:before="320"/>
-      </w:pPr>
-      <w:r>
-        <w:rPr>
-          <w:rFonts w:ascii="Arial" w:cs="Arial" w:eastAsia="Arial" w:hAnsi="Arial"/>
-          <w:b/>
-          <w:bCs/>
-          <w:color w:val="1F3864"/>
+        <w:spacing w:after="160" w:before="360"/>
+      </w:pPr>
+      <w:r>
+        <w:rPr>
+          <w:rFonts w:ascii="Arial" w:cs="Arial" w:eastAsia="Arial" w:hAnsi="Arial"/>
+          <w:b/>
+          <w:bCs/>
           <w:sz w:val="28"/>
           <w:szCs w:val="28"/>
         </w:rPr>
@@ -4119,14 +3939,13 @@
     <w:p>
       <w:pPr>
         <w:pStyle w:val="Heading1"/>
-        <w:spacing w:after="160" w:before="320"/>
-      </w:pPr>
-      <w:r>
-        <w:rPr>
-          <w:rFonts w:ascii="Arial" w:cs="Arial" w:eastAsia="Arial" w:hAnsi="Arial"/>
-          <w:b/>
-          <w:bCs/>
-          <w:color w:val="1F3864"/>
+        <w:spacing w:after="160" w:before="360"/>
+      </w:pPr>
+      <w:r>
+        <w:rPr>
+          <w:rFonts w:ascii="Arial" w:cs="Arial" w:eastAsia="Arial" w:hAnsi="Arial"/>
+          <w:b/>
+          <w:bCs/>
           <w:sz w:val="28"/>
           <w:szCs w:val="28"/>
         </w:rPr>
@@ -4170,12 +3989,12 @@
           <w:tcPr>
             <w:tcW w:type="dxa" w:w="2400"/>
             <w:tcBorders>
-              <w:top w:val="single" w:color="AAAAAA" w:sz="1"/>
-              <w:left w:val="single" w:color="AAAAAA" w:sz="1"/>
-              <w:bottom w:val="single" w:color="AAAAAA" w:sz="1"/>
-              <w:right w:val="single" w:color="AAAAAA" w:sz="1"/>
+              <w:top w:val="single" w:color="000000" w:sz="1"/>
+              <w:left w:val="single" w:color="000000" w:sz="1"/>
+              <w:bottom w:val="single" w:color="000000" w:sz="1"/>
+              <w:right w:val="single" w:color="000000" w:sz="1"/>
             </w:tcBorders>
-            <w:shd w:fill="1F3864" w:val="clear"/>
+            <w:shd w:fill="000000" w:val="clear"/>
             <w:tcMar>
               <w:top w:type="dxa" w:w="80"/>
               <w:left w:type="dxa" w:w="120"/>
@@ -4201,12 +4020,12 @@
           <w:tcPr>
             <w:tcW w:type="dxa" w:w="1556"/>
             <w:tcBorders>
-              <w:top w:val="single" w:color="AAAAAA" w:sz="1"/>
-              <w:left w:val="single" w:color="AAAAAA" w:sz="1"/>
-              <w:bottom w:val="single" w:color="AAAAAA" w:sz="1"/>
-              <w:right w:val="single" w:color="AAAAAA" w:sz="1"/>
+              <w:top w:val="single" w:color="000000" w:sz="1"/>
+              <w:left w:val="single" w:color="000000" w:sz="1"/>
+              <w:bottom w:val="single" w:color="000000" w:sz="1"/>
+              <w:right w:val="single" w:color="000000" w:sz="1"/>
             </w:tcBorders>
-            <w:shd w:fill="1F3864" w:val="clear"/>
+            <w:shd w:fill="000000" w:val="clear"/>
             <w:tcMar>
               <w:top w:type="dxa" w:w="80"/>
               <w:left w:type="dxa" w:w="120"/>
@@ -4232,12 +4051,12 @@
           <w:tcPr>
             <w:tcW w:type="dxa" w:w="1556"/>
             <w:tcBorders>
-              <w:top w:val="single" w:color="AAAAAA" w:sz="1"/>
-              <w:left w:val="single" w:color="AAAAAA" w:sz="1"/>
-              <w:bottom w:val="single" w:color="AAAAAA" w:sz="1"/>
-              <w:right w:val="single" w:color="AAAAAA" w:sz="1"/>
+              <w:top w:val="single" w:color="000000" w:sz="1"/>
+              <w:left w:val="single" w:color="000000" w:sz="1"/>
+              <w:bottom w:val="single" w:color="000000" w:sz="1"/>
+              <w:right w:val="single" w:color="000000" w:sz="1"/>
             </w:tcBorders>
-            <w:shd w:fill="1F3864" w:val="clear"/>
+            <w:shd w:fill="000000" w:val="clear"/>
             <w:tcMar>
               <w:top w:type="dxa" w:w="80"/>
               <w:left w:type="dxa" w:w="120"/>
@@ -4263,12 +4082,12 @@
           <w:tcPr>
             <w:tcW w:type="dxa" w:w="1557"/>
             <w:tcBorders>
-              <w:top w:val="single" w:color="AAAAAA" w:sz="1"/>
-              <w:left w:val="single" w:color="AAAAAA" w:sz="1"/>
-              <w:bottom w:val="single" w:color="AAAAAA" w:sz="1"/>
-              <w:right w:val="single" w:color="AAAAAA" w:sz="1"/>
+              <w:top w:val="single" w:color="000000" w:sz="1"/>
+              <w:left w:val="single" w:color="000000" w:sz="1"/>
+              <w:bottom w:val="single" w:color="000000" w:sz="1"/>
+              <w:right w:val="single" w:color="000000" w:sz="1"/>
             </w:tcBorders>
-            <w:shd w:fill="1F3864" w:val="clear"/>
+            <w:shd w:fill="000000" w:val="clear"/>
             <w:tcMar>
               <w:top w:type="dxa" w:w="80"/>
               <w:left w:type="dxa" w:w="120"/>
@@ -4294,12 +4113,12 @@
           <w:tcPr>
             <w:tcW w:type="dxa" w:w="1957"/>
             <w:tcBorders>
-              <w:top w:val="single" w:color="AAAAAA" w:sz="1"/>
-              <w:left w:val="single" w:color="AAAAAA" w:sz="1"/>
-              <w:bottom w:val="single" w:color="AAAAAA" w:sz="1"/>
-              <w:right w:val="single" w:color="AAAAAA" w:sz="1"/>
+              <w:top w:val="single" w:color="000000" w:sz="1"/>
+              <w:left w:val="single" w:color="000000" w:sz="1"/>
+              <w:bottom w:val="single" w:color="000000" w:sz="1"/>
+              <w:right w:val="single" w:color="000000" w:sz="1"/>
             </w:tcBorders>
-            <w:shd w:fill="1F3864" w:val="clear"/>
+            <w:shd w:fill="000000" w:val="clear"/>
             <w:tcMar>
               <w:top w:type="dxa" w:w="80"/>
               <w:left w:type="dxa" w:w="120"/>
@@ -4327,12 +4146,12 @@
           <w:tcPr>
             <w:tcW w:type="dxa" w:w="2400"/>
             <w:tcBorders>
-              <w:top w:val="single" w:color="AAAAAA" w:sz="1"/>
-              <w:left w:val="single" w:color="AAAAAA" w:sz="1"/>
-              <w:bottom w:val="single" w:color="AAAAAA" w:sz="1"/>
-              <w:right w:val="single" w:color="AAAAAA" w:sz="1"/>
+              <w:top w:val="single" w:color="000000" w:sz="1"/>
+              <w:left w:val="single" w:color="000000" w:sz="1"/>
+              <w:bottom w:val="single" w:color="000000" w:sz="1"/>
+              <w:right w:val="single" w:color="000000" w:sz="1"/>
             </w:tcBorders>
-            <w:shd w:fill="EEF2F7" w:val="clear"/>
+            <w:shd w:fill="F2F2F2" w:val="clear"/>
             <w:tcMar>
               <w:top w:type="dxa" w:w="80"/>
               <w:left w:type="dxa" w:w="120"/>
@@ -4356,10 +4175,10 @@
           <w:tcPr>
             <w:tcW w:type="dxa" w:w="1556"/>
             <w:tcBorders>
-              <w:top w:val="single" w:color="AAAAAA" w:sz="1"/>
-              <w:left w:val="single" w:color="AAAAAA" w:sz="1"/>
-              <w:bottom w:val="single" w:color="AAAAAA" w:sz="1"/>
-              <w:right w:val="single" w:color="AAAAAA" w:sz="1"/>
+              <w:top w:val="single" w:color="000000" w:sz="1"/>
+              <w:left w:val="single" w:color="000000" w:sz="1"/>
+              <w:bottom w:val="single" w:color="000000" w:sz="1"/>
+              <w:right w:val="single" w:color="000000" w:sz="1"/>
             </w:tcBorders>
             <w:tcMar>
               <w:top w:type="dxa" w:w="80"/>
@@ -4383,10 +4202,10 @@
           <w:tcPr>
             <w:tcW w:type="dxa" w:w="1556"/>
             <w:tcBorders>
-              <w:top w:val="single" w:color="AAAAAA" w:sz="1"/>
-              <w:left w:val="single" w:color="AAAAAA" w:sz="1"/>
-              <w:bottom w:val="single" w:color="AAAAAA" w:sz="1"/>
-              <w:right w:val="single" w:color="AAAAAA" w:sz="1"/>
+              <w:top w:val="single" w:color="000000" w:sz="1"/>
+              <w:left w:val="single" w:color="000000" w:sz="1"/>
+              <w:bottom w:val="single" w:color="000000" w:sz="1"/>
+              <w:right w:val="single" w:color="000000" w:sz="1"/>
             </w:tcBorders>
             <w:tcMar>
               <w:top w:type="dxa" w:w="80"/>
@@ -4410,10 +4229,10 @@
           <w:tcPr>
             <w:tcW w:type="dxa" w:w="1557"/>
             <w:tcBorders>
-              <w:top w:val="single" w:color="AAAAAA" w:sz="1"/>
-              <w:left w:val="single" w:color="AAAAAA" w:sz="1"/>
-              <w:bottom w:val="single" w:color="AAAAAA" w:sz="1"/>
-              <w:right w:val="single" w:color="AAAAAA" w:sz="1"/>
+              <w:top w:val="single" w:color="000000" w:sz="1"/>
+              <w:left w:val="single" w:color="000000" w:sz="1"/>
+              <w:bottom w:val="single" w:color="000000" w:sz="1"/>
+              <w:right w:val="single" w:color="000000" w:sz="1"/>
             </w:tcBorders>
             <w:tcMar>
               <w:top w:type="dxa" w:w="80"/>
@@ -4437,10 +4256,10 @@
           <w:tcPr>
             <w:tcW w:type="dxa" w:w="1957"/>
             <w:tcBorders>
-              <w:top w:val="single" w:color="AAAAAA" w:sz="1"/>
-              <w:left w:val="single" w:color="AAAAAA" w:sz="1"/>
-              <w:bottom w:val="single" w:color="AAAAAA" w:sz="1"/>
-              <w:right w:val="single" w:color="AAAAAA" w:sz="1"/>
+              <w:top w:val="single" w:color="000000" w:sz="1"/>
+              <w:left w:val="single" w:color="000000" w:sz="1"/>
+              <w:bottom w:val="single" w:color="000000" w:sz="1"/>
+              <w:right w:val="single" w:color="000000" w:sz="1"/>
             </w:tcBorders>
             <w:tcMar>
               <w:top w:type="dxa" w:w="80"/>
@@ -4466,12 +4285,12 @@
           <w:tcPr>
             <w:tcW w:type="dxa" w:w="2400"/>
             <w:tcBorders>
-              <w:top w:val="single" w:color="AAAAAA" w:sz="1"/>
-              <w:left w:val="single" w:color="AAAAAA" w:sz="1"/>
-              <w:bottom w:val="single" w:color="AAAAAA" w:sz="1"/>
-              <w:right w:val="single" w:color="AAAAAA" w:sz="1"/>
+              <w:top w:val="single" w:color="000000" w:sz="1"/>
+              <w:left w:val="single" w:color="000000" w:sz="1"/>
+              <w:bottom w:val="single" w:color="000000" w:sz="1"/>
+              <w:right w:val="single" w:color="000000" w:sz="1"/>
             </w:tcBorders>
-            <w:shd w:fill="EEF2F7" w:val="clear"/>
+            <w:shd w:fill="F2F2F2" w:val="clear"/>
             <w:tcMar>
               <w:top w:type="dxa" w:w="80"/>
               <w:left w:type="dxa" w:w="120"/>
@@ -4495,10 +4314,10 @@
           <w:tcPr>
             <w:tcW w:type="dxa" w:w="1556"/>
             <w:tcBorders>
-              <w:top w:val="single" w:color="AAAAAA" w:sz="1"/>
-              <w:left w:val="single" w:color="AAAAAA" w:sz="1"/>
-              <w:bottom w:val="single" w:color="AAAAAA" w:sz="1"/>
-              <w:right w:val="single" w:color="AAAAAA" w:sz="1"/>
+              <w:top w:val="single" w:color="000000" w:sz="1"/>
+              <w:left w:val="single" w:color="000000" w:sz="1"/>
+              <w:bottom w:val="single" w:color="000000" w:sz="1"/>
+              <w:right w:val="single" w:color="000000" w:sz="1"/>
             </w:tcBorders>
             <w:tcMar>
               <w:top w:type="dxa" w:w="80"/>
@@ -4522,10 +4341,10 @@
           <w:tcPr>
             <w:tcW w:type="dxa" w:w="1556"/>
             <w:tcBorders>
-              <w:top w:val="single" w:color="AAAAAA" w:sz="1"/>
-              <w:left w:val="single" w:color="AAAAAA" w:sz="1"/>
-              <w:bottom w:val="single" w:color="AAAAAA" w:sz="1"/>
-              <w:right w:val="single" w:color="AAAAAA" w:sz="1"/>
+              <w:top w:val="single" w:color="000000" w:sz="1"/>
+              <w:left w:val="single" w:color="000000" w:sz="1"/>
+              <w:bottom w:val="single" w:color="000000" w:sz="1"/>
+              <w:right w:val="single" w:color="000000" w:sz="1"/>
             </w:tcBorders>
             <w:tcMar>
               <w:top w:type="dxa" w:w="80"/>
@@ -4549,10 +4368,10 @@
           <w:tcPr>
             <w:tcW w:type="dxa" w:w="1557"/>
             <w:tcBorders>
-              <w:top w:val="single" w:color="AAAAAA" w:sz="1"/>
-              <w:left w:val="single" w:color="AAAAAA" w:sz="1"/>
-              <w:bottom w:val="single" w:color="AAAAAA" w:sz="1"/>
-              <w:right w:val="single" w:color="AAAAAA" w:sz="1"/>
+              <w:top w:val="single" w:color="000000" w:sz="1"/>
+              <w:left w:val="single" w:color="000000" w:sz="1"/>
+              <w:bottom w:val="single" w:color="000000" w:sz="1"/>
+              <w:right w:val="single" w:color="000000" w:sz="1"/>
             </w:tcBorders>
             <w:tcMar>
               <w:top w:type="dxa" w:w="80"/>
@@ -4576,10 +4395,10 @@
           <w:tcPr>
             <w:tcW w:type="dxa" w:w="1957"/>
             <w:tcBorders>
-              <w:top w:val="single" w:color="AAAAAA" w:sz="1"/>
-              <w:left w:val="single" w:color="AAAAAA" w:sz="1"/>
-              <w:bottom w:val="single" w:color="AAAAAA" w:sz="1"/>
-              <w:right w:val="single" w:color="AAAAAA" w:sz="1"/>
+              <w:top w:val="single" w:color="000000" w:sz="1"/>
+              <w:left w:val="single" w:color="000000" w:sz="1"/>
+              <w:bottom w:val="single" w:color="000000" w:sz="1"/>
+              <w:right w:val="single" w:color="000000" w:sz="1"/>
             </w:tcBorders>
             <w:tcMar>
               <w:top w:type="dxa" w:w="80"/>
@@ -4605,12 +4424,12 @@
           <w:tcPr>
             <w:tcW w:type="dxa" w:w="2400"/>
             <w:tcBorders>
-              <w:top w:val="single" w:color="AAAAAA" w:sz="1"/>
-              <w:left w:val="single" w:color="AAAAAA" w:sz="1"/>
-              <w:bottom w:val="single" w:color="AAAAAA" w:sz="1"/>
-              <w:right w:val="single" w:color="AAAAAA" w:sz="1"/>
+              <w:top w:val="single" w:color="000000" w:sz="1"/>
+              <w:left w:val="single" w:color="000000" w:sz="1"/>
+              <w:bottom w:val="single" w:color="000000" w:sz="1"/>
+              <w:right w:val="single" w:color="000000" w:sz="1"/>
             </w:tcBorders>
-            <w:shd w:fill="EEF2F7" w:val="clear"/>
+            <w:shd w:fill="F2F2F2" w:val="clear"/>
             <w:tcMar>
               <w:top w:type="dxa" w:w="80"/>
               <w:left w:type="dxa" w:w="120"/>
@@ -4634,10 +4453,10 @@
           <w:tcPr>
             <w:tcW w:type="dxa" w:w="1556"/>
             <w:tcBorders>
-              <w:top w:val="single" w:color="AAAAAA" w:sz="1"/>
-              <w:left w:val="single" w:color="AAAAAA" w:sz="1"/>
-              <w:bottom w:val="single" w:color="AAAAAA" w:sz="1"/>
-              <w:right w:val="single" w:color="AAAAAA" w:sz="1"/>
+              <w:top w:val="single" w:color="000000" w:sz="1"/>
+              <w:left w:val="single" w:color="000000" w:sz="1"/>
+              <w:bottom w:val="single" w:color="000000" w:sz="1"/>
+              <w:right w:val="single" w:color="000000" w:sz="1"/>
             </w:tcBorders>
             <w:tcMar>
               <w:top w:type="dxa" w:w="80"/>
@@ -4661,10 +4480,10 @@
           <w:tcPr>
             <w:tcW w:type="dxa" w:w="1556"/>
             <w:tcBorders>
-              <w:top w:val="single" w:color="AAAAAA" w:sz="1"/>
-              <w:left w:val="single" w:color="AAAAAA" w:sz="1"/>
-              <w:bottom w:val="single" w:color="AAAAAA" w:sz="1"/>
-              <w:right w:val="single" w:color="AAAAAA" w:sz="1"/>
+              <w:top w:val="single" w:color="000000" w:sz="1"/>
+              <w:left w:val="single" w:color="000000" w:sz="1"/>
+              <w:bottom w:val="single" w:color="000000" w:sz="1"/>
+              <w:right w:val="single" w:color="000000" w:sz="1"/>
             </w:tcBorders>
             <w:tcMar>
               <w:top w:type="dxa" w:w="80"/>
@@ -4688,10 +4507,10 @@
           <w:tcPr>
             <w:tcW w:type="dxa" w:w="1557"/>
             <w:tcBorders>
-              <w:top w:val="single" w:color="AAAAAA" w:sz="1"/>
-              <w:left w:val="single" w:color="AAAAAA" w:sz="1"/>
-              <w:bottom w:val="single" w:color="AAAAAA" w:sz="1"/>
-              <w:right w:val="single" w:color="AAAAAA" w:sz="1"/>
+              <w:top w:val="single" w:color="000000" w:sz="1"/>
+              <w:left w:val="single" w:color="000000" w:sz="1"/>
+              <w:bottom w:val="single" w:color="000000" w:sz="1"/>
+              <w:right w:val="single" w:color="000000" w:sz="1"/>
             </w:tcBorders>
             <w:tcMar>
               <w:top w:type="dxa" w:w="80"/>
@@ -4715,10 +4534,10 @@
           <w:tcPr>
             <w:tcW w:type="dxa" w:w="1957"/>
             <w:tcBorders>
-              <w:top w:val="single" w:color="AAAAAA" w:sz="1"/>
-              <w:left w:val="single" w:color="AAAAAA" w:sz="1"/>
-              <w:bottom w:val="single" w:color="AAAAAA" w:sz="1"/>
-              <w:right w:val="single" w:color="AAAAAA" w:sz="1"/>
+              <w:top w:val="single" w:color="000000" w:sz="1"/>
+              <w:left w:val="single" w:color="000000" w:sz="1"/>
+              <w:bottom w:val="single" w:color="000000" w:sz="1"/>
+              <w:right w:val="single" w:color="000000" w:sz="1"/>
             </w:tcBorders>
             <w:tcMar>
               <w:top w:type="dxa" w:w="80"/>
@@ -4744,12 +4563,12 @@
           <w:tcPr>
             <w:tcW w:type="dxa" w:w="2400"/>
             <w:tcBorders>
-              <w:top w:val="single" w:color="AAAAAA" w:sz="1"/>
-              <w:left w:val="single" w:color="AAAAAA" w:sz="1"/>
-              <w:bottom w:val="single" w:color="AAAAAA" w:sz="1"/>
-              <w:right w:val="single" w:color="AAAAAA" w:sz="1"/>
+              <w:top w:val="single" w:color="000000" w:sz="1"/>
+              <w:left w:val="single" w:color="000000" w:sz="1"/>
+              <w:bottom w:val="single" w:color="000000" w:sz="1"/>
+              <w:right w:val="single" w:color="000000" w:sz="1"/>
             </w:tcBorders>
-            <w:shd w:fill="EEF2F7" w:val="clear"/>
+            <w:shd w:fill="F2F2F2" w:val="clear"/>
             <w:tcMar>
               <w:top w:type="dxa" w:w="80"/>
               <w:left w:type="dxa" w:w="120"/>
@@ -4773,10 +4592,10 @@
           <w:tcPr>
             <w:tcW w:type="dxa" w:w="1556"/>
             <w:tcBorders>
-              <w:top w:val="single" w:color="AAAAAA" w:sz="1"/>
-              <w:left w:val="single" w:color="AAAAAA" w:sz="1"/>
-              <w:bottom w:val="single" w:color="AAAAAA" w:sz="1"/>
-              <w:right w:val="single" w:color="AAAAAA" w:sz="1"/>
+              <w:top w:val="single" w:color="000000" w:sz="1"/>
+              <w:left w:val="single" w:color="000000" w:sz="1"/>
+              <w:bottom w:val="single" w:color="000000" w:sz="1"/>
+              <w:right w:val="single" w:color="000000" w:sz="1"/>
             </w:tcBorders>
             <w:tcMar>
               <w:top w:type="dxa" w:w="80"/>
@@ -4800,10 +4619,10 @@
           <w:tcPr>
             <w:tcW w:type="dxa" w:w="1556"/>
             <w:tcBorders>
-              <w:top w:val="single" w:color="AAAAAA" w:sz="1"/>
-              <w:left w:val="single" w:color="AAAAAA" w:sz="1"/>
-              <w:bottom w:val="single" w:color="AAAAAA" w:sz="1"/>
-              <w:right w:val="single" w:color="AAAAAA" w:sz="1"/>
+              <w:top w:val="single" w:color="000000" w:sz="1"/>
+              <w:left w:val="single" w:color="000000" w:sz="1"/>
+              <w:bottom w:val="single" w:color="000000" w:sz="1"/>
+              <w:right w:val="single" w:color="000000" w:sz="1"/>
             </w:tcBorders>
             <w:tcMar>
               <w:top w:type="dxa" w:w="80"/>
@@ -4827,10 +4646,10 @@
           <w:tcPr>
             <w:tcW w:type="dxa" w:w="1557"/>
             <w:tcBorders>
-              <w:top w:val="single" w:color="AAAAAA" w:sz="1"/>
-              <w:left w:val="single" w:color="AAAAAA" w:sz="1"/>
-              <w:bottom w:val="single" w:color="AAAAAA" w:sz="1"/>
-              <w:right w:val="single" w:color="AAAAAA" w:sz="1"/>
+              <w:top w:val="single" w:color="000000" w:sz="1"/>
+              <w:left w:val="single" w:color="000000" w:sz="1"/>
+              <w:bottom w:val="single" w:color="000000" w:sz="1"/>
+              <w:right w:val="single" w:color="000000" w:sz="1"/>
             </w:tcBorders>
             <w:tcMar>
               <w:top w:type="dxa" w:w="80"/>
@@ -4854,10 +4673,10 @@
           <w:tcPr>
             <w:tcW w:type="dxa" w:w="1957"/>
             <w:tcBorders>
-              <w:top w:val="single" w:color="AAAAAA" w:sz="1"/>
-              <w:left w:val="single" w:color="AAAAAA" w:sz="1"/>
-              <w:bottom w:val="single" w:color="AAAAAA" w:sz="1"/>
-              <w:right w:val="single" w:color="AAAAAA" w:sz="1"/>
+              <w:top w:val="single" w:color="000000" w:sz="1"/>
+              <w:left w:val="single" w:color="000000" w:sz="1"/>
+              <w:bottom w:val="single" w:color="000000" w:sz="1"/>
+              <w:right w:val="single" w:color="000000" w:sz="1"/>
             </w:tcBorders>
             <w:tcMar>
               <w:top w:type="dxa" w:w="80"/>
@@ -4883,12 +4702,12 @@
           <w:tcPr>
             <w:tcW w:type="dxa" w:w="2400"/>
             <w:tcBorders>
-              <w:top w:val="single" w:color="AAAAAA" w:sz="1"/>
-              <w:left w:val="single" w:color="AAAAAA" w:sz="1"/>
-              <w:bottom w:val="single" w:color="AAAAAA" w:sz="1"/>
-              <w:right w:val="single" w:color="AAAAAA" w:sz="1"/>
+              <w:top w:val="single" w:color="000000" w:sz="1"/>
+              <w:left w:val="single" w:color="000000" w:sz="1"/>
+              <w:bottom w:val="single" w:color="000000" w:sz="1"/>
+              <w:right w:val="single" w:color="000000" w:sz="1"/>
             </w:tcBorders>
-            <w:shd w:fill="EEF2F7" w:val="clear"/>
+            <w:shd w:fill="F2F2F2" w:val="clear"/>
             <w:tcMar>
               <w:top w:type="dxa" w:w="80"/>
               <w:left w:type="dxa" w:w="120"/>
@@ -4912,10 +4731,10 @@
           <w:tcPr>
             <w:tcW w:type="dxa" w:w="1556"/>
             <w:tcBorders>
-              <w:top w:val="single" w:color="AAAAAA" w:sz="1"/>
-              <w:left w:val="single" w:color="AAAAAA" w:sz="1"/>
-              <w:bottom w:val="single" w:color="AAAAAA" w:sz="1"/>
-              <w:right w:val="single" w:color="AAAAAA" w:sz="1"/>
+              <w:top w:val="single" w:color="000000" w:sz="1"/>
+              <w:left w:val="single" w:color="000000" w:sz="1"/>
+              <w:bottom w:val="single" w:color="000000" w:sz="1"/>
+              <w:right w:val="single" w:color="000000" w:sz="1"/>
             </w:tcBorders>
             <w:tcMar>
               <w:top w:type="dxa" w:w="80"/>
@@ -4939,10 +4758,10 @@
           <w:tcPr>
             <w:tcW w:type="dxa" w:w="1556"/>
             <w:tcBorders>
-              <w:top w:val="single" w:color="AAAAAA" w:sz="1"/>
-              <w:left w:val="single" w:color="AAAAAA" w:sz="1"/>
-              <w:bottom w:val="single" w:color="AAAAAA" w:sz="1"/>
-              <w:right w:val="single" w:color="AAAAAA" w:sz="1"/>
+              <w:top w:val="single" w:color="000000" w:sz="1"/>
+              <w:left w:val="single" w:color="000000" w:sz="1"/>
+              <w:bottom w:val="single" w:color="000000" w:sz="1"/>
+              <w:right w:val="single" w:color="000000" w:sz="1"/>
             </w:tcBorders>
             <w:tcMar>
               <w:top w:type="dxa" w:w="80"/>
@@ -4966,10 +4785,10 @@
           <w:tcPr>
             <w:tcW w:type="dxa" w:w="1557"/>
             <w:tcBorders>
-              <w:top w:val="single" w:color="AAAAAA" w:sz="1"/>
-              <w:left w:val="single" w:color="AAAAAA" w:sz="1"/>
-              <w:bottom w:val="single" w:color="AAAAAA" w:sz="1"/>
-              <w:right w:val="single" w:color="AAAAAA" w:sz="1"/>
+              <w:top w:val="single" w:color="000000" w:sz="1"/>
+              <w:left w:val="single" w:color="000000" w:sz="1"/>
+              <w:bottom w:val="single" w:color="000000" w:sz="1"/>
+              <w:right w:val="single" w:color="000000" w:sz="1"/>
             </w:tcBorders>
             <w:tcMar>
               <w:top w:type="dxa" w:w="80"/>
@@ -4993,10 +4812,10 @@
           <w:tcPr>
             <w:tcW w:type="dxa" w:w="1957"/>
             <w:tcBorders>
-              <w:top w:val="single" w:color="AAAAAA" w:sz="1"/>
-              <w:left w:val="single" w:color="AAAAAA" w:sz="1"/>
-              <w:bottom w:val="single" w:color="AAAAAA" w:sz="1"/>
-              <w:right w:val="single" w:color="AAAAAA" w:sz="1"/>
+              <w:top w:val="single" w:color="000000" w:sz="1"/>
+              <w:left w:val="single" w:color="000000" w:sz="1"/>
+              <w:bottom w:val="single" w:color="000000" w:sz="1"/>
+              <w:right w:val="single" w:color="000000" w:sz="1"/>
             </w:tcBorders>
             <w:tcMar>
               <w:top w:type="dxa" w:w="80"/>
@@ -5022,12 +4841,12 @@
           <w:tcPr>
             <w:tcW w:type="dxa" w:w="2400"/>
             <w:tcBorders>
-              <w:top w:val="single" w:color="AAAAAA" w:sz="1"/>
-              <w:left w:val="single" w:color="AAAAAA" w:sz="1"/>
-              <w:bottom w:val="single" w:color="AAAAAA" w:sz="1"/>
-              <w:right w:val="single" w:color="AAAAAA" w:sz="1"/>
+              <w:top w:val="single" w:color="000000" w:sz="1"/>
+              <w:left w:val="single" w:color="000000" w:sz="1"/>
+              <w:bottom w:val="single" w:color="000000" w:sz="1"/>
+              <w:right w:val="single" w:color="000000" w:sz="1"/>
             </w:tcBorders>
-            <w:shd w:fill="EEF2F7" w:val="clear"/>
+            <w:shd w:fill="F2F2F2" w:val="clear"/>
             <w:tcMar>
               <w:top w:type="dxa" w:w="80"/>
               <w:left w:type="dxa" w:w="120"/>
@@ -5050,10 +4869,10 @@
           <w:tcPr>
             <w:tcW w:type="dxa" w:w="1556"/>
             <w:tcBorders>
-              <w:top w:val="single" w:color="AAAAAA" w:sz="1"/>
-              <w:left w:val="single" w:color="AAAAAA" w:sz="1"/>
-              <w:bottom w:val="single" w:color="AAAAAA" w:sz="1"/>
-              <w:right w:val="single" w:color="AAAAAA" w:sz="1"/>
+              <w:top w:val="single" w:color="000000" w:sz="1"/>
+              <w:left w:val="single" w:color="000000" w:sz="1"/>
+              <w:bottom w:val="single" w:color="000000" w:sz="1"/>
+              <w:right w:val="single" w:color="000000" w:sz="1"/>
             </w:tcBorders>
             <w:tcMar>
               <w:top w:type="dxa" w:w="80"/>
@@ -5077,10 +4896,10 @@
           <w:tcPr>
             <w:tcW w:type="dxa" w:w="1556"/>
             <w:tcBorders>
-              <w:top w:val="single" w:color="AAAAAA" w:sz="1"/>
-              <w:left w:val="single" w:color="AAAAAA" w:sz="1"/>
-              <w:bottom w:val="single" w:color="AAAAAA" w:sz="1"/>
-              <w:right w:val="single" w:color="AAAAAA" w:sz="1"/>
+              <w:top w:val="single" w:color="000000" w:sz="1"/>
+              <w:left w:val="single" w:color="000000" w:sz="1"/>
+              <w:bottom w:val="single" w:color="000000" w:sz="1"/>
+              <w:right w:val="single" w:color="000000" w:sz="1"/>
             </w:tcBorders>
             <w:tcMar>
               <w:top w:type="dxa" w:w="80"/>
@@ -5104,10 +4923,10 @@
           <w:tcPr>
             <w:tcW w:type="dxa" w:w="1557"/>
             <w:tcBorders>
-              <w:top w:val="single" w:color="AAAAAA" w:sz="1"/>
-              <w:left w:val="single" w:color="AAAAAA" w:sz="1"/>
-              <w:bottom w:val="single" w:color="AAAAAA" w:sz="1"/>
-              <w:right w:val="single" w:color="AAAAAA" w:sz="1"/>
+              <w:top w:val="single" w:color="000000" w:sz="1"/>
+              <w:left w:val="single" w:color="000000" w:sz="1"/>
+              <w:bottom w:val="single" w:color="000000" w:sz="1"/>
+              <w:right w:val="single" w:color="000000" w:sz="1"/>
             </w:tcBorders>
             <w:tcMar>
               <w:top w:type="dxa" w:w="80"/>
@@ -5131,10 +4950,10 @@
           <w:tcPr>
             <w:tcW w:type="dxa" w:w="1957"/>
             <w:tcBorders>
-              <w:top w:val="single" w:color="AAAAAA" w:sz="1"/>
-              <w:left w:val="single" w:color="AAAAAA" w:sz="1"/>
-              <w:bottom w:val="single" w:color="AAAAAA" w:sz="1"/>
-              <w:right w:val="single" w:color="AAAAAA" w:sz="1"/>
+              <w:top w:val="single" w:color="000000" w:sz="1"/>
+              <w:left w:val="single" w:color="000000" w:sz="1"/>
+              <w:bottom w:val="single" w:color="000000" w:sz="1"/>
+              <w:right w:val="single" w:color="000000" w:sz="1"/>
             </w:tcBorders>
             <w:tcMar>
               <w:top w:type="dxa" w:w="80"/>
@@ -5187,7 +5006,7 @@
     <w:p>
       <w:pPr>
         <w:pBdr>
-          <w:bottom w:val="single" w:color="AAAAAA" w:sz="1"/>
+          <w:bottom w:val="single" w:color="000000" w:sz="1"/>
         </w:pBdr>
         <w:spacing w:after="80" w:before="0"/>
       </w:pPr>
@@ -5203,7 +5022,7 @@
     <w:p>
       <w:pPr>
         <w:pBdr>
-          <w:bottom w:val="single" w:color="AAAAAA" w:sz="1"/>
+          <w:bottom w:val="single" w:color="000000" w:sz="1"/>
         </w:pBdr>
         <w:spacing w:after="80" w:before="0"/>
       </w:pPr>
@@ -5253,14 +5072,13 @@
     <w:p>
       <w:pPr>
         <w:pStyle w:val="Heading1"/>
-        <w:spacing w:after="160" w:before="320"/>
-      </w:pPr>
-      <w:r>
-        <w:rPr>
-          <w:rFonts w:ascii="Arial" w:cs="Arial" w:eastAsia="Arial" w:hAnsi="Arial"/>
-          <w:b/>
-          <w:bCs/>
-          <w:color w:val="1F3864"/>
+        <w:spacing w:after="160" w:before="360"/>
+      </w:pPr>
+      <w:r>
+        <w:rPr>
+          <w:rFonts w:ascii="Arial" w:cs="Arial" w:eastAsia="Arial" w:hAnsi="Arial"/>
+          <w:b/>
+          <w:bCs/>
           <w:sz w:val="28"/>
           <w:szCs w:val="28"/>
         </w:rPr>
@@ -5523,14 +5341,13 @@
     <w:p>
       <w:pPr>
         <w:pStyle w:val="Heading1"/>
-        <w:spacing w:after="160" w:before="320"/>
-      </w:pPr>
-      <w:r>
-        <w:rPr>
-          <w:rFonts w:ascii="Arial" w:cs="Arial" w:eastAsia="Arial" w:hAnsi="Arial"/>
-          <w:b/>
-          <w:bCs/>
-          <w:color w:val="1F3864"/>
+        <w:spacing w:after="160" w:before="360"/>
+      </w:pPr>
+      <w:r>
+        <w:rPr>
+          <w:rFonts w:ascii="Arial" w:cs="Arial" w:eastAsia="Arial" w:hAnsi="Arial"/>
+          <w:b/>
+          <w:bCs/>
           <w:sz w:val="28"/>
           <w:szCs w:val="28"/>
         </w:rPr>
@@ -5586,12 +5403,12 @@
           <w:tcPr>
             <w:tcW w:type="dxa" w:w="2800"/>
             <w:tcBorders>
-              <w:top w:val="single" w:color="AAAAAA" w:sz="1"/>
-              <w:left w:val="single" w:color="AAAAAA" w:sz="1"/>
-              <w:bottom w:val="single" w:color="AAAAAA" w:sz="1"/>
-              <w:right w:val="single" w:color="AAAAAA" w:sz="1"/>
+              <w:top w:val="single" w:color="000000" w:sz="1"/>
+              <w:left w:val="single" w:color="000000" w:sz="1"/>
+              <w:bottom w:val="single" w:color="000000" w:sz="1"/>
+              <w:right w:val="single" w:color="000000" w:sz="1"/>
             </w:tcBorders>
-            <w:shd w:fill="EEF2F7" w:val="clear"/>
+            <w:shd w:fill="F2F2F2" w:val="clear"/>
             <w:tcMar>
               <w:top w:type="dxa" w:w="80"/>
               <w:left w:type="dxa" w:w="120"/>
@@ -5616,10 +5433,10 @@
           <w:tcPr>
             <w:tcW w:type="dxa" w:w="6226"/>
             <w:tcBorders>
-              <w:top w:val="single" w:color="AAAAAA" w:sz="1"/>
-              <w:left w:val="single" w:color="AAAAAA" w:sz="1"/>
-              <w:bottom w:val="single" w:color="AAAAAA" w:sz="1"/>
-              <w:right w:val="single" w:color="AAAAAA" w:sz="1"/>
+              <w:top w:val="single" w:color="000000" w:sz="1"/>
+              <w:left w:val="single" w:color="000000" w:sz="1"/>
+              <w:bottom w:val="single" w:color="000000" w:sz="1"/>
+              <w:right w:val="single" w:color="000000" w:sz="1"/>
             </w:tcBorders>
             <w:tcMar>
               <w:top w:type="dxa" w:w="80"/>
@@ -5645,12 +5462,12 @@
           <w:tcPr>
             <w:tcW w:type="dxa" w:w="2800"/>
             <w:tcBorders>
-              <w:top w:val="single" w:color="AAAAAA" w:sz="1"/>
-              <w:left w:val="single" w:color="AAAAAA" w:sz="1"/>
-              <w:bottom w:val="single" w:color="AAAAAA" w:sz="1"/>
-              <w:right w:val="single" w:color="AAAAAA" w:sz="1"/>
+              <w:top w:val="single" w:color="000000" w:sz="1"/>
+              <w:left w:val="single" w:color="000000" w:sz="1"/>
+              <w:bottom w:val="single" w:color="000000" w:sz="1"/>
+              <w:right w:val="single" w:color="000000" w:sz="1"/>
             </w:tcBorders>
-            <w:shd w:fill="EEF2F7" w:val="clear"/>
+            <w:shd w:fill="F2F2F2" w:val="clear"/>
             <w:tcMar>
               <w:top w:type="dxa" w:w="80"/>
               <w:left w:type="dxa" w:w="120"/>
@@ -5675,10 +5492,10 @@
           <w:tcPr>
             <w:tcW w:type="dxa" w:w="6226"/>
             <w:tcBorders>
-              <w:top w:val="single" w:color="AAAAAA" w:sz="1"/>
-              <w:left w:val="single" w:color="AAAAAA" w:sz="1"/>
-              <w:bottom w:val="single" w:color="AAAAAA" w:sz="1"/>
-              <w:right w:val="single" w:color="AAAAAA" w:sz="1"/>
+              <w:top w:val="single" w:color="000000" w:sz="1"/>
+              <w:left w:val="single" w:color="000000" w:sz="1"/>
+              <w:bottom w:val="single" w:color="000000" w:sz="1"/>
+              <w:right w:val="single" w:color="000000" w:sz="1"/>
             </w:tcBorders>
             <w:tcMar>
               <w:top w:type="dxa" w:w="80"/>
@@ -5704,12 +5521,12 @@
           <w:tcPr>
             <w:tcW w:type="dxa" w:w="2800"/>
             <w:tcBorders>
-              <w:top w:val="single" w:color="AAAAAA" w:sz="1"/>
-              <w:left w:val="single" w:color="AAAAAA" w:sz="1"/>
-              <w:bottom w:val="single" w:color="AAAAAA" w:sz="1"/>
-              <w:right w:val="single" w:color="AAAAAA" w:sz="1"/>
+              <w:top w:val="single" w:color="000000" w:sz="1"/>
+              <w:left w:val="single" w:color="000000" w:sz="1"/>
+              <w:bottom w:val="single" w:color="000000" w:sz="1"/>
+              <w:right w:val="single" w:color="000000" w:sz="1"/>
             </w:tcBorders>
-            <w:shd w:fill="EEF2F7" w:val="clear"/>
+            <w:shd w:fill="F2F2F2" w:val="clear"/>
             <w:tcMar>
               <w:top w:type="dxa" w:w="80"/>
               <w:left w:type="dxa" w:w="120"/>
@@ -5734,10 +5551,10 @@
           <w:tcPr>
             <w:tcW w:type="dxa" w:w="6226"/>
             <w:tcBorders>
-              <w:top w:val="single" w:color="AAAAAA" w:sz="1"/>
-              <w:left w:val="single" w:color="AAAAAA" w:sz="1"/>
-              <w:bottom w:val="single" w:color="AAAAAA" w:sz="1"/>
-              <w:right w:val="single" w:color="AAAAAA" w:sz="1"/>
+              <w:top w:val="single" w:color="000000" w:sz="1"/>
+              <w:left w:val="single" w:color="000000" w:sz="1"/>
+              <w:bottom w:val="single" w:color="000000" w:sz="1"/>
+              <w:right w:val="single" w:color="000000" w:sz="1"/>
             </w:tcBorders>
             <w:tcMar>
               <w:top w:type="dxa" w:w="80"/>
@@ -5763,12 +5580,12 @@
           <w:tcPr>
             <w:tcW w:type="dxa" w:w="2800"/>
             <w:tcBorders>
-              <w:top w:val="single" w:color="AAAAAA" w:sz="1"/>
-              <w:left w:val="single" w:color="AAAAAA" w:sz="1"/>
-              <w:bottom w:val="single" w:color="AAAAAA" w:sz="1"/>
-              <w:right w:val="single" w:color="AAAAAA" w:sz="1"/>
+              <w:top w:val="single" w:color="000000" w:sz="1"/>
+              <w:left w:val="single" w:color="000000" w:sz="1"/>
+              <w:bottom w:val="single" w:color="000000" w:sz="1"/>
+              <w:right w:val="single" w:color="000000" w:sz="1"/>
             </w:tcBorders>
-            <w:shd w:fill="EEF2F7" w:val="clear"/>
+            <w:shd w:fill="F2F2F2" w:val="clear"/>
             <w:tcMar>
               <w:top w:type="dxa" w:w="80"/>
               <w:left w:type="dxa" w:w="120"/>
@@ -5793,10 +5610,10 @@
           <w:tcPr>
             <w:tcW w:type="dxa" w:w="6226"/>
             <w:tcBorders>
-              <w:top w:val="single" w:color="AAAAAA" w:sz="1"/>
-              <w:left w:val="single" w:color="AAAAAA" w:sz="1"/>
-              <w:bottom w:val="single" w:color="AAAAAA" w:sz="1"/>
-              <w:right w:val="single" w:color="AAAAAA" w:sz="1"/>
+              <w:top w:val="single" w:color="000000" w:sz="1"/>
+              <w:left w:val="single" w:color="000000" w:sz="1"/>
+              <w:bottom w:val="single" w:color="000000" w:sz="1"/>
+              <w:right w:val="single" w:color="000000" w:sz="1"/>
             </w:tcBorders>
             <w:tcMar>
               <w:top w:type="dxa" w:w="80"/>
@@ -5867,12 +5684,12 @@
           <w:tcPr>
             <w:tcW w:type="dxa" w:w="2800"/>
             <w:tcBorders>
-              <w:top w:val="single" w:color="AAAAAA" w:sz="1"/>
-              <w:left w:val="single" w:color="AAAAAA" w:sz="1"/>
-              <w:bottom w:val="single" w:color="AAAAAA" w:sz="1"/>
-              <w:right w:val="single" w:color="AAAAAA" w:sz="1"/>
+              <w:top w:val="single" w:color="000000" w:sz="1"/>
+              <w:left w:val="single" w:color="000000" w:sz="1"/>
+              <w:bottom w:val="single" w:color="000000" w:sz="1"/>
+              <w:right w:val="single" w:color="000000" w:sz="1"/>
             </w:tcBorders>
-            <w:shd w:fill="EEF2F7" w:val="clear"/>
+            <w:shd w:fill="F2F2F2" w:val="clear"/>
             <w:tcMar>
               <w:top w:type="dxa" w:w="80"/>
               <w:left w:type="dxa" w:w="120"/>
@@ -5897,10 +5714,10 @@
           <w:tcPr>
             <w:tcW w:type="dxa" w:w="6226"/>
             <w:tcBorders>
-              <w:top w:val="single" w:color="AAAAAA" w:sz="1"/>
-              <w:left w:val="single" w:color="AAAAAA" w:sz="1"/>
-              <w:bottom w:val="single" w:color="AAAAAA" w:sz="1"/>
-              <w:right w:val="single" w:color="AAAAAA" w:sz="1"/>
+              <w:top w:val="single" w:color="000000" w:sz="1"/>
+              <w:left w:val="single" w:color="000000" w:sz="1"/>
+              <w:bottom w:val="single" w:color="000000" w:sz="1"/>
+              <w:right w:val="single" w:color="000000" w:sz="1"/>
             </w:tcBorders>
             <w:tcMar>
               <w:top w:type="dxa" w:w="80"/>
@@ -5926,12 +5743,12 @@
           <w:tcPr>
             <w:tcW w:type="dxa" w:w="2800"/>
             <w:tcBorders>
-              <w:top w:val="single" w:color="AAAAAA" w:sz="1"/>
-              <w:left w:val="single" w:color="AAAAAA" w:sz="1"/>
-              <w:bottom w:val="single" w:color="AAAAAA" w:sz="1"/>
-              <w:right w:val="single" w:color="AAAAAA" w:sz="1"/>
+              <w:top w:val="single" w:color="000000" w:sz="1"/>
+              <w:left w:val="single" w:color="000000" w:sz="1"/>
+              <w:bottom w:val="single" w:color="000000" w:sz="1"/>
+              <w:right w:val="single" w:color="000000" w:sz="1"/>
             </w:tcBorders>
-            <w:shd w:fill="EEF2F7" w:val="clear"/>
+            <w:shd w:fill="F2F2F2" w:val="clear"/>
             <w:tcMar>
               <w:top w:type="dxa" w:w="80"/>
               <w:left w:type="dxa" w:w="120"/>
@@ -5956,10 +5773,10 @@
           <w:tcPr>
             <w:tcW w:type="dxa" w:w="6226"/>
             <w:tcBorders>
-              <w:top w:val="single" w:color="AAAAAA" w:sz="1"/>
-              <w:left w:val="single" w:color="AAAAAA" w:sz="1"/>
-              <w:bottom w:val="single" w:color="AAAAAA" w:sz="1"/>
-              <w:right w:val="single" w:color="AAAAAA" w:sz="1"/>
+              <w:top w:val="single" w:color="000000" w:sz="1"/>
+              <w:left w:val="single" w:color="000000" w:sz="1"/>
+              <w:bottom w:val="single" w:color="000000" w:sz="1"/>
+              <w:right w:val="single" w:color="000000" w:sz="1"/>
             </w:tcBorders>
             <w:tcMar>
               <w:top w:type="dxa" w:w="80"/>
@@ -5985,12 +5802,12 @@
           <w:tcPr>
             <w:tcW w:type="dxa" w:w="2800"/>
             <w:tcBorders>
-              <w:top w:val="single" w:color="AAAAAA" w:sz="1"/>
-              <w:left w:val="single" w:color="AAAAAA" w:sz="1"/>
-              <w:bottom w:val="single" w:color="AAAAAA" w:sz="1"/>
-              <w:right w:val="single" w:color="AAAAAA" w:sz="1"/>
+              <w:top w:val="single" w:color="000000" w:sz="1"/>
+              <w:left w:val="single" w:color="000000" w:sz="1"/>
+              <w:bottom w:val="single" w:color="000000" w:sz="1"/>
+              <w:right w:val="single" w:color="000000" w:sz="1"/>
             </w:tcBorders>
-            <w:shd w:fill="EEF2F7" w:val="clear"/>
+            <w:shd w:fill="F2F2F2" w:val="clear"/>
             <w:tcMar>
               <w:top w:type="dxa" w:w="80"/>
               <w:left w:type="dxa" w:w="120"/>
@@ -6015,10 +5832,10 @@
           <w:tcPr>
             <w:tcW w:type="dxa" w:w="6226"/>
             <w:tcBorders>
-              <w:top w:val="single" w:color="AAAAAA" w:sz="1"/>
-              <w:left w:val="single" w:color="AAAAAA" w:sz="1"/>
-              <w:bottom w:val="single" w:color="AAAAAA" w:sz="1"/>
-              <w:right w:val="single" w:color="AAAAAA" w:sz="1"/>
+              <w:top w:val="single" w:color="000000" w:sz="1"/>
+              <w:left w:val="single" w:color="000000" w:sz="1"/>
+              <w:bottom w:val="single" w:color="000000" w:sz="1"/>
+              <w:right w:val="single" w:color="000000" w:sz="1"/>
             </w:tcBorders>
             <w:tcMar>
               <w:top w:type="dxa" w:w="80"/>
@@ -6044,12 +5861,12 @@
           <w:tcPr>
             <w:tcW w:type="dxa" w:w="2800"/>
             <w:tcBorders>
-              <w:top w:val="single" w:color="AAAAAA" w:sz="1"/>
-              <w:left w:val="single" w:color="AAAAAA" w:sz="1"/>
-              <w:bottom w:val="single" w:color="AAAAAA" w:sz="1"/>
-              <w:right w:val="single" w:color="AAAAAA" w:sz="1"/>
+              <w:top w:val="single" w:color="000000" w:sz="1"/>
+              <w:left w:val="single" w:color="000000" w:sz="1"/>
+              <w:bottom w:val="single" w:color="000000" w:sz="1"/>
+              <w:right w:val="single" w:color="000000" w:sz="1"/>
             </w:tcBorders>
-            <w:shd w:fill="EEF2F7" w:val="clear"/>
+            <w:shd w:fill="F2F2F2" w:val="clear"/>
             <w:tcMar>
               <w:top w:type="dxa" w:w="80"/>
               <w:left w:type="dxa" w:w="120"/>
@@ -6074,10 +5891,10 @@
           <w:tcPr>
             <w:tcW w:type="dxa" w:w="6226"/>
             <w:tcBorders>
-              <w:top w:val="single" w:color="AAAAAA" w:sz="1"/>
-              <w:left w:val="single" w:color="AAAAAA" w:sz="1"/>
-              <w:bottom w:val="single" w:color="AAAAAA" w:sz="1"/>
-              <w:right w:val="single" w:color="AAAAAA" w:sz="1"/>
+              <w:top w:val="single" w:color="000000" w:sz="1"/>
+              <w:left w:val="single" w:color="000000" w:sz="1"/>
+              <w:bottom w:val="single" w:color="000000" w:sz="1"/>
+              <w:right w:val="single" w:color="000000" w:sz="1"/>
             </w:tcBorders>
             <w:tcMar>
               <w:top w:type="dxa" w:w="80"/>
@@ -6148,12 +5965,12 @@
           <w:tcPr>
             <w:tcW w:type="dxa" w:w="2800"/>
             <w:tcBorders>
-              <w:top w:val="single" w:color="AAAAAA" w:sz="1"/>
-              <w:left w:val="single" w:color="AAAAAA" w:sz="1"/>
-              <w:bottom w:val="single" w:color="AAAAAA" w:sz="1"/>
-              <w:right w:val="single" w:color="AAAAAA" w:sz="1"/>
+              <w:top w:val="single" w:color="000000" w:sz="1"/>
+              <w:left w:val="single" w:color="000000" w:sz="1"/>
+              <w:bottom w:val="single" w:color="000000" w:sz="1"/>
+              <w:right w:val="single" w:color="000000" w:sz="1"/>
             </w:tcBorders>
-            <w:shd w:fill="EEF2F7" w:val="clear"/>
+            <w:shd w:fill="F2F2F2" w:val="clear"/>
             <w:tcMar>
               <w:top w:type="dxa" w:w="80"/>
               <w:left w:type="dxa" w:w="120"/>
@@ -6178,10 +5995,10 @@
           <w:tcPr>
             <w:tcW w:type="dxa" w:w="6226"/>
             <w:tcBorders>
-              <w:top w:val="single" w:color="AAAAAA" w:sz="1"/>
-              <w:left w:val="single" w:color="AAAAAA" w:sz="1"/>
-              <w:bottom w:val="single" w:color="AAAAAA" w:sz="1"/>
-              <w:right w:val="single" w:color="AAAAAA" w:sz="1"/>
+              <w:top w:val="single" w:color="000000" w:sz="1"/>
+              <w:left w:val="single" w:color="000000" w:sz="1"/>
+              <w:bottom w:val="single" w:color="000000" w:sz="1"/>
+              <w:right w:val="single" w:color="000000" w:sz="1"/>
             </w:tcBorders>
             <w:tcMar>
               <w:top w:type="dxa" w:w="80"/>
@@ -6207,12 +6024,12 @@
           <w:tcPr>
             <w:tcW w:type="dxa" w:w="2800"/>
             <w:tcBorders>
-              <w:top w:val="single" w:color="AAAAAA" w:sz="1"/>
-              <w:left w:val="single" w:color="AAAAAA" w:sz="1"/>
-              <w:bottom w:val="single" w:color="AAAAAA" w:sz="1"/>
-              <w:right w:val="single" w:color="AAAAAA" w:sz="1"/>
+              <w:top w:val="single" w:color="000000" w:sz="1"/>
+              <w:left w:val="single" w:color="000000" w:sz="1"/>
+              <w:bottom w:val="single" w:color="000000" w:sz="1"/>
+              <w:right w:val="single" w:color="000000" w:sz="1"/>
             </w:tcBorders>
-            <w:shd w:fill="EEF2F7" w:val="clear"/>
+            <w:shd w:fill="F2F2F2" w:val="clear"/>
             <w:tcMar>
               <w:top w:type="dxa" w:w="80"/>
               <w:left w:type="dxa" w:w="120"/>
@@ -6237,10 +6054,10 @@
           <w:tcPr>
             <w:tcW w:type="dxa" w:w="6226"/>
             <w:tcBorders>
-              <w:top w:val="single" w:color="AAAAAA" w:sz="1"/>
-              <w:left w:val="single" w:color="AAAAAA" w:sz="1"/>
-              <w:bottom w:val="single" w:color="AAAAAA" w:sz="1"/>
-              <w:right w:val="single" w:color="AAAAAA" w:sz="1"/>
+              <w:top w:val="single" w:color="000000" w:sz="1"/>
+              <w:left w:val="single" w:color="000000" w:sz="1"/>
+              <w:bottom w:val="single" w:color="000000" w:sz="1"/>
+              <w:right w:val="single" w:color="000000" w:sz="1"/>
             </w:tcBorders>
             <w:tcMar>
               <w:top w:type="dxa" w:w="80"/>
@@ -6266,12 +6083,12 @@
           <w:tcPr>
             <w:tcW w:type="dxa" w:w="2800"/>
             <w:tcBorders>
-              <w:top w:val="single" w:color="AAAAAA" w:sz="1"/>
-              <w:left w:val="single" w:color="AAAAAA" w:sz="1"/>
-              <w:bottom w:val="single" w:color="AAAAAA" w:sz="1"/>
-              <w:right w:val="single" w:color="AAAAAA" w:sz="1"/>
+              <w:top w:val="single" w:color="000000" w:sz="1"/>
+              <w:left w:val="single" w:color="000000" w:sz="1"/>
+              <w:bottom w:val="single" w:color="000000" w:sz="1"/>
+              <w:right w:val="single" w:color="000000" w:sz="1"/>
             </w:tcBorders>
-            <w:shd w:fill="EEF2F7" w:val="clear"/>
+            <w:shd w:fill="F2F2F2" w:val="clear"/>
             <w:tcMar>
               <w:top w:type="dxa" w:w="80"/>
               <w:left w:type="dxa" w:w="120"/>
@@ -6296,10 +6113,10 @@
           <w:tcPr>
             <w:tcW w:type="dxa" w:w="6226"/>
             <w:tcBorders>
-              <w:top w:val="single" w:color="AAAAAA" w:sz="1"/>
-              <w:left w:val="single" w:color="AAAAAA" w:sz="1"/>
-              <w:bottom w:val="single" w:color="AAAAAA" w:sz="1"/>
-              <w:right w:val="single" w:color="AAAAAA" w:sz="1"/>
+              <w:top w:val="single" w:color="000000" w:sz="1"/>
+              <w:left w:val="single" w:color="000000" w:sz="1"/>
+              <w:bottom w:val="single" w:color="000000" w:sz="1"/>
+              <w:right w:val="single" w:color="000000" w:sz="1"/>
             </w:tcBorders>
             <w:tcMar>
               <w:top w:type="dxa" w:w="80"/>
@@ -6325,12 +6142,12 @@
           <w:tcPr>
             <w:tcW w:type="dxa" w:w="2800"/>
             <w:tcBorders>
-              <w:top w:val="single" w:color="AAAAAA" w:sz="1"/>
-              <w:left w:val="single" w:color="AAAAAA" w:sz="1"/>
-              <w:bottom w:val="single" w:color="AAAAAA" w:sz="1"/>
-              <w:right w:val="single" w:color="AAAAAA" w:sz="1"/>
+              <w:top w:val="single" w:color="000000" w:sz="1"/>
+              <w:left w:val="single" w:color="000000" w:sz="1"/>
+              <w:bottom w:val="single" w:color="000000" w:sz="1"/>
+              <w:right w:val="single" w:color="000000" w:sz="1"/>
             </w:tcBorders>
-            <w:shd w:fill="EEF2F7" w:val="clear"/>
+            <w:shd w:fill="F2F2F2" w:val="clear"/>
             <w:tcMar>
               <w:top w:type="dxa" w:w="80"/>
               <w:left w:type="dxa" w:w="120"/>
@@ -6355,10 +6172,10 @@
           <w:tcPr>
             <w:tcW w:type="dxa" w:w="6226"/>
             <w:tcBorders>
-              <w:top w:val="single" w:color="AAAAAA" w:sz="1"/>
-              <w:left w:val="single" w:color="AAAAAA" w:sz="1"/>
-              <w:bottom w:val="single" w:color="AAAAAA" w:sz="1"/>
-              <w:right w:val="single" w:color="AAAAAA" w:sz="1"/>
+              <w:top w:val="single" w:color="000000" w:sz="1"/>
+              <w:left w:val="single" w:color="000000" w:sz="1"/>
+              <w:bottom w:val="single" w:color="000000" w:sz="1"/>
+              <w:right w:val="single" w:color="000000" w:sz="1"/>
             </w:tcBorders>
             <w:tcMar>
               <w:top w:type="dxa" w:w="80"/>
@@ -6454,7 +6271,6 @@
     <w:r>
       <w:rPr>
         <w:rFonts w:ascii="Arial" w:cs="Arial" w:eastAsia="Arial" w:hAnsi="Arial"/>
-        <w:color w:val="888888"/>
         <w:sz w:val="18"/>
         <w:szCs w:val="18"/>
       </w:rPr>
@@ -6463,7 +6279,6 @@
     <w:r>
       <w:rPr>
         <w:rFonts w:ascii="Arial" w:cs="Arial" w:eastAsia="Arial" w:hAnsi="Arial"/>
-        <w:color w:val="888888"/>
         <w:sz w:val="18"/>
         <w:szCs w:val="18"/>
       </w:rPr>
@@ -6815,14 +6630,13 @@
     <w:next w:val="Normal"/>
     <w:qFormat/>
     <w:pPr>
-      <w:spacing w:after="160" w:before="320"/>
+      <w:spacing w:after="160" w:before="360"/>
       <w:outlineLvl w:val="0"/>
     </w:pPr>
     <w:rPr>
       <w:rFonts w:ascii="Arial" w:cs="Arial" w:eastAsia="Arial" w:hAnsi="Arial"/>
       <w:b/>
       <w:bCs/>
-      <w:color w:val="1F3864"/>
       <w:sz w:val="28"/>
       <w:szCs w:val="28"/>
     </w:rPr>
@@ -6833,14 +6647,13 @@
     <w:next w:val="Normal"/>
     <w:qFormat/>
     <w:pPr>
-      <w:spacing w:after="120" w:before="240"/>
+      <w:spacing w:after="100" w:before="240"/>
       <w:outlineLvl w:val="1"/>
     </w:pPr>
     <w:rPr>
       <w:rFonts w:ascii="Arial" w:cs="Arial" w:eastAsia="Arial" w:hAnsi="Arial"/>
       <w:b/>
       <w:bCs/>
-      <w:color w:val="2E4057"/>
       <w:sz w:val="24"/>
       <w:szCs w:val="24"/>
     </w:rPr>

</xml_diff>